<commit_message>
Added .gitignore, Readme.txt file. And fixed the proper installation Readme.txt and requirements.txt.
Fixed the unittest script -  device manager & redrat client module.
</commit_message>
<xml_diff>
--- a/STB_AUTOMATION_29052026.docx
+++ b/STB_AUTOMATION_29052026.docx
@@ -5530,6 +5530,73 @@
       </w:r>
     </w:p>
     <w:p/>
+    <w:p>
+      <w:pPr>
+        <w:pStyle w:val="Heading3"/>
+      </w:pPr>
+      <w:r>
+        <w:t>Phase-1 Installed packages:</w:t>
+      </w:r>
+      <w:r>
+        <w:br/>
+      </w:r>
+    </w:p>
+    <w:p>
+      <w:pPr>
+        <w:pStyle w:val="ListParagraph"/>
+        <w:numPr>
+          <w:ilvl w:val="0"/>
+          <w:numId w:val="24"/>
+        </w:numPr>
+      </w:pPr>
+      <w:r>
+        <w:t>pyyaml</w:t>
+      </w:r>
+    </w:p>
+    <w:p>
+      <w:pPr>
+        <w:pStyle w:val="ListParagraph"/>
+        <w:numPr>
+          <w:ilvl w:val="0"/>
+          <w:numId w:val="24"/>
+        </w:numPr>
+      </w:pPr>
+      <w:r>
+        <w:t>requests</w:t>
+      </w:r>
+    </w:p>
+    <w:p>
+      <w:pPr>
+        <w:pStyle w:val="ListParagraph"/>
+        <w:numPr>
+          <w:ilvl w:val="0"/>
+          <w:numId w:val="24"/>
+        </w:numPr>
+      </w:pPr>
+      <w:r>
+        <w:t>dotenv</w:t>
+      </w:r>
+    </w:p>
+    <w:p>
+      <w:pPr>
+        <w:pStyle w:val="ListParagraph"/>
+        <w:numPr>
+          <w:ilvl w:val="0"/>
+          <w:numId w:val="24"/>
+        </w:numPr>
+      </w:pPr>
+      <w:r>
+        <w:t>python-dotenv</w:t>
+      </w:r>
+    </w:p>
+    <w:p>
+      <w:pPr>
+        <w:pStyle w:val="ListParagraph"/>
+        <w:ind w:left="1440"/>
+      </w:pPr>
+      <w:bookmarkStart w:id="0" w:name="_GoBack"/>
+      <w:bookmarkEnd w:id="0"/>
+    </w:p>
     <w:p/>
     <w:p/>
     <w:p/>
@@ -5540,23 +5607,12 @@
     <w:p/>
     <w:p/>
     <w:p/>
-    <w:p/>
     <w:p>
       <w:pPr>
         <w:pStyle w:val="Heading1"/>
       </w:pPr>
       <w:r>
-        <w:lastRenderedPageBreak/>
-        <w:t>PHASE – 3</w:t>
-      </w:r>
-      <w:r>
-        <w:t xml:space="preserve">: </w:t>
-      </w:r>
-      <w:r>
-        <w:t xml:space="preserve">Capture card </w:t>
-      </w:r>
-      <w:r>
-        <w:t>:</w:t>
+        <w:t>PHASE – 3: Capture card :</w:t>
       </w:r>
     </w:p>
     <w:p>
@@ -5589,12 +5645,7 @@
         <w:t>mfvideosrc</w:t>
       </w:r>
       <w:r>
-        <w:t xml:space="preserve"> in the pip</w:t>
-      </w:r>
-      <w:bookmarkStart w:id="0" w:name="_GoBack"/>
-      <w:bookmarkEnd w:id="0"/>
-      <w:r>
-        <w:t>eline.</w:t>
+        <w:t xml:space="preserve"> in the pipeline.</w:t>
       </w:r>
     </w:p>
     <w:sectPr>
@@ -7182,7 +7233,7 @@
   <w:abstractNum w:abstractNumId="14">
     <w:nsid w:val="462E049F"/>
     <w:multiLevelType w:val="hybridMultilevel"/>
-    <w:tmpl w:val="3EFA504A"/>
+    <w:tmpl w:val="68BC76FA"/>
     <w:lvl w:ilvl="0" w:tplc="40090001">
       <w:start w:val="1"/>
       <w:numFmt w:val="bullet"/>

</xml_diff>

<commit_message>
test document and test suite updated
</commit_message>
<xml_diff>
--- a/STB_AUTOMATION_29052026.docx
+++ b/STB_AUTOMATION_29052026.docx
@@ -5875,19 +5875,7 @@
         <w:ind w:left="720"/>
       </w:pPr>
       <w:r>
-        <w:t>Check 2</w:t>
-      </w:r>
-      <w:r>
-        <w:t xml:space="preserve"> — </w:t>
-      </w:r>
-      <w:r>
-        <w:t>List the</w:t>
-      </w:r>
-      <w:r>
-        <w:t xml:space="preserve"> </w:t>
-      </w:r>
-      <w:r>
-        <w:t>connected capture devices</w:t>
+        <w:t>Check 2 — List the connected capture devices</w:t>
       </w:r>
     </w:p>
     <w:p>
@@ -5900,6 +5888,44 @@
       </w:r>
       <w:r>
         <w:t>gst-device-monitor-1.0 Video/Source</w:t>
+      </w:r>
+    </w:p>
+    <w:p>
+      <w:pPr>
+        <w:pStyle w:val="Heading3"/>
+      </w:pPr>
+      <w:r>
+        <w:t>To Check capture video out cmd:</w:t>
+      </w:r>
+    </w:p>
+    <w:p>
+      <w:pPr>
+        <w:spacing w:line="360" w:lineRule="auto"/>
+        <w:ind w:left="720"/>
+      </w:pPr>
+      <w:r>
+        <w:t xml:space="preserve"># </w:t>
+      </w:r>
+      <w:r>
+        <w:t xml:space="preserve">gst-launch-1.0 </w:t>
+      </w:r>
+      <w:r>
+        <w:t xml:space="preserve">mfvideosrc </w:t>
+      </w:r>
+      <w:r>
+        <w:t xml:space="preserve">device-index=0 </w:t>
+      </w:r>
+      <w:r>
+        <w:t xml:space="preserve">! queue ! </w:t>
+      </w:r>
+      <w:r>
+        <w:t>image/jpeg,width=1920,height=1080,framerate=</w:t>
+      </w:r>
+      <w:r>
+        <w:t>30/1 ! jpegdec ! videoconvert ! queue !</w:t>
+      </w:r>
+      <w:r>
+        <w:t xml:space="preserve"> autovideosink</w:t>
       </w:r>
     </w:p>
     <w:p>
@@ -6083,13 +6109,7 @@
         <w:t>✅</w:t>
       </w:r>
       <w:r>
-        <w:t xml:space="preserve"> </w:t>
-      </w:r>
-      <w:r>
-        <w:t xml:space="preserve">   </w:t>
-      </w:r>
-      <w:r>
-        <w:t>Device Manager started</w:t>
+        <w:t xml:space="preserve">    Device Manager started</w:t>
       </w:r>
     </w:p>
     <w:p>
@@ -6106,13 +6126,7 @@
         <w:t>✅</w:t>
       </w:r>
       <w:r>
-        <w:t xml:space="preserve"> </w:t>
-      </w:r>
-      <w:r>
-        <w:t xml:space="preserve">   I</w:t>
-      </w:r>
-      <w:r>
-        <w:t>R backend loaded</w:t>
+        <w:t xml:space="preserve">    IR backend loaded</w:t>
       </w:r>
     </w:p>
     <w:p>
@@ -6129,13 +6143,7 @@
         <w:t>✅</w:t>
       </w:r>
       <w:r>
-        <w:t xml:space="preserve"> </w:t>
-      </w:r>
-      <w:r>
-        <w:t xml:space="preserve">   </w:t>
-      </w:r>
-      <w:r>
-        <w:t>RedRat Hub auto-started</w:t>
+        <w:t xml:space="preserve">    RedRat Hub auto-started</w:t>
       </w:r>
     </w:p>
     <w:p>
@@ -6152,13 +6160,7 @@
         <w:t>✅</w:t>
       </w:r>
       <w:r>
-        <w:t xml:space="preserve"> </w:t>
-      </w:r>
-      <w:r>
-        <w:t xml:space="preserve">   </w:t>
-      </w:r>
-      <w:r>
-        <w:t>RedRat-X detected &amp; health check passed</w:t>
+        <w:t xml:space="preserve">    RedRat-X detected &amp; health check passed</w:t>
       </w:r>
     </w:p>
     <w:p>
@@ -6175,13 +6177,7 @@
         <w:t>✅</w:t>
       </w:r>
       <w:r>
-        <w:t xml:space="preserve"> </w:t>
-      </w:r>
-      <w:r>
-        <w:t xml:space="preserve">   </w:t>
-      </w:r>
-      <w:r>
-        <w:t>GStreamer capture pipeline running</w:t>
+        <w:t xml:space="preserve">    GStreamer capture pipeline running</w:t>
       </w:r>
     </w:p>
     <w:p>
@@ -6198,13 +6194,7 @@
         <w:t>✅</w:t>
       </w:r>
       <w:r>
-        <w:t xml:space="preserve"> </w:t>
-      </w:r>
-      <w:r>
-        <w:t xml:space="preserve">   </w:t>
-      </w:r>
-      <w:r>
-        <w:t>VOL+ sent → STB responded physically</w:t>
+        <w:t xml:space="preserve">    VOL+ sent → STB responded physically</w:t>
       </w:r>
     </w:p>
     <w:p>
@@ -6221,13 +6211,7 @@
         <w:t>✅</w:t>
       </w:r>
       <w:r>
-        <w:t xml:space="preserve"> </w:t>
-      </w:r>
-      <w:r>
-        <w:t xml:space="preserve">   </w:t>
-      </w:r>
-      <w:r>
-        <w:t>Frame captured (1080, 1920, 3)</w:t>
+        <w:t xml:space="preserve">    Frame captured (1080, 1920, 3)</w:t>
       </w:r>
     </w:p>
     <w:p>
@@ -6244,13 +6228,7 @@
         <w:t>✅</w:t>
       </w:r>
       <w:r>
-        <w:t xml:space="preserve"> </w:t>
-      </w:r>
-      <w:r>
-        <w:t xml:space="preserve">   </w:t>
-      </w:r>
-      <w:r>
-        <w:t>Screenshot saved to evidence/</w:t>
+        <w:t xml:space="preserve">    Screenshot saved to evidence/</w:t>
       </w:r>
     </w:p>
     <w:p>
@@ -6267,13 +6245,7 @@
         <w:t>✅</w:t>
       </w:r>
       <w:r>
-        <w:t xml:space="preserve"> </w:t>
-      </w:r>
-      <w:r>
-        <w:t xml:space="preserve">   </w:t>
-      </w:r>
-      <w:r>
-        <w:t>Clean shutdown</w:t>
+        <w:t xml:space="preserve">    Clean shutdown</w:t>
       </w:r>
     </w:p>
     <w:p>
@@ -6291,15 +6263,6 @@
         </w:tabs>
         <w:spacing w:after="0" w:line="240" w:lineRule="auto"/>
       </w:pPr>
-      <w:r>
-        <w:t xml:space="preserve">Phase 3 done </w:t>
-      </w:r>
-      <w:r>
-        <w:rPr>
-          <w:rFonts w:ascii="Calibri" w:hAnsi="Calibri" w:cs="Calibri"/>
-        </w:rPr>
-        <w:t>✅</w:t>
-      </w:r>
     </w:p>
     <w:p>
       <w:pPr>
@@ -6308,9 +6271,6 @@
         </w:tabs>
         <w:spacing w:after="0" w:line="240" w:lineRule="auto"/>
       </w:pPr>
-      <w:r>
-        <w:t xml:space="preserve">      ↓</w:t>
-      </w:r>
     </w:p>
     <w:p>
       <w:pPr>
@@ -6319,9 +6279,6 @@
         </w:tabs>
         <w:spacing w:after="0" w:line="240" w:lineRule="auto"/>
       </w:pPr>
-      <w:r>
-        <w:t>Phase 4 — Analysis layer</w:t>
-      </w:r>
     </w:p>
     <w:p>
       <w:pPr>
@@ -6331,31 +6288,14 @@
         <w:spacing w:after="0" w:line="240" w:lineRule="auto"/>
       </w:pPr>
       <w:r>
-        <w:t xml:space="preserve">    </w:t>
-      </w:r>
-      <w:r>
-        <w:rPr>
-          <w:rFonts w:ascii="Arial" w:hAnsi="Arial" w:cs="Arial"/>
-        </w:rPr>
-        <w:t>├</w:t>
+        <w:lastRenderedPageBreak/>
+        <w:t xml:space="preserve">Phase 3 done </w:t>
       </w:r>
       <w:r>
         <w:rPr>
           <w:rFonts w:ascii="Calibri" w:hAnsi="Calibri" w:cs="Calibri"/>
         </w:rPr>
-        <w:t>──</w:t>
-      </w:r>
-      <w:r>
-        <w:t xml:space="preserve"> visual_match.py   </w:t>
-      </w:r>
-      <w:r>
-        <w:rPr>
-          <w:rFonts w:ascii="Calibri" w:hAnsi="Calibri" w:cs="Calibri"/>
-        </w:rPr>
-        <w:t>—</w:t>
-      </w:r>
-      <w:r>
-        <w:t xml:space="preserve"> template matching (does screen show expected UI?)</w:t>
+        <w:t>✅</w:t>
       </w:r>
     </w:p>
     <w:p>
@@ -6366,31 +6306,7 @@
         <w:spacing w:after="0" w:line="240" w:lineRule="auto"/>
       </w:pPr>
       <w:r>
-        <w:t xml:space="preserve">    </w:t>
-      </w:r>
-      <w:r>
-        <w:rPr>
-          <w:rFonts w:ascii="Arial" w:hAnsi="Arial" w:cs="Arial"/>
-        </w:rPr>
-        <w:t>├</w:t>
-      </w:r>
-      <w:r>
-        <w:rPr>
-          <w:rFonts w:ascii="Calibri" w:hAnsi="Calibri" w:cs="Calibri"/>
-        </w:rPr>
-        <w:t>──</w:t>
-      </w:r>
-      <w:r>
-        <w:t xml:space="preserve"> ocr.py            </w:t>
-      </w:r>
-      <w:r>
-        <w:rPr>
-          <w:rFonts w:ascii="Calibri" w:hAnsi="Calibri" w:cs="Calibri"/>
-        </w:rPr>
-        <w:t>—</w:t>
-      </w:r>
-      <w:r>
-        <w:t xml:space="preserve"> text extraction (is "BBC ONE" on screen?)</w:t>
+        <w:t xml:space="preserve">      ↓</w:t>
       </w:r>
     </w:p>
     <w:p>
@@ -6401,31 +6317,7 @@
         <w:spacing w:after="0" w:line="240" w:lineRule="auto"/>
       </w:pPr>
       <w:r>
-        <w:t xml:space="preserve">    </w:t>
-      </w:r>
-      <w:r>
-        <w:rPr>
-          <w:rFonts w:ascii="Arial" w:hAnsi="Arial" w:cs="Arial"/>
-        </w:rPr>
-        <w:t>├</w:t>
-      </w:r>
-      <w:r>
-        <w:rPr>
-          <w:rFonts w:ascii="Calibri" w:hAnsi="Calibri" w:cs="Calibri"/>
-        </w:rPr>
-        <w:t>──</w:t>
-      </w:r>
-      <w:r>
-        <w:t xml:space="preserve"> av_quality.py     </w:t>
-      </w:r>
-      <w:r>
-        <w:rPr>
-          <w:rFonts w:ascii="Calibri" w:hAnsi="Calibri" w:cs="Calibri"/>
-        </w:rPr>
-        <w:t>—</w:t>
-      </w:r>
-      <w:r>
-        <w:t xml:space="preserve"> black screen / freeze detection</w:t>
+        <w:t>Phase 4 — Analysis layer</w:t>
       </w:r>
     </w:p>
     <w:p>
@@ -6436,7 +6328,31 @@
         <w:spacing w:after="0" w:line="240" w:lineRule="auto"/>
       </w:pPr>
       <w:r>
-        <w:t xml:space="preserve">    └── timing.py         — zap time measurement</w:t>
+        <w:t xml:space="preserve">    </w:t>
+      </w:r>
+      <w:r>
+        <w:rPr>
+          <w:rFonts w:ascii="Arial" w:hAnsi="Arial" w:cs="Arial"/>
+        </w:rPr>
+        <w:t>├</w:t>
+      </w:r>
+      <w:r>
+        <w:rPr>
+          <w:rFonts w:ascii="Calibri" w:hAnsi="Calibri" w:cs="Calibri"/>
+        </w:rPr>
+        <w:t>──</w:t>
+      </w:r>
+      <w:r>
+        <w:t xml:space="preserve"> visual_match.py   </w:t>
+      </w:r>
+      <w:r>
+        <w:rPr>
+          <w:rFonts w:ascii="Calibri" w:hAnsi="Calibri" w:cs="Calibri"/>
+        </w:rPr>
+        <w:t>—</w:t>
+      </w:r>
+      <w:r>
+        <w:t xml:space="preserve"> template matching (does screen show expected UI?)</w:t>
       </w:r>
     </w:p>
     <w:p>
@@ -6447,7 +6363,31 @@
         <w:spacing w:after="0" w:line="240" w:lineRule="auto"/>
       </w:pPr>
       <w:r>
-        <w:t xml:space="preserve">      ↓</w:t>
+        <w:t xml:space="preserve">    </w:t>
+      </w:r>
+      <w:r>
+        <w:rPr>
+          <w:rFonts w:ascii="Arial" w:hAnsi="Arial" w:cs="Arial"/>
+        </w:rPr>
+        <w:t>├</w:t>
+      </w:r>
+      <w:r>
+        <w:rPr>
+          <w:rFonts w:ascii="Calibri" w:hAnsi="Calibri" w:cs="Calibri"/>
+        </w:rPr>
+        <w:t>──</w:t>
+      </w:r>
+      <w:r>
+        <w:t xml:space="preserve"> ocr.py            </w:t>
+      </w:r>
+      <w:r>
+        <w:rPr>
+          <w:rFonts w:ascii="Calibri" w:hAnsi="Calibri" w:cs="Calibri"/>
+        </w:rPr>
+        <w:t>—</w:t>
+      </w:r>
+      <w:r>
+        <w:t xml:space="preserve"> text extraction (is "BBC ONE" on screen?)</w:t>
       </w:r>
     </w:p>
     <w:p>
@@ -6458,7 +6398,31 @@
         <w:spacing w:after="0" w:line="240" w:lineRule="auto"/>
       </w:pPr>
       <w:r>
-        <w:t>Phase 5 — First real test case</w:t>
+        <w:t xml:space="preserve">    </w:t>
+      </w:r>
+      <w:r>
+        <w:rPr>
+          <w:rFonts w:ascii="Arial" w:hAnsi="Arial" w:cs="Arial"/>
+        </w:rPr>
+        <w:t>├</w:t>
+      </w:r>
+      <w:r>
+        <w:rPr>
+          <w:rFonts w:ascii="Calibri" w:hAnsi="Calibri" w:cs="Calibri"/>
+        </w:rPr>
+        <w:t>──</w:t>
+      </w:r>
+      <w:r>
+        <w:t xml:space="preserve"> av_quality.py     </w:t>
+      </w:r>
+      <w:r>
+        <w:rPr>
+          <w:rFonts w:ascii="Calibri" w:hAnsi="Calibri" w:cs="Calibri"/>
+        </w:rPr>
+        <w:t>—</w:t>
+      </w:r>
+      <w:r>
+        <w:t xml:space="preserve"> black screen / freeze detection</w:t>
       </w:r>
     </w:p>
     <w:p>
@@ -6469,8 +6433,7 @@
         <w:spacing w:after="0" w:line="240" w:lineRule="auto"/>
       </w:pPr>
       <w:r>
-        <w:lastRenderedPageBreak/>
-        <w:t xml:space="preserve">    └── test_channel_zap.py</w:t>
+        <w:t xml:space="preserve">    └── timing.py         — zap time measurement</w:t>
       </w:r>
     </w:p>
     <w:p>
@@ -6480,6 +6443,39 @@
         </w:tabs>
         <w:spacing w:after="0" w:line="240" w:lineRule="auto"/>
       </w:pPr>
+      <w:r>
+        <w:t xml:space="preserve">      ↓</w:t>
+      </w:r>
+    </w:p>
+    <w:p>
+      <w:pPr>
+        <w:tabs>
+          <w:tab w:val="left" w:pos="810"/>
+        </w:tabs>
+        <w:spacing w:after="0" w:line="240" w:lineRule="auto"/>
+      </w:pPr>
+      <w:r>
+        <w:t>Phase 5 — First real test case</w:t>
+      </w:r>
+    </w:p>
+    <w:p>
+      <w:pPr>
+        <w:tabs>
+          <w:tab w:val="left" w:pos="810"/>
+        </w:tabs>
+        <w:spacing w:after="0" w:line="240" w:lineRule="auto"/>
+      </w:pPr>
+      <w:r>
+        <w:t xml:space="preserve">    └── test_channel_zap.py</w:t>
+      </w:r>
+    </w:p>
+    <w:p>
+      <w:pPr>
+        <w:tabs>
+          <w:tab w:val="left" w:pos="810"/>
+        </w:tabs>
+        <w:spacing w:after="0" w:line="240" w:lineRule="auto"/>
+      </w:pPr>
     </w:p>
     <w:p>
       <w:pPr>
@@ -6488,8 +6484,6 @@
       <w:r>
         <w:t>Up to Phase-3 Status</w:t>
       </w:r>
-      <w:bookmarkStart w:id="0" w:name="_GoBack"/>
-      <w:bookmarkEnd w:id="0"/>
       <w:r>
         <w:t>:</w:t>
       </w:r>
@@ -6510,13 +6504,7 @@
         <w:t>✅</w:t>
       </w:r>
       <w:r>
-        <w:t xml:space="preserve"> </w:t>
-      </w:r>
-      <w:r>
-        <w:t xml:space="preserve">   </w:t>
-      </w:r>
-      <w:r>
-        <w:t>Phase 1 — Project scaffold &amp; config</w:t>
+        <w:t xml:space="preserve">    Phase 1 — Project scaffold &amp; config</w:t>
       </w:r>
     </w:p>
     <w:p>
@@ -6529,13 +6517,7 @@
         <w:rPr>
           <w:rFonts w:ascii="Calibri" w:hAnsi="Calibri" w:cs="Calibri"/>
         </w:rPr>
-        <w:t>✅</w:t>
-      </w:r>
-      <w:r>
-        <w:rPr>
-          <w:rFonts w:ascii="Calibri" w:hAnsi="Calibri" w:cs="Calibri"/>
-        </w:rPr>
-        <w:t xml:space="preserve">   </w:t>
+        <w:t xml:space="preserve">✅   </w:t>
       </w:r>
       <w:r>
         <w:t xml:space="preserve"> Phase 2 — IR control (RedRat Hub → send_key → STB)</w:t>
@@ -6551,13 +6533,7 @@
         <w:rPr>
           <w:rFonts w:ascii="Calibri" w:hAnsi="Calibri" w:cs="Calibri"/>
         </w:rPr>
-        <w:t>✅</w:t>
-      </w:r>
-      <w:r>
-        <w:rPr>
-          <w:rFonts w:ascii="Calibri" w:hAnsi="Calibri" w:cs="Calibri"/>
-        </w:rPr>
-        <w:t xml:space="preserve">   </w:t>
+        <w:t xml:space="preserve">✅   </w:t>
       </w:r>
       <w:r>
         <w:t xml:space="preserve"> Phase 3 — Video capture (PiBox → GStreamer → numpy frame)</w:t>
@@ -6570,10 +6546,7 @@
         </w:tabs>
       </w:pPr>
       <w:r>
-        <w:t xml:space="preserve">   </w:t>
-      </w:r>
-      <w:r>
-        <w:t>Phase 4 — Analysis layer  ← next</w:t>
+        <w:t xml:space="preserve">   Phase 4 — Analysis layer  ← next</w:t>
       </w:r>
     </w:p>
     <w:p>
@@ -6595,6 +6568,1579 @@
       <w:r>
         <w:t xml:space="preserve">   Phase 6 — CLI + GUI</w:t>
       </w:r>
+    </w:p>
+    <w:p>
+      <w:pPr>
+        <w:tabs>
+          <w:tab w:val="left" w:pos="3380"/>
+        </w:tabs>
+      </w:pPr>
+    </w:p>
+    <w:p>
+      <w:pPr>
+        <w:tabs>
+          <w:tab w:val="left" w:pos="3380"/>
+        </w:tabs>
+      </w:pPr>
+    </w:p>
+    <w:p>
+      <w:pPr>
+        <w:tabs>
+          <w:tab w:val="left" w:pos="3380"/>
+        </w:tabs>
+      </w:pPr>
+    </w:p>
+    <w:p>
+      <w:pPr>
+        <w:tabs>
+          <w:tab w:val="left" w:pos="3380"/>
+        </w:tabs>
+      </w:pPr>
+    </w:p>
+    <w:p>
+      <w:pPr>
+        <w:tabs>
+          <w:tab w:val="left" w:pos="3380"/>
+        </w:tabs>
+      </w:pPr>
+    </w:p>
+    <w:p>
+      <w:pPr>
+        <w:tabs>
+          <w:tab w:val="left" w:pos="3380"/>
+        </w:tabs>
+      </w:pPr>
+    </w:p>
+    <w:p>
+      <w:pPr>
+        <w:tabs>
+          <w:tab w:val="left" w:pos="3380"/>
+        </w:tabs>
+      </w:pPr>
+    </w:p>
+    <w:p>
+      <w:pPr>
+        <w:tabs>
+          <w:tab w:val="left" w:pos="3380"/>
+        </w:tabs>
+      </w:pPr>
+    </w:p>
+    <w:p>
+      <w:pPr>
+        <w:tabs>
+          <w:tab w:val="left" w:pos="3380"/>
+        </w:tabs>
+      </w:pPr>
+    </w:p>
+    <w:p>
+      <w:pPr>
+        <w:tabs>
+          <w:tab w:val="left" w:pos="3380"/>
+        </w:tabs>
+      </w:pPr>
+    </w:p>
+    <w:p>
+      <w:pPr>
+        <w:tabs>
+          <w:tab w:val="left" w:pos="3380"/>
+        </w:tabs>
+      </w:pPr>
+    </w:p>
+    <w:p>
+      <w:pPr>
+        <w:tabs>
+          <w:tab w:val="left" w:pos="3380"/>
+        </w:tabs>
+      </w:pPr>
+    </w:p>
+    <w:p>
+      <w:pPr>
+        <w:tabs>
+          <w:tab w:val="left" w:pos="3380"/>
+        </w:tabs>
+      </w:pPr>
+    </w:p>
+    <w:p>
+      <w:pPr>
+        <w:tabs>
+          <w:tab w:val="left" w:pos="3380"/>
+        </w:tabs>
+      </w:pPr>
+    </w:p>
+    <w:p>
+      <w:pPr>
+        <w:tabs>
+          <w:tab w:val="left" w:pos="3380"/>
+        </w:tabs>
+      </w:pPr>
+    </w:p>
+    <w:p>
+      <w:pPr>
+        <w:tabs>
+          <w:tab w:val="left" w:pos="3380"/>
+        </w:tabs>
+      </w:pPr>
+    </w:p>
+    <w:p>
+      <w:pPr>
+        <w:tabs>
+          <w:tab w:val="left" w:pos="3380"/>
+        </w:tabs>
+      </w:pPr>
+    </w:p>
+    <w:p>
+      <w:pPr>
+        <w:tabs>
+          <w:tab w:val="left" w:pos="3380"/>
+        </w:tabs>
+      </w:pPr>
+    </w:p>
+    <w:p>
+      <w:pPr>
+        <w:tabs>
+          <w:tab w:val="left" w:pos="3380"/>
+        </w:tabs>
+      </w:pPr>
+    </w:p>
+    <w:p>
+      <w:pPr>
+        <w:pStyle w:val="Heading1"/>
+      </w:pPr>
+      <w:r>
+        <w:t>PHASE –4: Analysis Layer overview</w:t>
+      </w:r>
+    </w:p>
+    <w:p>
+      <w:pPr>
+        <w:pStyle w:val="ListParagraph"/>
+        <w:numPr>
+          <w:ilvl w:val="0"/>
+          <w:numId w:val="27"/>
+        </w:numPr>
+        <w:spacing w:after="0"/>
+      </w:pPr>
+      <w:r>
+        <w:t>Four modules to build, in this order</w:t>
+      </w:r>
+    </w:p>
+    <w:p>
+      <w:pPr>
+        <w:spacing w:after="0"/>
+      </w:pPr>
+      <w:r>
+        <w:t>analysis/</w:t>
+      </w:r>
+    </w:p>
+    <w:p>
+      <w:pPr>
+        <w:spacing w:after="0"/>
+      </w:pPr>
+      <w:r>
+        <w:rPr>
+          <w:rFonts w:ascii="Arial" w:hAnsi="Arial" w:cs="Arial"/>
+        </w:rPr>
+        <w:t>├</w:t>
+      </w:r>
+      <w:r>
+        <w:rPr>
+          <w:rFonts w:ascii="Calibri" w:hAnsi="Calibri" w:cs="Calibri"/>
+        </w:rPr>
+        <w:t>──</w:t>
+      </w:r>
+      <w:r>
+        <w:t xml:space="preserve"> visual_match.py  </w:t>
+      </w:r>
+      <w:r>
+        <w:rPr>
+          <w:rFonts w:ascii="Calibri" w:hAnsi="Calibri" w:cs="Calibri"/>
+        </w:rPr>
+        <w:t>←</w:t>
+      </w:r>
+      <w:r>
+        <w:t xml:space="preserve"> does screen show expected UI element?</w:t>
+      </w:r>
+    </w:p>
+    <w:p>
+      <w:pPr>
+        <w:spacing w:after="0"/>
+      </w:pPr>
+      <w:r>
+        <w:rPr>
+          <w:rFonts w:ascii="Arial" w:hAnsi="Arial" w:cs="Arial"/>
+        </w:rPr>
+        <w:t>├</w:t>
+      </w:r>
+      <w:r>
+        <w:rPr>
+          <w:rFonts w:ascii="Calibri" w:hAnsi="Calibri" w:cs="Calibri"/>
+        </w:rPr>
+        <w:t>──</w:t>
+      </w:r>
+      <w:r>
+        <w:t xml:space="preserve"> ocr.py           </w:t>
+      </w:r>
+      <w:r>
+        <w:rPr>
+          <w:rFonts w:ascii="Calibri" w:hAnsi="Calibri" w:cs="Calibri"/>
+        </w:rPr>
+        <w:t>←</w:t>
+      </w:r>
+      <w:r>
+        <w:t xml:space="preserve"> what text is on screen?</w:t>
+      </w:r>
+    </w:p>
+    <w:p>
+      <w:pPr>
+        <w:spacing w:after="0"/>
+      </w:pPr>
+      <w:r>
+        <w:rPr>
+          <w:rFonts w:ascii="Arial" w:hAnsi="Arial" w:cs="Arial"/>
+        </w:rPr>
+        <w:t>├</w:t>
+      </w:r>
+      <w:r>
+        <w:rPr>
+          <w:rFonts w:ascii="Calibri" w:hAnsi="Calibri" w:cs="Calibri"/>
+        </w:rPr>
+        <w:t>──</w:t>
+      </w:r>
+      <w:r>
+        <w:t xml:space="preserve"> av_quality.py    </w:t>
+      </w:r>
+      <w:r>
+        <w:rPr>
+          <w:rFonts w:ascii="Calibri" w:hAnsi="Calibri" w:cs="Calibri"/>
+        </w:rPr>
+        <w:t>←</w:t>
+      </w:r>
+      <w:r>
+        <w:t xml:space="preserve"> black screen? frozen? no signal?</w:t>
+      </w:r>
+    </w:p>
+    <w:p>
+      <w:pPr>
+        <w:spacing w:after="0"/>
+      </w:pPr>
+      <w:r>
+        <w:t>└── timing.py        ← how long did channel change take?</w:t>
+      </w:r>
+    </w:p>
+    <w:p>
+      <w:pPr>
+        <w:spacing w:after="0"/>
+      </w:pPr>
+    </w:p>
+    <w:p>
+      <w:pPr>
+        <w:pStyle w:val="Heading2"/>
+      </w:pPr>
+      <w:r>
+        <w:t>visual_match.py:</w:t>
+      </w:r>
+    </w:p>
+    <w:p>
+      <w:pPr>
+        <w:pStyle w:val="ListParagraph"/>
+        <w:numPr>
+          <w:ilvl w:val="0"/>
+          <w:numId w:val="27"/>
+        </w:numPr>
+      </w:pPr>
+      <w:r>
+        <w:t>visual matching is the foundation. OCR and AV quality both build on top of it.</w:t>
+      </w:r>
+    </w:p>
+    <w:p>
+      <w:pPr>
+        <w:pStyle w:val="Heading4"/>
+      </w:pPr>
+      <w:r>
+        <w:t>What is template matching?</w:t>
+      </w:r>
+    </w:p>
+    <w:p>
+      <w:pPr>
+        <w:pStyle w:val="Heading2"/>
+      </w:pPr>
+      <w:r>
+        <w:rPr>
+          <w:noProof/>
+          <w:lang w:eastAsia="en-IN" w:bidi="ta-IN"/>
+        </w:rPr>
+        <w:drawing>
+          <wp:inline distT="0" distB="0" distL="0" distR="0" wp14:anchorId="3F7B0584" wp14:editId="3259313F">
+            <wp:extent cx="5731510" cy="2774516"/>
+            <wp:effectExtent l="0" t="0" r="2540" b="6985"/>
+            <wp:docPr id="6" name="Picture 6"/>
+            <wp:cNvGraphicFramePr>
+              <a:graphicFrameLocks xmlns:a="http://schemas.openxmlformats.org/drawingml/2006/main" noChangeAspect="1"/>
+            </wp:cNvGraphicFramePr>
+            <a:graphic xmlns:a="http://schemas.openxmlformats.org/drawingml/2006/main">
+              <a:graphicData uri="http://schemas.openxmlformats.org/drawingml/2006/picture">
+                <pic:pic xmlns:pic="http://schemas.openxmlformats.org/drawingml/2006/picture">
+                  <pic:nvPicPr>
+                    <pic:cNvPr id="0" name=""/>
+                    <pic:cNvPicPr/>
+                  </pic:nvPicPr>
+                  <pic:blipFill>
+                    <a:blip r:embed="rId17"/>
+                    <a:stretch>
+                      <a:fillRect/>
+                    </a:stretch>
+                  </pic:blipFill>
+                  <pic:spPr>
+                    <a:xfrm>
+                      <a:off x="0" y="0"/>
+                      <a:ext cx="5731510" cy="2774516"/>
+                    </a:xfrm>
+                    <a:prstGeom prst="rect">
+                      <a:avLst/>
+                    </a:prstGeom>
+                  </pic:spPr>
+                </pic:pic>
+              </a:graphicData>
+            </a:graphic>
+          </wp:inline>
+        </w:drawing>
+      </w:r>
+    </w:p>
+    <w:p/>
+    <w:p>
+      <w:pPr>
+        <w:pStyle w:val="Heading3"/>
+      </w:pPr>
+      <w:r>
+        <w:t>CV2 (Open Source Computer Vision Liberary):</w:t>
+      </w:r>
+    </w:p>
+    <w:p>
+      <w:pPr>
+        <w:pStyle w:val="ListParagraph"/>
+        <w:numPr>
+          <w:ilvl w:val="0"/>
+          <w:numId w:val="29"/>
+        </w:numPr>
+      </w:pPr>
+      <w:r>
+        <w:t>We used cv2 python lib to manipulate images and vidoes for STB testing.</w:t>
+      </w:r>
+    </w:p>
+    <w:p>
+      <w:pPr>
+        <w:pStyle w:val="ListParagraph"/>
+        <w:ind w:left="1080"/>
+      </w:pPr>
+      <w:r>
+        <w:rPr>
+          <w:b/>
+          <w:bCs/>
+          <w:color w:val="FF0000"/>
+        </w:rPr>
+        <w:t>Note</w:t>
+      </w:r>
+      <w:r>
+        <w:rPr>
+          <w:b/>
+          <w:bCs/>
+        </w:rPr>
+        <w:t>:</w:t>
+      </w:r>
+      <w:r>
+        <w:rPr>
+          <w:b/>
+          <w:bCs/>
+        </w:rPr>
+        <w:t xml:space="preserve"> </w:t>
+      </w:r>
+      <w:r>
+        <w:t xml:space="preserve">Referal link - </w:t>
+      </w:r>
+      <w:hyperlink r:id="rId18" w:history="1">
+        <w:r>
+          <w:rPr>
+            <w:rStyle w:val="Hyperlink"/>
+          </w:rPr>
+          <w:t>https://www.geeksforgeeks.org/python/getting-started-with-python-opencv/</w:t>
+        </w:r>
+      </w:hyperlink>
+    </w:p>
+    <w:p>
+      <w:pPr>
+        <w:pStyle w:val="ListParagraph"/>
+        <w:ind w:left="1080"/>
+      </w:pPr>
+      <w:r>
+        <w:rPr>
+          <w:b/>
+          <w:bCs/>
+        </w:rPr>
+        <w:t xml:space="preserve"> </w:t>
+      </w:r>
+    </w:p>
+    <w:p>
+      <w:pPr>
+        <w:pStyle w:val="ListParagraph"/>
+        <w:numPr>
+          <w:ilvl w:val="0"/>
+          <w:numId w:val="29"/>
+        </w:numPr>
+      </w:pPr>
+      <w:r>
+        <w:t>To read image using cv2 methods.</w:t>
+      </w:r>
+    </w:p>
+    <w:p>
+      <w:pPr>
+        <w:pStyle w:val="ListParagraph"/>
+        <w:numPr>
+          <w:ilvl w:val="0"/>
+          <w:numId w:val="28"/>
+        </w:numPr>
+      </w:pPr>
+      <w:r>
+        <w:t>Use the method cv2.imread()</w:t>
+      </w:r>
+    </w:p>
+    <w:p>
+      <w:pPr>
+        <w:pStyle w:val="ListParagraph"/>
+        <w:numPr>
+          <w:ilvl w:val="0"/>
+          <w:numId w:val="28"/>
+        </w:numPr>
+      </w:pPr>
+      <w:r>
+        <w:lastRenderedPageBreak/>
+        <w:t xml:space="preserve">Cv2 documentation for more details </w:t>
+      </w:r>
+      <w:hyperlink r:id="rId19" w:history="1">
+        <w:r>
+          <w:rPr>
+            <w:rStyle w:val="Hyperlink"/>
+          </w:rPr>
+          <w:t>https://docs.opencv.org/5.0/py_tutorials/py_tutorials.html</w:t>
+        </w:r>
+      </w:hyperlink>
+    </w:p>
+    <w:p>
+      <w:pPr>
+        <w:pStyle w:val="ListParagraph"/>
+        <w:ind w:left="1080"/>
+      </w:pPr>
+    </w:p>
+    <w:p>
+      <w:pPr>
+        <w:pStyle w:val="ListParagraph"/>
+        <w:numPr>
+          <w:ilvl w:val="0"/>
+          <w:numId w:val="29"/>
+        </w:numPr>
+      </w:pPr>
+      <w:r>
+        <w:t>The visual match has unittes</w:t>
+      </w:r>
+      <w:r>
+        <w:t>t script to validate the module – tests/unit_tests/</w:t>
+      </w:r>
+    </w:p>
+    <w:p>
+      <w:pPr>
+        <w:pStyle w:val="ListParagraph"/>
+        <w:ind w:left="1080"/>
+        <w:rPr>
+          <w:rStyle w:val="12"/>
+        </w:rPr>
+      </w:pPr>
+      <w:r>
+        <w:t xml:space="preserve"># python </w:t>
+      </w:r>
+      <w:r>
+        <w:rPr>
+          <w:rStyle w:val="12"/>
+        </w:rPr>
+        <w:t>-m</w:t>
+      </w:r>
+      <w:r>
+        <w:t xml:space="preserve"> unittest tests.unit_tests.unittest_visual_match </w:t>
+      </w:r>
+      <w:r>
+        <w:rPr>
+          <w:rStyle w:val="12"/>
+        </w:rPr>
+        <w:t>–</w:t>
+      </w:r>
+      <w:r>
+        <w:rPr>
+          <w:rStyle w:val="12"/>
+        </w:rPr>
+        <w:t>v</w:t>
+      </w:r>
+    </w:p>
+    <w:p>
+      <w:pPr>
+        <w:pStyle w:val="Heading3"/>
+      </w:pPr>
+      <w:r>
+        <w:t xml:space="preserve">How </w:t>
+      </w:r>
+      <w:r>
+        <w:rPr>
+          <w:rStyle w:val="HTMLCode"/>
+          <w:rFonts w:eastAsiaTheme="majorEastAsia"/>
+        </w:rPr>
+        <w:t>visual_match.py</w:t>
+      </w:r>
+      <w:r>
+        <w:t xml:space="preserve"> connects to test cases</w:t>
+      </w:r>
+    </w:p>
+    <w:p>
+      <w:r>
+        <w:rPr>
+          <w:noProof/>
+          <w:lang w:eastAsia="en-IN" w:bidi="ta-IN"/>
+        </w:rPr>
+        <w:drawing>
+          <wp:inline distT="0" distB="0" distL="0" distR="0" wp14:anchorId="1075503E" wp14:editId="70C9C690">
+            <wp:extent cx="5731510" cy="2003579"/>
+            <wp:effectExtent l="0" t="0" r="2540" b="0"/>
+            <wp:docPr id="7" name="Picture 7"/>
+            <wp:cNvGraphicFramePr>
+              <a:graphicFrameLocks xmlns:a="http://schemas.openxmlformats.org/drawingml/2006/main" noChangeAspect="1"/>
+            </wp:cNvGraphicFramePr>
+            <a:graphic xmlns:a="http://schemas.openxmlformats.org/drawingml/2006/main">
+              <a:graphicData uri="http://schemas.openxmlformats.org/drawingml/2006/picture">
+                <pic:pic xmlns:pic="http://schemas.openxmlformats.org/drawingml/2006/picture">
+                  <pic:nvPicPr>
+                    <pic:cNvPr id="0" name=""/>
+                    <pic:cNvPicPr/>
+                  </pic:nvPicPr>
+                  <pic:blipFill>
+                    <a:blip r:embed="rId20"/>
+                    <a:stretch>
+                      <a:fillRect/>
+                    </a:stretch>
+                  </pic:blipFill>
+                  <pic:spPr>
+                    <a:xfrm>
+                      <a:off x="0" y="0"/>
+                      <a:ext cx="5731510" cy="2003579"/>
+                    </a:xfrm>
+                    <a:prstGeom prst="rect">
+                      <a:avLst/>
+                    </a:prstGeom>
+                  </pic:spPr>
+                </pic:pic>
+              </a:graphicData>
+            </a:graphic>
+          </wp:inline>
+        </w:drawing>
+      </w:r>
+    </w:p>
+    <w:p>
+      <w:pPr>
+        <w:jc w:val="center"/>
+        <w:rPr>
+          <w:b/>
+          <w:bCs/>
+        </w:rPr>
+      </w:pPr>
+      <w:r>
+        <w:rPr>
+          <w:b/>
+          <w:bCs/>
+        </w:rPr>
+        <w:t>Fig: This is example</w:t>
+      </w:r>
+    </w:p>
+    <w:p>
+      <w:r>
+        <w:rPr>
+          <w:b/>
+          <w:bCs/>
+          <w:color w:val="FF0000"/>
+        </w:rPr>
+        <w:t>Note:</w:t>
+      </w:r>
+      <w:r>
+        <w:t xml:space="preserve"> </w:t>
+      </w:r>
+    </w:p>
+    <w:p>
+      <w:pPr>
+        <w:pStyle w:val="ListParagraph"/>
+        <w:numPr>
+          <w:ilvl w:val="0"/>
+          <w:numId w:val="29"/>
+        </w:numPr>
+      </w:pPr>
+      <w:r>
+        <w:t xml:space="preserve">The cv2 lib can be used to detect the static images/objects. It’s not efficient with real time object/logo detections. </w:t>
+      </w:r>
+    </w:p>
+    <w:p>
+      <w:pPr>
+        <w:pStyle w:val="ListParagraph"/>
+        <w:numPr>
+          <w:ilvl w:val="0"/>
+          <w:numId w:val="29"/>
+        </w:numPr>
+      </w:pPr>
+      <w:r>
+        <w:t xml:space="preserve">So later we need to study and integrate the realtime object detections using </w:t>
+      </w:r>
+      <w:r>
+        <w:t>another computer visual lib Like YOLO.</w:t>
+      </w:r>
+    </w:p>
+    <w:p>
+      <w:pPr>
+        <w:pStyle w:val="Heading2"/>
+      </w:pPr>
+      <w:r>
+        <w:t>OCR (ocr.py – Optical Character Recognition):</w:t>
+      </w:r>
+    </w:p>
+    <w:p>
+      <w:pPr>
+        <w:pStyle w:val="ListParagraph"/>
+        <w:numPr>
+          <w:ilvl w:val="0"/>
+          <w:numId w:val="30"/>
+        </w:numPr>
+      </w:pPr>
+      <w:r>
+        <w:t>Install ocr pytessaract.</w:t>
+      </w:r>
+    </w:p>
+    <w:p>
+      <w:pPr>
+        <w:pStyle w:val="ListParagraph"/>
+      </w:pPr>
+      <w:r>
+        <w:t xml:space="preserve"># </w:t>
+      </w:r>
+      <w:r>
+        <w:t>pip install pytesseract pillow</w:t>
+      </w:r>
+    </w:p>
+    <w:p>
+      <w:pPr>
+        <w:pStyle w:val="ListParagraph"/>
+        <w:numPr>
+          <w:ilvl w:val="0"/>
+          <w:numId w:val="30"/>
+        </w:numPr>
+      </w:pPr>
+      <w:r>
+        <w:t>install Tesseract OCR engine on Windows — it's a separate binary</w:t>
+      </w:r>
+      <w:r>
+        <w:t xml:space="preserve">. </w:t>
+      </w:r>
+      <w:r>
+        <w:t>Go to</w:t>
+      </w:r>
+      <w:r>
+        <w:t xml:space="preserve"> the url -</w:t>
+      </w:r>
+      <w:r>
+        <w:t xml:space="preserve"> </w:t>
+      </w:r>
+      <w:hyperlink r:id="rId21" w:history="1">
+        <w:r>
+          <w:rPr>
+            <w:rStyle w:val="Hyperlink"/>
+          </w:rPr>
+          <w:t>https://github.com/UB-Mannheim/tesseract/wiki</w:t>
+        </w:r>
+      </w:hyperlink>
+    </w:p>
+    <w:p>
+      <w:pPr>
+        <w:pStyle w:val="ListParagraph"/>
+        <w:numPr>
+          <w:ilvl w:val="0"/>
+          <w:numId w:val="30"/>
+        </w:numPr>
+      </w:pPr>
+      <w:r>
+        <w:t>Download and install the .exe file.</w:t>
+      </w:r>
+    </w:p>
+    <w:p>
+      <w:pPr>
+        <w:pStyle w:val="ListParagraph"/>
+        <w:numPr>
+          <w:ilvl w:val="0"/>
+          <w:numId w:val="30"/>
+        </w:numPr>
+      </w:pPr>
+      <w:r>
+        <w:t>After installed, add the environment path of installed location.</w:t>
+      </w:r>
+    </w:p>
+    <w:p>
+      <w:pPr>
+        <w:pStyle w:val="ListParagraph"/>
+        <w:numPr>
+          <w:ilvl w:val="0"/>
+          <w:numId w:val="30"/>
+        </w:numPr>
+      </w:pPr>
+      <w:r>
+        <w:t>Then check the version</w:t>
+      </w:r>
+    </w:p>
+    <w:p>
+      <w:pPr>
+        <w:pStyle w:val="ListParagraph"/>
+      </w:pPr>
+      <w:r>
+        <w:t xml:space="preserve"># </w:t>
+      </w:r>
+      <w:r>
+        <w:t xml:space="preserve">tesseract </w:t>
+      </w:r>
+      <w:r>
+        <w:t>–</w:t>
+      </w:r>
+      <w:r>
+        <w:t>version</w:t>
+      </w:r>
+    </w:p>
+    <w:p>
+      <w:pPr>
+        <w:pStyle w:val="ListParagraph"/>
+        <w:numPr>
+          <w:ilvl w:val="0"/>
+          <w:numId w:val="30"/>
+        </w:numPr>
+      </w:pPr>
+      <w:r>
+        <w:t xml:space="preserve">For more details, refer link - </w:t>
+      </w:r>
+      <w:hyperlink r:id="rId22" w:history="1">
+        <w:r>
+          <w:rPr>
+            <w:rStyle w:val="Hyperlink"/>
+          </w:rPr>
+          <w:t>https://www.geeksforgeeks.org/python/introduction-to-python-pytesseract-package/</w:t>
+        </w:r>
+      </w:hyperlink>
+    </w:p>
+    <w:p>
+      <w:pPr>
+        <w:pStyle w:val="Heading3"/>
+      </w:pPr>
+      <w:r>
+        <w:t>What OCR does in your framework</w:t>
+      </w:r>
+    </w:p>
+    <w:p>
+      <w:pPr>
+        <w:spacing w:after="0"/>
+      </w:pPr>
+      <w:r>
+        <w:tab/>
+        <w:t>gra</w:t>
+      </w:r>
+      <w:r>
+        <w:t>b_frame()          →   full 1280x720</w:t>
+      </w:r>
+      <w:r>
+        <w:t xml:space="preserve"> BGR frame</w:t>
+      </w:r>
+    </w:p>
+    <w:p>
+      <w:pPr>
+        <w:spacing w:after="0"/>
+      </w:pPr>
+      <w:r>
+        <w:t xml:space="preserve">     </w:t>
+      </w:r>
+      <w:r>
+        <w:tab/>
+      </w:r>
+      <w:r>
+        <w:tab/>
+      </w:r>
+      <w:r>
+        <w:t>↓</w:t>
+      </w:r>
+    </w:p>
+    <w:p>
+      <w:pPr>
+        <w:spacing w:after="0"/>
+        <w:ind w:firstLine="720"/>
+      </w:pPr>
+      <w:r>
+        <w:t>ocr.extract_text()    →   "BBC ONE HD  19:30  News at Ten"</w:t>
+      </w:r>
+    </w:p>
+    <w:p>
+      <w:pPr>
+        <w:spacing w:after="0"/>
+      </w:pPr>
+      <w:r>
+        <w:t xml:space="preserve">      </w:t>
+      </w:r>
+      <w:r>
+        <w:tab/>
+      </w:r>
+      <w:r>
+        <w:tab/>
+      </w:r>
+      <w:r>
+        <w:t>↓</w:t>
+      </w:r>
+    </w:p>
+    <w:p>
+      <w:pPr>
+        <w:spacing w:after="0"/>
+        <w:ind w:firstLine="720"/>
+      </w:pPr>
+      <w:r>
+        <w:t xml:space="preserve">assert "BBC ONE" in text   →   PASS </w:t>
+      </w:r>
+      <w:r>
+        <w:rPr>
+          <w:rFonts w:ascii="Calibri" w:hAnsi="Calibri" w:cs="Calibri"/>
+        </w:rPr>
+        <w:t>✅</w:t>
+      </w:r>
+    </w:p>
+    <w:p>
+      <w:pPr>
+        <w:pStyle w:val="Heading3"/>
+        <w:numPr>
+          <w:ilvl w:val="0"/>
+          <w:numId w:val="30"/>
+        </w:numPr>
+      </w:pPr>
+      <w:r>
+        <w:lastRenderedPageBreak/>
+        <w:t xml:space="preserve">Created </w:t>
+      </w:r>
+      <w:r>
+        <w:rPr>
+          <w:rStyle w:val="HTMLCode"/>
+          <w:rFonts w:eastAsiaTheme="majorEastAsia"/>
+        </w:rPr>
+        <w:t>analysis/ocr.py</w:t>
+      </w:r>
+    </w:p>
+    <w:p>
+      <w:pPr>
+        <w:pStyle w:val="ListParagraph"/>
+        <w:numPr>
+          <w:ilvl w:val="0"/>
+          <w:numId w:val="30"/>
+        </w:numPr>
+      </w:pPr>
+      <w:r>
+        <w:t>Run unittest of ocr.py</w:t>
+      </w:r>
+    </w:p>
+    <w:p>
+      <w:pPr>
+        <w:pStyle w:val="ListParagraph"/>
+      </w:pPr>
+      <w:r>
+        <w:t xml:space="preserve"># </w:t>
+      </w:r>
+      <w:r>
+        <w:t xml:space="preserve">python -m unittest tests/unit_tests/unittest_ocr.py </w:t>
+      </w:r>
+      <w:r>
+        <w:t>–</w:t>
+      </w:r>
+      <w:r>
+        <w:t>v</w:t>
+      </w:r>
+    </w:p>
+    <w:p>
+      <w:pPr>
+        <w:pStyle w:val="Heading2"/>
+      </w:pPr>
+      <w:r>
+        <w:t>AV Quality (av_quality.py)</w:t>
+      </w:r>
+      <w:r>
+        <w:br/>
+      </w:r>
+    </w:p>
+    <w:p>
+      <w:pPr>
+        <w:pStyle w:val="ListParagraph"/>
+        <w:numPr>
+          <w:ilvl w:val="0"/>
+          <w:numId w:val="31"/>
+        </w:numPr>
+      </w:pPr>
+      <w:r>
+        <w:t>This module contains the multiple methods are created to validate the following testing.</w:t>
+      </w:r>
+    </w:p>
+    <w:p>
+      <w:pPr>
+        <w:pStyle w:val="ListParagraph"/>
+        <w:numPr>
+          <w:ilvl w:val="0"/>
+          <w:numId w:val="32"/>
+        </w:numPr>
+      </w:pPr>
+      <w:r>
+        <w:t xml:space="preserve">Black screen → STB crashed, no signal, channel loading </w:t>
+      </w:r>
+    </w:p>
+    <w:p>
+      <w:pPr>
+        <w:pStyle w:val="ListParagraph"/>
+        <w:numPr>
+          <w:ilvl w:val="0"/>
+          <w:numId w:val="32"/>
+        </w:numPr>
+      </w:pPr>
+      <w:r>
+        <w:t xml:space="preserve">Frozen frame → video stopped but audio still plays </w:t>
+      </w:r>
+    </w:p>
+    <w:p>
+      <w:pPr>
+        <w:pStyle w:val="ListParagraph"/>
+        <w:numPr>
+          <w:ilvl w:val="0"/>
+          <w:numId w:val="32"/>
+        </w:numPr>
+      </w:pPr>
+      <w:r>
+        <w:t>No signal → HDMI disconnected or STB off</w:t>
+      </w:r>
+    </w:p>
+    <w:p>
+      <w:pPr>
+        <w:pStyle w:val="ListParagraph"/>
+        <w:numPr>
+          <w:ilvl w:val="0"/>
+          <w:numId w:val="31"/>
+        </w:numPr>
+      </w:pPr>
+      <w:r>
+        <w:t>These three are the most common failures in STB testing — and the hardest to catch without automated vision.</w:t>
+      </w:r>
+    </w:p>
+    <w:p>
+      <w:pPr>
+        <w:pStyle w:val="ListParagraph"/>
+        <w:numPr>
+          <w:ilvl w:val="0"/>
+          <w:numId w:val="31"/>
+        </w:numPr>
+      </w:pPr>
+      <w:r>
+        <w:t>Av_quality.py module created in analysis/av_quality.py</w:t>
+      </w:r>
+    </w:p>
+    <w:p>
+      <w:pPr>
+        <w:pStyle w:val="ListParagraph"/>
+        <w:numPr>
+          <w:ilvl w:val="0"/>
+          <w:numId w:val="31"/>
+        </w:numPr>
+      </w:pPr>
+      <w:r>
+        <w:t>And verfied the unittest cmd</w:t>
+      </w:r>
+      <w:r>
+        <w:t>:</w:t>
+      </w:r>
+      <w:r>
+        <w:t xml:space="preserve"> </w:t>
+      </w:r>
+    </w:p>
+    <w:p>
+      <w:pPr>
+        <w:spacing w:after="0"/>
+        <w:ind w:left="720"/>
+      </w:pPr>
+      <w:r>
+        <w:t xml:space="preserve"># </w:t>
+      </w:r>
+      <w:r>
+        <w:t xml:space="preserve">python -m pytest tests/unit_tests/unittest_av_quality.py </w:t>
+      </w:r>
+      <w:r>
+        <w:t>–</w:t>
+      </w:r>
+      <w:r>
+        <w:t>v</w:t>
+      </w:r>
+    </w:p>
+    <w:p>
+      <w:pPr>
+        <w:spacing w:after="0"/>
+        <w:ind w:left="720"/>
+      </w:pPr>
+      <w:r>
+        <w:t xml:space="preserve">Or </w:t>
+      </w:r>
+    </w:p>
+    <w:p>
+      <w:pPr>
+        <w:spacing w:after="0"/>
+        <w:ind w:left="720"/>
+      </w:pPr>
+      <w:r>
+        <w:t xml:space="preserve"># </w:t>
+      </w:r>
+      <w:r>
+        <w:t xml:space="preserve">python -m </w:t>
+      </w:r>
+      <w:r>
+        <w:t>unittest tests.unit_tests.unittest_av_quality</w:t>
+      </w:r>
+      <w:r>
+        <w:t xml:space="preserve"> </w:t>
+      </w:r>
+      <w:r>
+        <w:t>–</w:t>
+      </w:r>
+      <w:r>
+        <w:t>v</w:t>
+      </w:r>
+    </w:p>
+    <w:p>
+      <w:pPr>
+        <w:spacing w:after="0"/>
+      </w:pPr>
+    </w:p>
+    <w:p>
+      <w:pPr>
+        <w:pStyle w:val="Heading2"/>
+      </w:pPr>
+      <w:r>
+        <w:t>TIMING</w:t>
+      </w:r>
+      <w:r>
+        <w:t xml:space="preserve"> (</w:t>
+      </w:r>
+      <w:r>
+        <w:t>timing</w:t>
+      </w:r>
+      <w:r>
+        <w:t>.py)</w:t>
+      </w:r>
+    </w:p>
+    <w:p>
+      <w:pPr>
+        <w:pStyle w:val="Heading4"/>
+      </w:pPr>
+      <w:r>
+        <w:t xml:space="preserve">What </w:t>
+      </w:r>
+      <w:r>
+        <w:rPr>
+          <w:rStyle w:val="HTMLCode"/>
+          <w:rFonts w:eastAsiaTheme="majorEastAsia"/>
+        </w:rPr>
+        <w:t>timing.py</w:t>
+      </w:r>
+      <w:r>
+        <w:t xml:space="preserve"> measures</w:t>
+      </w:r>
+    </w:p>
+    <w:p>
+      <w:pPr>
+        <w:spacing w:after="0"/>
+      </w:pPr>
+      <w:r>
+        <w:t>send_key("CH_UP")          ← start timer here</w:t>
+      </w:r>
+    </w:p>
+    <w:p>
+      <w:pPr>
+        <w:spacing w:after="0"/>
+      </w:pPr>
+      <w:r>
+        <w:t xml:space="preserve">      ↓</w:t>
+      </w:r>
+    </w:p>
+    <w:p>
+      <w:pPr>
+        <w:spacing w:after="0"/>
+      </w:pPr>
+      <w:r>
+        <w:t>STB starts loading channel</w:t>
+      </w:r>
+    </w:p>
+    <w:p>
+      <w:pPr>
+        <w:spacing w:after="0"/>
+      </w:pPr>
+      <w:r>
+        <w:t xml:space="preserve">      ↓</w:t>
+      </w:r>
+    </w:p>
+    <w:p>
+      <w:pPr>
+        <w:spacing w:after="0"/>
+      </w:pPr>
+      <w:r>
+        <w:t>New channel appears on screen  ← stop timer here</w:t>
+      </w:r>
+    </w:p>
+    <w:p>
+      <w:pPr>
+        <w:spacing w:after="0"/>
+      </w:pPr>
+      <w:r>
+        <w:t xml:space="preserve">      ↓</w:t>
+      </w:r>
+    </w:p>
+    <w:p>
+      <w:pPr>
+        <w:spacing w:after="0"/>
+      </w:pPr>
+      <w:r>
+        <w:t>zap_time = 2.3 seconds</w:t>
+      </w:r>
+    </w:p>
+    <w:p>
+      <w:pPr>
+        <w:spacing w:after="0"/>
+      </w:pPr>
+    </w:p>
+    <w:p>
+      <w:pPr>
+        <w:spacing w:after="0"/>
+      </w:pPr>
+      <w:r>
+        <w:rPr>
+          <w:b/>
+          <w:bCs/>
+          <w:color w:val="FF0000"/>
+        </w:rPr>
+        <w:t xml:space="preserve">Note: </w:t>
+      </w:r>
+      <w:r>
+        <w:t xml:space="preserve">This is one of the most important </w:t>
+      </w:r>
+      <w:r>
+        <w:t>method</w:t>
+      </w:r>
+      <w:r>
+        <w:t xml:space="preserve"> in STB testing — operators have strict SLAs on channel change time (typically under 3 seconds).</w:t>
+      </w:r>
+    </w:p>
+    <w:p>
+      <w:pPr>
+        <w:spacing w:after="0"/>
+      </w:pPr>
+    </w:p>
+    <w:p>
+      <w:pPr>
+        <w:pStyle w:val="ListParagraph"/>
+        <w:numPr>
+          <w:ilvl w:val="0"/>
+          <w:numId w:val="31"/>
+        </w:numPr>
+      </w:pPr>
+      <w:r>
+        <w:t xml:space="preserve">This </w:t>
+      </w:r>
+      <w:r>
+        <w:t xml:space="preserve">timing.py </w:t>
+      </w:r>
+      <w:r>
+        <w:t>module contains the multiple methods are created to validate the following testing.</w:t>
+      </w:r>
+    </w:p>
+    <w:p>
+      <w:pPr>
+        <w:pStyle w:val="ListParagraph"/>
+        <w:numPr>
+          <w:ilvl w:val="0"/>
+          <w:numId w:val="32"/>
+        </w:numPr>
+      </w:pPr>
+      <w:r>
+        <w:t>Simpl timer</w:t>
+      </w:r>
+      <w:r>
+        <w:t xml:space="preserve"> → </w:t>
+      </w:r>
+      <w:r>
+        <w:t>To capture the run time of test task</w:t>
+      </w:r>
+      <w:r>
+        <w:t xml:space="preserve"> </w:t>
+      </w:r>
+    </w:p>
+    <w:p>
+      <w:pPr>
+        <w:pStyle w:val="ListParagraph"/>
+        <w:numPr>
+          <w:ilvl w:val="0"/>
+          <w:numId w:val="32"/>
+        </w:numPr>
+      </w:pPr>
+      <w:r>
+        <w:t>Measure swap time</w:t>
+      </w:r>
+      <w:r>
+        <w:t xml:space="preserve"> → </w:t>
+      </w:r>
+      <w:r>
+        <w:t>To capture the channel up swap time (</w:t>
+      </w:r>
+      <w:r>
+        <w:rPr>
+          <w:b/>
+          <w:bCs/>
+          <w:color w:val="FF0000"/>
+        </w:rPr>
+        <w:t>need to workaround it</w:t>
+      </w:r>
+      <w:r>
+        <w:t xml:space="preserve"> </w:t>
+      </w:r>
+      <w:r>
+        <w:rPr>
+          <w:b/>
+          <w:bCs/>
+          <w:color w:val="FF0000"/>
+        </w:rPr>
+        <w:t>in feature</w:t>
+      </w:r>
+      <w:r>
+        <w:t>)</w:t>
+      </w:r>
+    </w:p>
+    <w:p>
+      <w:pPr>
+        <w:pStyle w:val="ListParagraph"/>
+        <w:numPr>
+          <w:ilvl w:val="0"/>
+          <w:numId w:val="32"/>
+        </w:numPr>
+      </w:pPr>
+      <w:r>
+        <w:t>Others.</w:t>
+      </w:r>
+    </w:p>
+    <w:p>
+      <w:pPr>
+        <w:pStyle w:val="ListParagraph"/>
+        <w:numPr>
+          <w:ilvl w:val="0"/>
+          <w:numId w:val="31"/>
+        </w:numPr>
+      </w:pPr>
+      <w:r>
+        <w:t>Refer below unittest run commond to test the module – timing.py</w:t>
+      </w:r>
+    </w:p>
+    <w:p>
+      <w:pPr>
+        <w:spacing w:after="0"/>
+        <w:ind w:left="720"/>
+      </w:pPr>
+      <w:r>
+        <w:t xml:space="preserve"># </w:t>
+      </w:r>
+      <w:r>
+        <w:t>python -m pytest tests/unit_tests/unittest_</w:t>
+      </w:r>
+      <w:r>
+        <w:t>timing</w:t>
+      </w:r>
+      <w:r>
+        <w:t xml:space="preserve">.py </w:t>
+      </w:r>
+      <w:r>
+        <w:t>–</w:t>
+      </w:r>
+      <w:r>
+        <w:t>v</w:t>
+      </w:r>
+    </w:p>
+    <w:p>
+      <w:pPr>
+        <w:spacing w:after="0"/>
+        <w:ind w:left="720"/>
+      </w:pPr>
+      <w:r>
+        <w:t xml:space="preserve">Or </w:t>
+      </w:r>
+    </w:p>
+    <w:p>
+      <w:pPr>
+        <w:spacing w:after="0"/>
+        <w:ind w:left="720"/>
+      </w:pPr>
+      <w:r>
+        <w:t xml:space="preserve"># </w:t>
+      </w:r>
+      <w:r>
+        <w:t xml:space="preserve">python -m </w:t>
+      </w:r>
+      <w:r>
+        <w:t>unittest tests.unit_tests.unittest_</w:t>
+      </w:r>
+      <w:r>
+        <w:t>timing</w:t>
+      </w:r>
+      <w:r>
+        <w:t xml:space="preserve"> </w:t>
+      </w:r>
+      <w:r>
+        <w:t>–</w:t>
+      </w:r>
+      <w:r>
+        <w:t>v</w:t>
+      </w:r>
+    </w:p>
+    <w:p>
+      <w:pPr>
+        <w:spacing w:after="0"/>
+      </w:pPr>
+    </w:p>
+    <w:p>
+      <w:pPr>
+        <w:pStyle w:val="Heading1"/>
+      </w:pPr>
+      <w:r>
+        <w:lastRenderedPageBreak/>
+        <w:t>PHASE –5</w:t>
+      </w:r>
+      <w:r>
+        <w:t xml:space="preserve">: </w:t>
+      </w:r>
+      <w:r>
+        <w:t>TEST FRAMEWORK</w:t>
+      </w:r>
+    </w:p>
+    <w:p>
+      <w:pPr>
+        <w:pStyle w:val="ListParagraph"/>
+        <w:numPr>
+          <w:ilvl w:val="0"/>
+          <w:numId w:val="31"/>
+        </w:numPr>
+      </w:pPr>
+      <w:r>
+        <w:t xml:space="preserve">This layer has pytest fixtures, page objects module (POM) of each page and full test cases with test suite (EPG, Menu, Channel,..etc.). </w:t>
+      </w:r>
+    </w:p>
+    <w:p>
+      <w:pPr>
+        <w:pStyle w:val="ListParagraph"/>
+        <w:numPr>
+          <w:ilvl w:val="0"/>
+          <w:numId w:val="31"/>
+        </w:numPr>
+      </w:pPr>
+      <w:r>
+        <w:rPr>
+          <w:rFonts w:cstheme="minorHAnsi"/>
+          <w:b/>
+          <w:bCs/>
+        </w:rPr>
+        <w:t>Pytest F</w:t>
+      </w:r>
+      <w:r>
+        <w:rPr>
+          <w:rFonts w:cstheme="minorHAnsi"/>
+          <w:b/>
+          <w:bCs/>
+        </w:rPr>
+        <w:t>ixtures:</w:t>
+      </w:r>
+      <w:r>
+        <w:rPr>
+          <w:rFonts w:cstheme="minorHAnsi"/>
+        </w:rPr>
+        <w:t xml:space="preserve"> </w:t>
+      </w:r>
+      <w:r>
+        <w:t>I</w:t>
+      </w:r>
+      <w:r>
+        <w:t>t</w:t>
+      </w:r>
+      <w:r>
+        <w:t xml:space="preserve"> is a modular, reusable Python function designed to set up the environment, state, or data dependencies required before a test runs, and clean them up afterward</w:t>
+      </w:r>
+    </w:p>
+    <w:p>
+      <w:pPr>
+        <w:pStyle w:val="ListParagraph"/>
+        <w:numPr>
+          <w:ilvl w:val="0"/>
+          <w:numId w:val="31"/>
+        </w:numPr>
+        <w:rPr>
+          <w:rStyle w:val="Strong"/>
+          <w:b w:val="0"/>
+          <w:bCs w:val="0"/>
+        </w:rPr>
+      </w:pPr>
+      <w:r>
+        <w:rPr>
+          <w:rFonts w:cstheme="minorHAnsi"/>
+          <w:b/>
+          <w:bCs/>
+        </w:rPr>
+        <w:t>POM:</w:t>
+      </w:r>
+      <w:r>
+        <w:t xml:space="preserve"> It’s a</w:t>
+      </w:r>
+      <w:r>
+        <w:t xml:space="preserve"> popular design pattern in test automation that creates an object repository for user interface (UI) elements. Under this pattern, </w:t>
+      </w:r>
+      <w:r>
+        <w:rPr>
+          <w:rStyle w:val="Strong"/>
+          <w:rFonts w:ascii="Arial" w:hAnsi="Arial" w:cs="Arial"/>
+        </w:rPr>
+        <w:t>each web page or major UI component is represented by its own distinct class</w:t>
+      </w:r>
+    </w:p>
+    <w:p>
+      <w:pPr>
+        <w:pStyle w:val="ListParagraph"/>
+        <w:numPr>
+          <w:ilvl w:val="0"/>
+          <w:numId w:val="31"/>
+        </w:numPr>
+      </w:pPr>
+      <w:r>
+        <w:rPr>
+          <w:rFonts w:cstheme="minorHAnsi"/>
+          <w:b/>
+          <w:bCs/>
+        </w:rPr>
+        <w:t xml:space="preserve">Test Cases: </w:t>
+      </w:r>
+      <w:r>
+        <w:rPr>
+          <w:rFonts w:cstheme="minorHAnsi"/>
+        </w:rPr>
+        <w:t>contains test cases of each functionality (like, chanel swap, av quality etc..)</w:t>
+      </w:r>
+    </w:p>
+    <w:p>
+      <w:pPr>
+        <w:pStyle w:val="Heading3"/>
+        <w:ind w:firstLine="360"/>
+        <w:rPr>
+          <w:rStyle w:val="Heading4Char"/>
+          <w:b/>
+          <w:bCs/>
+          <w:i w:val="0"/>
+          <w:iCs w:val="0"/>
+        </w:rPr>
+      </w:pPr>
+      <w:r>
+        <w:rPr>
+          <w:rStyle w:val="Heading4Char"/>
+          <w:b/>
+          <w:bCs/>
+          <w:i w:val="0"/>
+          <w:iCs w:val="0"/>
+        </w:rPr>
+        <w:t>Flow:</w:t>
+      </w:r>
+    </w:p>
+    <w:p>
+      <w:pPr>
+        <w:rPr>
+          <w:rStyle w:val="Heading4Char"/>
+          <w:i w:val="0"/>
+          <w:iCs w:val="0"/>
+          <w:color w:val="auto"/>
+        </w:rPr>
+      </w:pPr>
+      <w:r>
+        <w:rPr>
+          <w:rStyle w:val="Heading4Char"/>
+          <w:b w:val="0"/>
+          <w:bCs w:val="0"/>
+          <w:i w:val="0"/>
+          <w:iCs w:val="0"/>
+        </w:rPr>
+        <w:tab/>
+      </w:r>
+      <w:r>
+        <w:rPr>
+          <w:rStyle w:val="Heading4Char"/>
+          <w:i w:val="0"/>
+          <w:iCs w:val="0"/>
+          <w:color w:val="auto"/>
+        </w:rPr>
+        <w:t>Test run -&gt; IR -&gt; Capture -&gt; assert -&gt; Pass/Fail in report.</w:t>
+      </w:r>
+    </w:p>
+    <w:p>
+      <w:pPr>
+        <w:ind w:left="360"/>
+      </w:pPr>
+      <w:r>
+        <w:rPr>
+          <w:rStyle w:val="Heading4Char"/>
+        </w:rPr>
+        <w:t>In our case:</w:t>
+      </w:r>
+      <w:r>
+        <w:rPr>
+          <w:rStyle w:val="Heading4Char"/>
+        </w:rPr>
+        <w:br/>
+      </w:r>
+      <w:r>
+        <w:t xml:space="preserve">A fixture is a reusable setup that every test shares. Instead of each test creating its own </w:t>
+      </w:r>
+      <w:r>
+        <w:rPr>
+          <w:rStyle w:val="HTMLCode"/>
+          <w:rFonts w:eastAsiaTheme="minorHAnsi"/>
+        </w:rPr>
+        <w:t>DeviceManager</w:t>
+      </w:r>
+      <w:r>
+        <w:t>, backend, and analysis objects — fixtures handle that once.</w:t>
+      </w:r>
+    </w:p>
+    <w:p>
+      <w:pPr>
+        <w:pStyle w:val="Heading4"/>
+      </w:pPr>
+      <w:r>
+        <w:t>For STB automation specifically, the most scalable design is:</w:t>
+      </w:r>
+    </w:p>
+    <w:p>
+      <w:pPr>
+        <w:pStyle w:val="NormalWeb"/>
+      </w:pPr>
+      <w:r>
+        <w:rPr>
+          <w:rStyle w:val="Strong"/>
+          <w:rFonts w:eastAsiaTheme="majorEastAsia"/>
+        </w:rPr>
+        <w:t>Framework Layer → Page Objects → Keywords/Business Actions → Tests → Project-specific Config/Templates</w:t>
+      </w:r>
+      <w:bookmarkStart w:id="0" w:name="_GoBack"/>
+      <w:bookmarkEnd w:id="0"/>
+    </w:p>
+    <w:p>
+      <w:pPr>
+        <w:ind w:left="360"/>
+      </w:pPr>
     </w:p>
     <w:sectPr>
       <w:pgSz w:w="11906" w:h="16838"/>
@@ -6609,6 +8155,232 @@
 <file path=word/numbering.xml><?xml version="1.0" encoding="utf-8"?>
 <w:numbering xmlns:wpc="http://schemas.microsoft.com/office/word/2010/wordprocessingCanvas" xmlns:mc="http://schemas.openxmlformats.org/markup-compatibility/2006" xmlns:o="urn:schemas-microsoft-com:office:office" xmlns:r="http://schemas.openxmlformats.org/officeDocument/2006/relationships" xmlns:m="http://schemas.openxmlformats.org/officeDocument/2006/math" xmlns:v="urn:schemas-microsoft-com:vml" xmlns:wp14="http://schemas.microsoft.com/office/word/2010/wordprocessingDrawing" xmlns:wp="http://schemas.openxmlformats.org/drawingml/2006/wordprocessingDrawing" xmlns:w10="urn:schemas-microsoft-com:office:word" xmlns:w="http://schemas.openxmlformats.org/wordprocessingml/2006/main" xmlns:w14="http://schemas.microsoft.com/office/word/2010/wordml" xmlns:wpg="http://schemas.microsoft.com/office/word/2010/wordprocessingGroup" xmlns:wpi="http://schemas.microsoft.com/office/word/2010/wordprocessingInk" xmlns:wne="http://schemas.microsoft.com/office/word/2006/wordml" xmlns:wps="http://schemas.microsoft.com/office/word/2010/wordprocessingShape" mc:Ignorable="w14 wp14">
   <w:abstractNum w:abstractNumId="0">
+    <w:nsid w:val="021C16D3"/>
+    <w:multiLevelType w:val="hybridMultilevel"/>
+    <w:tmpl w:val="0DC21CCC"/>
+    <w:lvl w:ilvl="0" w:tplc="40090001">
+      <w:start w:val="1"/>
+      <w:numFmt w:val="bullet"/>
+      <w:lvlText w:val=""/>
+      <w:lvlJc w:val="left"/>
+      <w:pPr>
+        <w:ind w:left="720" w:hanging="360"/>
+      </w:pPr>
+      <w:rPr>
+        <w:rFonts w:ascii="Symbol" w:hAnsi="Symbol" w:hint="default"/>
+      </w:rPr>
+    </w:lvl>
+    <w:lvl w:ilvl="1" w:tplc="40090003">
+      <w:start w:val="1"/>
+      <w:numFmt w:val="bullet"/>
+      <w:lvlText w:val="o"/>
+      <w:lvlJc w:val="left"/>
+      <w:pPr>
+        <w:ind w:left="1440" w:hanging="360"/>
+      </w:pPr>
+      <w:rPr>
+        <w:rFonts w:ascii="Courier New" w:hAnsi="Courier New" w:cs="Courier New" w:hint="default"/>
+      </w:rPr>
+    </w:lvl>
+    <w:lvl w:ilvl="2" w:tplc="40090005" w:tentative="1">
+      <w:start w:val="1"/>
+      <w:numFmt w:val="bullet"/>
+      <w:lvlText w:val=""/>
+      <w:lvlJc w:val="left"/>
+      <w:pPr>
+        <w:ind w:left="2160" w:hanging="360"/>
+      </w:pPr>
+      <w:rPr>
+        <w:rFonts w:ascii="Wingdings" w:hAnsi="Wingdings" w:hint="default"/>
+      </w:rPr>
+    </w:lvl>
+    <w:lvl w:ilvl="3" w:tplc="40090001" w:tentative="1">
+      <w:start w:val="1"/>
+      <w:numFmt w:val="bullet"/>
+      <w:lvlText w:val=""/>
+      <w:lvlJc w:val="left"/>
+      <w:pPr>
+        <w:ind w:left="2880" w:hanging="360"/>
+      </w:pPr>
+      <w:rPr>
+        <w:rFonts w:ascii="Symbol" w:hAnsi="Symbol" w:hint="default"/>
+      </w:rPr>
+    </w:lvl>
+    <w:lvl w:ilvl="4" w:tplc="40090003" w:tentative="1">
+      <w:start w:val="1"/>
+      <w:numFmt w:val="bullet"/>
+      <w:lvlText w:val="o"/>
+      <w:lvlJc w:val="left"/>
+      <w:pPr>
+        <w:ind w:left="3600" w:hanging="360"/>
+      </w:pPr>
+      <w:rPr>
+        <w:rFonts w:ascii="Courier New" w:hAnsi="Courier New" w:cs="Courier New" w:hint="default"/>
+      </w:rPr>
+    </w:lvl>
+    <w:lvl w:ilvl="5" w:tplc="40090005" w:tentative="1">
+      <w:start w:val="1"/>
+      <w:numFmt w:val="bullet"/>
+      <w:lvlText w:val=""/>
+      <w:lvlJc w:val="left"/>
+      <w:pPr>
+        <w:ind w:left="4320" w:hanging="360"/>
+      </w:pPr>
+      <w:rPr>
+        <w:rFonts w:ascii="Wingdings" w:hAnsi="Wingdings" w:hint="default"/>
+      </w:rPr>
+    </w:lvl>
+    <w:lvl w:ilvl="6" w:tplc="40090001" w:tentative="1">
+      <w:start w:val="1"/>
+      <w:numFmt w:val="bullet"/>
+      <w:lvlText w:val=""/>
+      <w:lvlJc w:val="left"/>
+      <w:pPr>
+        <w:ind w:left="5040" w:hanging="360"/>
+      </w:pPr>
+      <w:rPr>
+        <w:rFonts w:ascii="Symbol" w:hAnsi="Symbol" w:hint="default"/>
+      </w:rPr>
+    </w:lvl>
+    <w:lvl w:ilvl="7" w:tplc="40090003" w:tentative="1">
+      <w:start w:val="1"/>
+      <w:numFmt w:val="bullet"/>
+      <w:lvlText w:val="o"/>
+      <w:lvlJc w:val="left"/>
+      <w:pPr>
+        <w:ind w:left="5760" w:hanging="360"/>
+      </w:pPr>
+      <w:rPr>
+        <w:rFonts w:ascii="Courier New" w:hAnsi="Courier New" w:cs="Courier New" w:hint="default"/>
+      </w:rPr>
+    </w:lvl>
+    <w:lvl w:ilvl="8" w:tplc="40090005" w:tentative="1">
+      <w:start w:val="1"/>
+      <w:numFmt w:val="bullet"/>
+      <w:lvlText w:val=""/>
+      <w:lvlJc w:val="left"/>
+      <w:pPr>
+        <w:ind w:left="6480" w:hanging="360"/>
+      </w:pPr>
+      <w:rPr>
+        <w:rFonts w:ascii="Wingdings" w:hAnsi="Wingdings" w:hint="default"/>
+      </w:rPr>
+    </w:lvl>
+  </w:abstractNum>
+  <w:abstractNum w:abstractNumId="1">
+    <w:nsid w:val="09F36069"/>
+    <w:multiLevelType w:val="hybridMultilevel"/>
+    <w:tmpl w:val="0D90B9F2"/>
+    <w:lvl w:ilvl="0" w:tplc="40090001">
+      <w:start w:val="1"/>
+      <w:numFmt w:val="bullet"/>
+      <w:lvlText w:val=""/>
+      <w:lvlJc w:val="left"/>
+      <w:pPr>
+        <w:ind w:left="1080" w:hanging="360"/>
+      </w:pPr>
+      <w:rPr>
+        <w:rFonts w:ascii="Symbol" w:hAnsi="Symbol" w:hint="default"/>
+      </w:rPr>
+    </w:lvl>
+    <w:lvl w:ilvl="1" w:tplc="40090003" w:tentative="1">
+      <w:start w:val="1"/>
+      <w:numFmt w:val="bullet"/>
+      <w:lvlText w:val="o"/>
+      <w:lvlJc w:val="left"/>
+      <w:pPr>
+        <w:ind w:left="1800" w:hanging="360"/>
+      </w:pPr>
+      <w:rPr>
+        <w:rFonts w:ascii="Courier New" w:hAnsi="Courier New" w:cs="Courier New" w:hint="default"/>
+      </w:rPr>
+    </w:lvl>
+    <w:lvl w:ilvl="2" w:tplc="40090005" w:tentative="1">
+      <w:start w:val="1"/>
+      <w:numFmt w:val="bullet"/>
+      <w:lvlText w:val=""/>
+      <w:lvlJc w:val="left"/>
+      <w:pPr>
+        <w:ind w:left="2520" w:hanging="360"/>
+      </w:pPr>
+      <w:rPr>
+        <w:rFonts w:ascii="Wingdings" w:hAnsi="Wingdings" w:hint="default"/>
+      </w:rPr>
+    </w:lvl>
+    <w:lvl w:ilvl="3" w:tplc="40090001" w:tentative="1">
+      <w:start w:val="1"/>
+      <w:numFmt w:val="bullet"/>
+      <w:lvlText w:val=""/>
+      <w:lvlJc w:val="left"/>
+      <w:pPr>
+        <w:ind w:left="3240" w:hanging="360"/>
+      </w:pPr>
+      <w:rPr>
+        <w:rFonts w:ascii="Symbol" w:hAnsi="Symbol" w:hint="default"/>
+      </w:rPr>
+    </w:lvl>
+    <w:lvl w:ilvl="4" w:tplc="40090003" w:tentative="1">
+      <w:start w:val="1"/>
+      <w:numFmt w:val="bullet"/>
+      <w:lvlText w:val="o"/>
+      <w:lvlJc w:val="left"/>
+      <w:pPr>
+        <w:ind w:left="3960" w:hanging="360"/>
+      </w:pPr>
+      <w:rPr>
+        <w:rFonts w:ascii="Courier New" w:hAnsi="Courier New" w:cs="Courier New" w:hint="default"/>
+      </w:rPr>
+    </w:lvl>
+    <w:lvl w:ilvl="5" w:tplc="40090005" w:tentative="1">
+      <w:start w:val="1"/>
+      <w:numFmt w:val="bullet"/>
+      <w:lvlText w:val=""/>
+      <w:lvlJc w:val="left"/>
+      <w:pPr>
+        <w:ind w:left="4680" w:hanging="360"/>
+      </w:pPr>
+      <w:rPr>
+        <w:rFonts w:ascii="Wingdings" w:hAnsi="Wingdings" w:hint="default"/>
+      </w:rPr>
+    </w:lvl>
+    <w:lvl w:ilvl="6" w:tplc="40090001" w:tentative="1">
+      <w:start w:val="1"/>
+      <w:numFmt w:val="bullet"/>
+      <w:lvlText w:val=""/>
+      <w:lvlJc w:val="left"/>
+      <w:pPr>
+        <w:ind w:left="5400" w:hanging="360"/>
+      </w:pPr>
+      <w:rPr>
+        <w:rFonts w:ascii="Symbol" w:hAnsi="Symbol" w:hint="default"/>
+      </w:rPr>
+    </w:lvl>
+    <w:lvl w:ilvl="7" w:tplc="40090003" w:tentative="1">
+      <w:start w:val="1"/>
+      <w:numFmt w:val="bullet"/>
+      <w:lvlText w:val="o"/>
+      <w:lvlJc w:val="left"/>
+      <w:pPr>
+        <w:ind w:left="6120" w:hanging="360"/>
+      </w:pPr>
+      <w:rPr>
+        <w:rFonts w:ascii="Courier New" w:hAnsi="Courier New" w:cs="Courier New" w:hint="default"/>
+      </w:rPr>
+    </w:lvl>
+    <w:lvl w:ilvl="8" w:tplc="40090005" w:tentative="1">
+      <w:start w:val="1"/>
+      <w:numFmt w:val="bullet"/>
+      <w:lvlText w:val=""/>
+      <w:lvlJc w:val="left"/>
+      <w:pPr>
+        <w:ind w:left="6840" w:hanging="360"/>
+      </w:pPr>
+      <w:rPr>
+        <w:rFonts w:ascii="Wingdings" w:hAnsi="Wingdings" w:hint="default"/>
+      </w:rPr>
+    </w:lvl>
+  </w:abstractNum>
+  <w:abstractNum w:abstractNumId="2">
     <w:nsid w:val="0DEF3EBE"/>
     <w:multiLevelType w:val="hybridMultilevel"/>
     <w:tmpl w:val="5E905956"/>
@@ -6721,7 +8493,7 @@
       </w:rPr>
     </w:lvl>
   </w:abstractNum>
-  <w:abstractNum w:abstractNumId="1">
+  <w:abstractNum w:abstractNumId="3">
     <w:nsid w:val="167E0274"/>
     <w:multiLevelType w:val="hybridMultilevel"/>
     <w:tmpl w:val="B3DC8FA0"/>
@@ -6834,7 +8606,120 @@
       </w:rPr>
     </w:lvl>
   </w:abstractNum>
-  <w:abstractNum w:abstractNumId="2">
+  <w:abstractNum w:abstractNumId="4">
+    <w:nsid w:val="170B4694"/>
+    <w:multiLevelType w:val="hybridMultilevel"/>
+    <w:tmpl w:val="EB76BD5E"/>
+    <w:lvl w:ilvl="0" w:tplc="4009000B">
+      <w:start w:val="1"/>
+      <w:numFmt w:val="bullet"/>
+      <w:lvlText w:val=""/>
+      <w:lvlJc w:val="left"/>
+      <w:pPr>
+        <w:ind w:left="1440" w:hanging="360"/>
+      </w:pPr>
+      <w:rPr>
+        <w:rFonts w:ascii="Wingdings" w:hAnsi="Wingdings" w:hint="default"/>
+      </w:rPr>
+    </w:lvl>
+    <w:lvl w:ilvl="1" w:tplc="40090003" w:tentative="1">
+      <w:start w:val="1"/>
+      <w:numFmt w:val="bullet"/>
+      <w:lvlText w:val="o"/>
+      <w:lvlJc w:val="left"/>
+      <w:pPr>
+        <w:ind w:left="2160" w:hanging="360"/>
+      </w:pPr>
+      <w:rPr>
+        <w:rFonts w:ascii="Courier New" w:hAnsi="Courier New" w:cs="Courier New" w:hint="default"/>
+      </w:rPr>
+    </w:lvl>
+    <w:lvl w:ilvl="2" w:tplc="40090005" w:tentative="1">
+      <w:start w:val="1"/>
+      <w:numFmt w:val="bullet"/>
+      <w:lvlText w:val=""/>
+      <w:lvlJc w:val="left"/>
+      <w:pPr>
+        <w:ind w:left="2880" w:hanging="360"/>
+      </w:pPr>
+      <w:rPr>
+        <w:rFonts w:ascii="Wingdings" w:hAnsi="Wingdings" w:hint="default"/>
+      </w:rPr>
+    </w:lvl>
+    <w:lvl w:ilvl="3" w:tplc="40090001" w:tentative="1">
+      <w:start w:val="1"/>
+      <w:numFmt w:val="bullet"/>
+      <w:lvlText w:val=""/>
+      <w:lvlJc w:val="left"/>
+      <w:pPr>
+        <w:ind w:left="3600" w:hanging="360"/>
+      </w:pPr>
+      <w:rPr>
+        <w:rFonts w:ascii="Symbol" w:hAnsi="Symbol" w:hint="default"/>
+      </w:rPr>
+    </w:lvl>
+    <w:lvl w:ilvl="4" w:tplc="40090003" w:tentative="1">
+      <w:start w:val="1"/>
+      <w:numFmt w:val="bullet"/>
+      <w:lvlText w:val="o"/>
+      <w:lvlJc w:val="left"/>
+      <w:pPr>
+        <w:ind w:left="4320" w:hanging="360"/>
+      </w:pPr>
+      <w:rPr>
+        <w:rFonts w:ascii="Courier New" w:hAnsi="Courier New" w:cs="Courier New" w:hint="default"/>
+      </w:rPr>
+    </w:lvl>
+    <w:lvl w:ilvl="5" w:tplc="40090005" w:tentative="1">
+      <w:start w:val="1"/>
+      <w:numFmt w:val="bullet"/>
+      <w:lvlText w:val=""/>
+      <w:lvlJc w:val="left"/>
+      <w:pPr>
+        <w:ind w:left="5040" w:hanging="360"/>
+      </w:pPr>
+      <w:rPr>
+        <w:rFonts w:ascii="Wingdings" w:hAnsi="Wingdings" w:hint="default"/>
+      </w:rPr>
+    </w:lvl>
+    <w:lvl w:ilvl="6" w:tplc="40090001" w:tentative="1">
+      <w:start w:val="1"/>
+      <w:numFmt w:val="bullet"/>
+      <w:lvlText w:val=""/>
+      <w:lvlJc w:val="left"/>
+      <w:pPr>
+        <w:ind w:left="5760" w:hanging="360"/>
+      </w:pPr>
+      <w:rPr>
+        <w:rFonts w:ascii="Symbol" w:hAnsi="Symbol" w:hint="default"/>
+      </w:rPr>
+    </w:lvl>
+    <w:lvl w:ilvl="7" w:tplc="40090003" w:tentative="1">
+      <w:start w:val="1"/>
+      <w:numFmt w:val="bullet"/>
+      <w:lvlText w:val="o"/>
+      <w:lvlJc w:val="left"/>
+      <w:pPr>
+        <w:ind w:left="6480" w:hanging="360"/>
+      </w:pPr>
+      <w:rPr>
+        <w:rFonts w:ascii="Courier New" w:hAnsi="Courier New" w:cs="Courier New" w:hint="default"/>
+      </w:rPr>
+    </w:lvl>
+    <w:lvl w:ilvl="8" w:tplc="40090005" w:tentative="1">
+      <w:start w:val="1"/>
+      <w:numFmt w:val="bullet"/>
+      <w:lvlText w:val=""/>
+      <w:lvlJc w:val="left"/>
+      <w:pPr>
+        <w:ind w:left="7200" w:hanging="360"/>
+      </w:pPr>
+      <w:rPr>
+        <w:rFonts w:ascii="Wingdings" w:hAnsi="Wingdings" w:hint="default"/>
+      </w:rPr>
+    </w:lvl>
+  </w:abstractNum>
+  <w:abstractNum w:abstractNumId="5">
     <w:nsid w:val="20370625"/>
     <w:multiLevelType w:val="hybridMultilevel"/>
     <w:tmpl w:val="2EBC5604"/>
@@ -6923,7 +8808,7 @@
       </w:pPr>
     </w:lvl>
   </w:abstractNum>
-  <w:abstractNum w:abstractNumId="3">
+  <w:abstractNum w:abstractNumId="6">
     <w:nsid w:val="2A6C1C56"/>
     <w:multiLevelType w:val="hybridMultilevel"/>
     <w:tmpl w:val="99CE2212"/>
@@ -7036,7 +8921,7 @@
       </w:rPr>
     </w:lvl>
   </w:abstractNum>
-  <w:abstractNum w:abstractNumId="4">
+  <w:abstractNum w:abstractNumId="7">
     <w:nsid w:val="2B470739"/>
     <w:multiLevelType w:val="hybridMultilevel"/>
     <w:tmpl w:val="AE7EB0AA"/>
@@ -7149,7 +9034,7 @@
       </w:rPr>
     </w:lvl>
   </w:abstractNum>
-  <w:abstractNum w:abstractNumId="5">
+  <w:abstractNum w:abstractNumId="8">
     <w:nsid w:val="2E0F32D6"/>
     <w:multiLevelType w:val="hybridMultilevel"/>
     <w:tmpl w:val="074E82E0"/>
@@ -7262,7 +9147,7 @@
       </w:rPr>
     </w:lvl>
   </w:abstractNum>
-  <w:abstractNum w:abstractNumId="6">
+  <w:abstractNum w:abstractNumId="9">
     <w:nsid w:val="2E994F8F"/>
     <w:multiLevelType w:val="hybridMultilevel"/>
     <w:tmpl w:val="E0E4485E"/>
@@ -7375,7 +9260,7 @@
       </w:rPr>
     </w:lvl>
   </w:abstractNum>
-  <w:abstractNum w:abstractNumId="7">
+  <w:abstractNum w:abstractNumId="10">
     <w:nsid w:val="2E9D014F"/>
     <w:multiLevelType w:val="hybridMultilevel"/>
     <w:tmpl w:val="77208F34"/>
@@ -7464,7 +9349,7 @@
       </w:pPr>
     </w:lvl>
   </w:abstractNum>
-  <w:abstractNum w:abstractNumId="8">
+  <w:abstractNum w:abstractNumId="11">
     <w:nsid w:val="2EF52400"/>
     <w:multiLevelType w:val="hybridMultilevel"/>
     <w:tmpl w:val="07DA6EEA"/>
@@ -7577,7 +9462,7 @@
       </w:rPr>
     </w:lvl>
   </w:abstractNum>
-  <w:abstractNum w:abstractNumId="9">
+  <w:abstractNum w:abstractNumId="12">
     <w:nsid w:val="30462668"/>
     <w:multiLevelType w:val="hybridMultilevel"/>
     <w:tmpl w:val="3C8657E2"/>
@@ -7690,7 +9575,120 @@
       </w:rPr>
     </w:lvl>
   </w:abstractNum>
-  <w:abstractNum w:abstractNumId="10">
+  <w:abstractNum w:abstractNumId="13">
+    <w:nsid w:val="30F42D95"/>
+    <w:multiLevelType w:val="hybridMultilevel"/>
+    <w:tmpl w:val="48CC4546"/>
+    <w:lvl w:ilvl="0" w:tplc="40090001">
+      <w:start w:val="1"/>
+      <w:numFmt w:val="bullet"/>
+      <w:lvlText w:val=""/>
+      <w:lvlJc w:val="left"/>
+      <w:pPr>
+        <w:ind w:left="720" w:hanging="360"/>
+      </w:pPr>
+      <w:rPr>
+        <w:rFonts w:ascii="Symbol" w:hAnsi="Symbol" w:hint="default"/>
+      </w:rPr>
+    </w:lvl>
+    <w:lvl w:ilvl="1" w:tplc="40090003">
+      <w:start w:val="1"/>
+      <w:numFmt w:val="bullet"/>
+      <w:lvlText w:val="o"/>
+      <w:lvlJc w:val="left"/>
+      <w:pPr>
+        <w:ind w:left="1440" w:hanging="360"/>
+      </w:pPr>
+      <w:rPr>
+        <w:rFonts w:ascii="Courier New" w:hAnsi="Courier New" w:cs="Courier New" w:hint="default"/>
+      </w:rPr>
+    </w:lvl>
+    <w:lvl w:ilvl="2" w:tplc="40090005" w:tentative="1">
+      <w:start w:val="1"/>
+      <w:numFmt w:val="bullet"/>
+      <w:lvlText w:val=""/>
+      <w:lvlJc w:val="left"/>
+      <w:pPr>
+        <w:ind w:left="2160" w:hanging="360"/>
+      </w:pPr>
+      <w:rPr>
+        <w:rFonts w:ascii="Wingdings" w:hAnsi="Wingdings" w:hint="default"/>
+      </w:rPr>
+    </w:lvl>
+    <w:lvl w:ilvl="3" w:tplc="40090001" w:tentative="1">
+      <w:start w:val="1"/>
+      <w:numFmt w:val="bullet"/>
+      <w:lvlText w:val=""/>
+      <w:lvlJc w:val="left"/>
+      <w:pPr>
+        <w:ind w:left="2880" w:hanging="360"/>
+      </w:pPr>
+      <w:rPr>
+        <w:rFonts w:ascii="Symbol" w:hAnsi="Symbol" w:hint="default"/>
+      </w:rPr>
+    </w:lvl>
+    <w:lvl w:ilvl="4" w:tplc="40090003" w:tentative="1">
+      <w:start w:val="1"/>
+      <w:numFmt w:val="bullet"/>
+      <w:lvlText w:val="o"/>
+      <w:lvlJc w:val="left"/>
+      <w:pPr>
+        <w:ind w:left="3600" w:hanging="360"/>
+      </w:pPr>
+      <w:rPr>
+        <w:rFonts w:ascii="Courier New" w:hAnsi="Courier New" w:cs="Courier New" w:hint="default"/>
+      </w:rPr>
+    </w:lvl>
+    <w:lvl w:ilvl="5" w:tplc="40090005" w:tentative="1">
+      <w:start w:val="1"/>
+      <w:numFmt w:val="bullet"/>
+      <w:lvlText w:val=""/>
+      <w:lvlJc w:val="left"/>
+      <w:pPr>
+        <w:ind w:left="4320" w:hanging="360"/>
+      </w:pPr>
+      <w:rPr>
+        <w:rFonts w:ascii="Wingdings" w:hAnsi="Wingdings" w:hint="default"/>
+      </w:rPr>
+    </w:lvl>
+    <w:lvl w:ilvl="6" w:tplc="40090001" w:tentative="1">
+      <w:start w:val="1"/>
+      <w:numFmt w:val="bullet"/>
+      <w:lvlText w:val=""/>
+      <w:lvlJc w:val="left"/>
+      <w:pPr>
+        <w:ind w:left="5040" w:hanging="360"/>
+      </w:pPr>
+      <w:rPr>
+        <w:rFonts w:ascii="Symbol" w:hAnsi="Symbol" w:hint="default"/>
+      </w:rPr>
+    </w:lvl>
+    <w:lvl w:ilvl="7" w:tplc="40090003" w:tentative="1">
+      <w:start w:val="1"/>
+      <w:numFmt w:val="bullet"/>
+      <w:lvlText w:val="o"/>
+      <w:lvlJc w:val="left"/>
+      <w:pPr>
+        <w:ind w:left="5760" w:hanging="360"/>
+      </w:pPr>
+      <w:rPr>
+        <w:rFonts w:ascii="Courier New" w:hAnsi="Courier New" w:cs="Courier New" w:hint="default"/>
+      </w:rPr>
+    </w:lvl>
+    <w:lvl w:ilvl="8" w:tplc="40090005" w:tentative="1">
+      <w:start w:val="1"/>
+      <w:numFmt w:val="bullet"/>
+      <w:lvlText w:val=""/>
+      <w:lvlJc w:val="left"/>
+      <w:pPr>
+        <w:ind w:left="6480" w:hanging="360"/>
+      </w:pPr>
+      <w:rPr>
+        <w:rFonts w:ascii="Wingdings" w:hAnsi="Wingdings" w:hint="default"/>
+      </w:rPr>
+    </w:lvl>
+  </w:abstractNum>
+  <w:abstractNum w:abstractNumId="14">
     <w:nsid w:val="3856787E"/>
     <w:multiLevelType w:val="hybridMultilevel"/>
     <w:tmpl w:val="8998F188"/>
@@ -7803,7 +9801,7 @@
       </w:rPr>
     </w:lvl>
   </w:abstractNum>
-  <w:abstractNum w:abstractNumId="11">
+  <w:abstractNum w:abstractNumId="15">
     <w:nsid w:val="385A04AD"/>
     <w:multiLevelType w:val="hybridMultilevel"/>
     <w:tmpl w:val="3E662334"/>
@@ -7916,7 +9914,7 @@
       </w:rPr>
     </w:lvl>
   </w:abstractNum>
-  <w:abstractNum w:abstractNumId="12">
+  <w:abstractNum w:abstractNumId="16">
     <w:nsid w:val="42626C21"/>
     <w:multiLevelType w:val="hybridMultilevel"/>
     <w:tmpl w:val="5FB28EDA"/>
@@ -8029,7 +10027,7 @@
       </w:rPr>
     </w:lvl>
   </w:abstractNum>
-  <w:abstractNum w:abstractNumId="13">
+  <w:abstractNum w:abstractNumId="17">
     <w:nsid w:val="43AA0F2A"/>
     <w:multiLevelType w:val="multilevel"/>
     <w:tmpl w:val="BDA8594C"/>
@@ -8178,10 +10176,10 @@
       </w:rPr>
     </w:lvl>
   </w:abstractNum>
-  <w:abstractNum w:abstractNumId="14">
+  <w:abstractNum w:abstractNumId="18">
     <w:nsid w:val="462E049F"/>
     <w:multiLevelType w:val="hybridMultilevel"/>
-    <w:tmpl w:val="D8F0FC70"/>
+    <w:tmpl w:val="E5103330"/>
     <w:lvl w:ilvl="0" w:tplc="40090001">
       <w:start w:val="1"/>
       <w:numFmt w:val="bullet"/>
@@ -8291,7 +10289,120 @@
       </w:rPr>
     </w:lvl>
   </w:abstractNum>
-  <w:abstractNum w:abstractNumId="15">
+  <w:abstractNum w:abstractNumId="19">
+    <w:nsid w:val="47AB3B6A"/>
+    <w:multiLevelType w:val="hybridMultilevel"/>
+    <w:tmpl w:val="F6CEEEF0"/>
+    <w:lvl w:ilvl="0" w:tplc="40090001">
+      <w:start w:val="1"/>
+      <w:numFmt w:val="bullet"/>
+      <w:lvlText w:val=""/>
+      <w:lvlJc w:val="left"/>
+      <w:pPr>
+        <w:ind w:left="720" w:hanging="360"/>
+      </w:pPr>
+      <w:rPr>
+        <w:rFonts w:ascii="Symbol" w:hAnsi="Symbol" w:hint="default"/>
+      </w:rPr>
+    </w:lvl>
+    <w:lvl w:ilvl="1" w:tplc="40090003" w:tentative="1">
+      <w:start w:val="1"/>
+      <w:numFmt w:val="bullet"/>
+      <w:lvlText w:val="o"/>
+      <w:lvlJc w:val="left"/>
+      <w:pPr>
+        <w:ind w:left="1440" w:hanging="360"/>
+      </w:pPr>
+      <w:rPr>
+        <w:rFonts w:ascii="Courier New" w:hAnsi="Courier New" w:cs="Courier New" w:hint="default"/>
+      </w:rPr>
+    </w:lvl>
+    <w:lvl w:ilvl="2" w:tplc="40090005" w:tentative="1">
+      <w:start w:val="1"/>
+      <w:numFmt w:val="bullet"/>
+      <w:lvlText w:val=""/>
+      <w:lvlJc w:val="left"/>
+      <w:pPr>
+        <w:ind w:left="2160" w:hanging="360"/>
+      </w:pPr>
+      <w:rPr>
+        <w:rFonts w:ascii="Wingdings" w:hAnsi="Wingdings" w:hint="default"/>
+      </w:rPr>
+    </w:lvl>
+    <w:lvl w:ilvl="3" w:tplc="40090001" w:tentative="1">
+      <w:start w:val="1"/>
+      <w:numFmt w:val="bullet"/>
+      <w:lvlText w:val=""/>
+      <w:lvlJc w:val="left"/>
+      <w:pPr>
+        <w:ind w:left="2880" w:hanging="360"/>
+      </w:pPr>
+      <w:rPr>
+        <w:rFonts w:ascii="Symbol" w:hAnsi="Symbol" w:hint="default"/>
+      </w:rPr>
+    </w:lvl>
+    <w:lvl w:ilvl="4" w:tplc="40090003" w:tentative="1">
+      <w:start w:val="1"/>
+      <w:numFmt w:val="bullet"/>
+      <w:lvlText w:val="o"/>
+      <w:lvlJc w:val="left"/>
+      <w:pPr>
+        <w:ind w:left="3600" w:hanging="360"/>
+      </w:pPr>
+      <w:rPr>
+        <w:rFonts w:ascii="Courier New" w:hAnsi="Courier New" w:cs="Courier New" w:hint="default"/>
+      </w:rPr>
+    </w:lvl>
+    <w:lvl w:ilvl="5" w:tplc="40090005" w:tentative="1">
+      <w:start w:val="1"/>
+      <w:numFmt w:val="bullet"/>
+      <w:lvlText w:val=""/>
+      <w:lvlJc w:val="left"/>
+      <w:pPr>
+        <w:ind w:left="4320" w:hanging="360"/>
+      </w:pPr>
+      <w:rPr>
+        <w:rFonts w:ascii="Wingdings" w:hAnsi="Wingdings" w:hint="default"/>
+      </w:rPr>
+    </w:lvl>
+    <w:lvl w:ilvl="6" w:tplc="40090001" w:tentative="1">
+      <w:start w:val="1"/>
+      <w:numFmt w:val="bullet"/>
+      <w:lvlText w:val=""/>
+      <w:lvlJc w:val="left"/>
+      <w:pPr>
+        <w:ind w:left="5040" w:hanging="360"/>
+      </w:pPr>
+      <w:rPr>
+        <w:rFonts w:ascii="Symbol" w:hAnsi="Symbol" w:hint="default"/>
+      </w:rPr>
+    </w:lvl>
+    <w:lvl w:ilvl="7" w:tplc="40090003" w:tentative="1">
+      <w:start w:val="1"/>
+      <w:numFmt w:val="bullet"/>
+      <w:lvlText w:val="o"/>
+      <w:lvlJc w:val="left"/>
+      <w:pPr>
+        <w:ind w:left="5760" w:hanging="360"/>
+      </w:pPr>
+      <w:rPr>
+        <w:rFonts w:ascii="Courier New" w:hAnsi="Courier New" w:cs="Courier New" w:hint="default"/>
+      </w:rPr>
+    </w:lvl>
+    <w:lvl w:ilvl="8" w:tplc="40090005" w:tentative="1">
+      <w:start w:val="1"/>
+      <w:numFmt w:val="bullet"/>
+      <w:lvlText w:val=""/>
+      <w:lvlJc w:val="left"/>
+      <w:pPr>
+        <w:ind w:left="6480" w:hanging="360"/>
+      </w:pPr>
+      <w:rPr>
+        <w:rFonts w:ascii="Wingdings" w:hAnsi="Wingdings" w:hint="default"/>
+      </w:rPr>
+    </w:lvl>
+  </w:abstractNum>
+  <w:abstractNum w:abstractNumId="20">
     <w:nsid w:val="47AD7EE1"/>
     <w:multiLevelType w:val="hybridMultilevel"/>
     <w:tmpl w:val="0B760894"/>
@@ -8404,7 +10515,7 @@
       </w:rPr>
     </w:lvl>
   </w:abstractNum>
-  <w:abstractNum w:abstractNumId="16">
+  <w:abstractNum w:abstractNumId="21">
     <w:nsid w:val="4D5B5881"/>
     <w:multiLevelType w:val="hybridMultilevel"/>
     <w:tmpl w:val="48508106"/>
@@ -8517,7 +10628,7 @@
       </w:rPr>
     </w:lvl>
   </w:abstractNum>
-  <w:abstractNum w:abstractNumId="17">
+  <w:abstractNum w:abstractNumId="22">
     <w:nsid w:val="4E7F1FE8"/>
     <w:multiLevelType w:val="hybridMultilevel"/>
     <w:tmpl w:val="9C0A97F2"/>
@@ -8630,7 +10741,7 @@
       </w:rPr>
     </w:lvl>
   </w:abstractNum>
-  <w:abstractNum w:abstractNumId="18">
+  <w:abstractNum w:abstractNumId="23">
     <w:nsid w:val="57202E70"/>
     <w:multiLevelType w:val="hybridMultilevel"/>
     <w:tmpl w:val="2188A62A"/>
@@ -8719,7 +10830,120 @@
       </w:pPr>
     </w:lvl>
   </w:abstractNum>
-  <w:abstractNum w:abstractNumId="19">
+  <w:abstractNum w:abstractNumId="24">
+    <w:nsid w:val="593748E1"/>
+    <w:multiLevelType w:val="hybridMultilevel"/>
+    <w:tmpl w:val="95568D8E"/>
+    <w:lvl w:ilvl="0" w:tplc="40090001">
+      <w:start w:val="1"/>
+      <w:numFmt w:val="bullet"/>
+      <w:lvlText w:val=""/>
+      <w:lvlJc w:val="left"/>
+      <w:pPr>
+        <w:ind w:left="1080" w:hanging="360"/>
+      </w:pPr>
+      <w:rPr>
+        <w:rFonts w:ascii="Symbol" w:hAnsi="Symbol" w:hint="default"/>
+      </w:rPr>
+    </w:lvl>
+    <w:lvl w:ilvl="1" w:tplc="40090003" w:tentative="1">
+      <w:start w:val="1"/>
+      <w:numFmt w:val="bullet"/>
+      <w:lvlText w:val="o"/>
+      <w:lvlJc w:val="left"/>
+      <w:pPr>
+        <w:ind w:left="1440" w:hanging="360"/>
+      </w:pPr>
+      <w:rPr>
+        <w:rFonts w:ascii="Courier New" w:hAnsi="Courier New" w:cs="Courier New" w:hint="default"/>
+      </w:rPr>
+    </w:lvl>
+    <w:lvl w:ilvl="2" w:tplc="40090005" w:tentative="1">
+      <w:start w:val="1"/>
+      <w:numFmt w:val="bullet"/>
+      <w:lvlText w:val=""/>
+      <w:lvlJc w:val="left"/>
+      <w:pPr>
+        <w:ind w:left="2160" w:hanging="360"/>
+      </w:pPr>
+      <w:rPr>
+        <w:rFonts w:ascii="Wingdings" w:hAnsi="Wingdings" w:hint="default"/>
+      </w:rPr>
+    </w:lvl>
+    <w:lvl w:ilvl="3" w:tplc="40090001" w:tentative="1">
+      <w:start w:val="1"/>
+      <w:numFmt w:val="bullet"/>
+      <w:lvlText w:val=""/>
+      <w:lvlJc w:val="left"/>
+      <w:pPr>
+        <w:ind w:left="2880" w:hanging="360"/>
+      </w:pPr>
+      <w:rPr>
+        <w:rFonts w:ascii="Symbol" w:hAnsi="Symbol" w:hint="default"/>
+      </w:rPr>
+    </w:lvl>
+    <w:lvl w:ilvl="4" w:tplc="40090003" w:tentative="1">
+      <w:start w:val="1"/>
+      <w:numFmt w:val="bullet"/>
+      <w:lvlText w:val="o"/>
+      <w:lvlJc w:val="left"/>
+      <w:pPr>
+        <w:ind w:left="3600" w:hanging="360"/>
+      </w:pPr>
+      <w:rPr>
+        <w:rFonts w:ascii="Courier New" w:hAnsi="Courier New" w:cs="Courier New" w:hint="default"/>
+      </w:rPr>
+    </w:lvl>
+    <w:lvl w:ilvl="5" w:tplc="40090005" w:tentative="1">
+      <w:start w:val="1"/>
+      <w:numFmt w:val="bullet"/>
+      <w:lvlText w:val=""/>
+      <w:lvlJc w:val="left"/>
+      <w:pPr>
+        <w:ind w:left="4320" w:hanging="360"/>
+      </w:pPr>
+      <w:rPr>
+        <w:rFonts w:ascii="Wingdings" w:hAnsi="Wingdings" w:hint="default"/>
+      </w:rPr>
+    </w:lvl>
+    <w:lvl w:ilvl="6" w:tplc="40090001" w:tentative="1">
+      <w:start w:val="1"/>
+      <w:numFmt w:val="bullet"/>
+      <w:lvlText w:val=""/>
+      <w:lvlJc w:val="left"/>
+      <w:pPr>
+        <w:ind w:left="5040" w:hanging="360"/>
+      </w:pPr>
+      <w:rPr>
+        <w:rFonts w:ascii="Symbol" w:hAnsi="Symbol" w:hint="default"/>
+      </w:rPr>
+    </w:lvl>
+    <w:lvl w:ilvl="7" w:tplc="40090003" w:tentative="1">
+      <w:start w:val="1"/>
+      <w:numFmt w:val="bullet"/>
+      <w:lvlText w:val="o"/>
+      <w:lvlJc w:val="left"/>
+      <w:pPr>
+        <w:ind w:left="5760" w:hanging="360"/>
+      </w:pPr>
+      <w:rPr>
+        <w:rFonts w:ascii="Courier New" w:hAnsi="Courier New" w:cs="Courier New" w:hint="default"/>
+      </w:rPr>
+    </w:lvl>
+    <w:lvl w:ilvl="8" w:tplc="40090005" w:tentative="1">
+      <w:start w:val="1"/>
+      <w:numFmt w:val="bullet"/>
+      <w:lvlText w:val=""/>
+      <w:lvlJc w:val="left"/>
+      <w:pPr>
+        <w:ind w:left="6480" w:hanging="360"/>
+      </w:pPr>
+      <w:rPr>
+        <w:rFonts w:ascii="Wingdings" w:hAnsi="Wingdings" w:hint="default"/>
+      </w:rPr>
+    </w:lvl>
+  </w:abstractNum>
+  <w:abstractNum w:abstractNumId="25">
     <w:nsid w:val="656B7856"/>
     <w:multiLevelType w:val="hybridMultilevel"/>
     <w:tmpl w:val="BB10F704"/>
@@ -8832,7 +11056,7 @@
       </w:rPr>
     </w:lvl>
   </w:abstractNum>
-  <w:abstractNum w:abstractNumId="20">
+  <w:abstractNum w:abstractNumId="26">
     <w:nsid w:val="69BA5AD7"/>
     <w:multiLevelType w:val="hybridMultilevel"/>
     <w:tmpl w:val="48264A2C"/>
@@ -8921,7 +11145,7 @@
       </w:pPr>
     </w:lvl>
   </w:abstractNum>
-  <w:abstractNum w:abstractNumId="21">
+  <w:abstractNum w:abstractNumId="27">
     <w:nsid w:val="6AFC010F"/>
     <w:multiLevelType w:val="hybridMultilevel"/>
     <w:tmpl w:val="BEF0AB2A"/>
@@ -9034,7 +11258,7 @@
       </w:rPr>
     </w:lvl>
   </w:abstractNum>
-  <w:abstractNum w:abstractNumId="22">
+  <w:abstractNum w:abstractNumId="28">
     <w:nsid w:val="6B3817FA"/>
     <w:multiLevelType w:val="hybridMultilevel"/>
     <w:tmpl w:val="2188A62A"/>
@@ -9123,7 +11347,7 @@
       </w:pPr>
     </w:lvl>
   </w:abstractNum>
-  <w:abstractNum w:abstractNumId="23">
+  <w:abstractNum w:abstractNumId="29">
     <w:nsid w:val="70B77958"/>
     <w:multiLevelType w:val="hybridMultilevel"/>
     <w:tmpl w:val="E692F0E4"/>
@@ -9236,7 +11460,7 @@
       </w:rPr>
     </w:lvl>
   </w:abstractNum>
-  <w:abstractNum w:abstractNumId="24">
+  <w:abstractNum w:abstractNumId="30">
     <w:nsid w:val="74B6421B"/>
     <w:multiLevelType w:val="hybridMultilevel"/>
     <w:tmpl w:val="4162CF00"/>
@@ -9325,7 +11549,7 @@
       </w:pPr>
     </w:lvl>
   </w:abstractNum>
-  <w:abstractNum w:abstractNumId="25">
+  <w:abstractNum w:abstractNumId="31">
     <w:nsid w:val="786B6EDC"/>
     <w:multiLevelType w:val="hybridMultilevel"/>
     <w:tmpl w:val="23FA846C"/>
@@ -9439,82 +11663,100 @@
     </w:lvl>
   </w:abstractNum>
   <w:num w:numId="1">
+    <w:abstractNumId w:val="9"/>
+  </w:num>
+  <w:num w:numId="2">
+    <w:abstractNumId w:val="17"/>
+  </w:num>
+  <w:num w:numId="3">
+    <w:abstractNumId w:val="26"/>
+  </w:num>
+  <w:num w:numId="4">
+    <w:abstractNumId w:val="31"/>
+  </w:num>
+  <w:num w:numId="5">
     <w:abstractNumId w:val="6"/>
   </w:num>
-  <w:num w:numId="2">
+  <w:num w:numId="6">
+    <w:abstractNumId w:val="12"/>
+  </w:num>
+  <w:num w:numId="7">
+    <w:abstractNumId w:val="29"/>
+  </w:num>
+  <w:num w:numId="8">
+    <w:abstractNumId w:val="8"/>
+  </w:num>
+  <w:num w:numId="9">
+    <w:abstractNumId w:val="3"/>
+  </w:num>
+  <w:num w:numId="10">
+    <w:abstractNumId w:val="14"/>
+  </w:num>
+  <w:num w:numId="11">
+    <w:abstractNumId w:val="15"/>
+  </w:num>
+  <w:num w:numId="12">
+    <w:abstractNumId w:val="27"/>
+  </w:num>
+  <w:num w:numId="13">
+    <w:abstractNumId w:val="22"/>
+  </w:num>
+  <w:num w:numId="14">
+    <w:abstractNumId w:val="2"/>
+  </w:num>
+  <w:num w:numId="15">
+    <w:abstractNumId w:val="7"/>
+  </w:num>
+  <w:num w:numId="16">
+    <w:abstractNumId w:val="16"/>
+  </w:num>
+  <w:num w:numId="17">
+    <w:abstractNumId w:val="20"/>
+  </w:num>
+  <w:num w:numId="18">
+    <w:abstractNumId w:val="10"/>
+  </w:num>
+  <w:num w:numId="19">
+    <w:abstractNumId w:val="21"/>
+  </w:num>
+  <w:num w:numId="20">
+    <w:abstractNumId w:val="25"/>
+  </w:num>
+  <w:num w:numId="21">
+    <w:abstractNumId w:val="11"/>
+  </w:num>
+  <w:num w:numId="22">
+    <w:abstractNumId w:val="28"/>
+  </w:num>
+  <w:num w:numId="23">
+    <w:abstractNumId w:val="23"/>
+  </w:num>
+  <w:num w:numId="24">
+    <w:abstractNumId w:val="18"/>
+  </w:num>
+  <w:num w:numId="25">
+    <w:abstractNumId w:val="5"/>
+  </w:num>
+  <w:num w:numId="26">
+    <w:abstractNumId w:val="30"/>
+  </w:num>
+  <w:num w:numId="27">
     <w:abstractNumId w:val="13"/>
   </w:num>
-  <w:num w:numId="3">
-    <w:abstractNumId w:val="20"/>
-  </w:num>
-  <w:num w:numId="4">
-    <w:abstractNumId w:val="25"/>
-  </w:num>
-  <w:num w:numId="5">
-    <w:abstractNumId w:val="3"/>
-  </w:num>
-  <w:num w:numId="6">
-    <w:abstractNumId w:val="9"/>
-  </w:num>
-  <w:num w:numId="7">
-    <w:abstractNumId w:val="23"/>
-  </w:num>
-  <w:num w:numId="8">
-    <w:abstractNumId w:val="5"/>
-  </w:num>
-  <w:num w:numId="9">
+  <w:num w:numId="28">
     <w:abstractNumId w:val="1"/>
   </w:num>
-  <w:num w:numId="10">
-    <w:abstractNumId w:val="10"/>
+  <w:num w:numId="29">
+    <w:abstractNumId w:val="24"/>
   </w:num>
-  <w:num w:numId="11">
-    <w:abstractNumId w:val="11"/>
+  <w:num w:numId="30">
+    <w:abstractNumId w:val="19"/>
   </w:num>
-  <w:num w:numId="12">
-    <w:abstractNumId w:val="21"/>
-  </w:num>
-  <w:num w:numId="13">
-    <w:abstractNumId w:val="17"/>
-  </w:num>
-  <w:num w:numId="14">
+  <w:num w:numId="31">
     <w:abstractNumId w:val="0"/>
   </w:num>
-  <w:num w:numId="15">
+  <w:num w:numId="32">
     <w:abstractNumId w:val="4"/>
-  </w:num>
-  <w:num w:numId="16">
-    <w:abstractNumId w:val="12"/>
-  </w:num>
-  <w:num w:numId="17">
-    <w:abstractNumId w:val="15"/>
-  </w:num>
-  <w:num w:numId="18">
-    <w:abstractNumId w:val="7"/>
-  </w:num>
-  <w:num w:numId="19">
-    <w:abstractNumId w:val="16"/>
-  </w:num>
-  <w:num w:numId="20">
-    <w:abstractNumId w:val="19"/>
-  </w:num>
-  <w:num w:numId="21">
-    <w:abstractNumId w:val="8"/>
-  </w:num>
-  <w:num w:numId="22">
-    <w:abstractNumId w:val="22"/>
-  </w:num>
-  <w:num w:numId="23">
-    <w:abstractNumId w:val="18"/>
-  </w:num>
-  <w:num w:numId="24">
-    <w:abstractNumId w:val="14"/>
-  </w:num>
-  <w:num w:numId="25">
-    <w:abstractNumId w:val="2"/>
-  </w:num>
-  <w:num w:numId="26">
-    <w:abstractNumId w:val="24"/>
   </w:num>
 </w:numbering>
 </file>
@@ -10050,6 +12292,28 @@
       <w:spacing w:after="0" w:line="240" w:lineRule="auto"/>
     </w:pPr>
   </w:style>
+  <w:style w:type="character" w:customStyle="1" w:styleId="12">
+    <w:name w:val="ͼ12"/>
+    <w:basedOn w:val="DefaultParagraphFont"/>
+    <w:rsid w:val="00921AA5"/>
+  </w:style>
+  <w:style w:type="paragraph" w:styleId="NormalWeb">
+    <w:name w:val="Normal (Web)"/>
+    <w:basedOn w:val="Normal"/>
+    <w:uiPriority w:val="99"/>
+    <w:semiHidden/>
+    <w:unhideWhenUsed/>
+    <w:rsid w:val="00AB49D4"/>
+    <w:pPr>
+      <w:spacing w:before="100" w:beforeAutospacing="1" w:after="100" w:afterAutospacing="1" w:line="240" w:lineRule="auto"/>
+    </w:pPr>
+    <w:rPr>
+      <w:rFonts w:ascii="Times New Roman" w:eastAsia="Times New Roman" w:hAnsi="Times New Roman" w:cs="Times New Roman"/>
+      <w:sz w:val="24"/>
+      <w:szCs w:val="24"/>
+      <w:lang w:eastAsia="en-IN" w:bidi="ta-IN"/>
+    </w:rPr>
+  </w:style>
 </w:styles>
 </file>
 
@@ -10584,6 +12848,28 @@
       <w:spacing w:after="0" w:line="240" w:lineRule="auto"/>
     </w:pPr>
   </w:style>
+  <w:style w:type="character" w:customStyle="1" w:styleId="12">
+    <w:name w:val="ͼ12"/>
+    <w:basedOn w:val="DefaultParagraphFont"/>
+    <w:rsid w:val="00921AA5"/>
+  </w:style>
+  <w:style w:type="paragraph" w:styleId="NormalWeb">
+    <w:name w:val="Normal (Web)"/>
+    <w:basedOn w:val="Normal"/>
+    <w:uiPriority w:val="99"/>
+    <w:semiHidden/>
+    <w:unhideWhenUsed/>
+    <w:rsid w:val="00AB49D4"/>
+    <w:pPr>
+      <w:spacing w:before="100" w:beforeAutospacing="1" w:after="100" w:afterAutospacing="1" w:line="240" w:lineRule="auto"/>
+    </w:pPr>
+    <w:rPr>
+      <w:rFonts w:ascii="Times New Roman" w:eastAsia="Times New Roman" w:hAnsi="Times New Roman" w:cs="Times New Roman"/>
+      <w:sz w:val="24"/>
+      <w:szCs w:val="24"/>
+      <w:lang w:eastAsia="en-IN" w:bidi="ta-IN"/>
+    </w:rPr>
+  </w:style>
 </w:styles>
 </file>
 
@@ -10877,7 +13163,7 @@
 </file>
 
 <file path=customXml/itemProps1.xml><?xml version="1.0" encoding="utf-8"?>
-<ds:datastoreItem xmlns:ds="http://schemas.openxmlformats.org/officeDocument/2006/customXml" ds:itemID="{CF93FCD1-130F-4D5A-8C0E-72663488BDED}">
+<ds:datastoreItem xmlns:ds="http://schemas.openxmlformats.org/officeDocument/2006/customXml" ds:itemID="{55C190BB-64FF-4E58-AA21-C87EAC94B826}">
   <ds:schemaRefs>
     <ds:schemaRef ds:uri="http://schemas.openxmlformats.org/officeDocument/2006/bibliography"/>
   </ds:schemaRefs>

</xml_diff>

<commit_message>
requirements.txt & document updated
</commit_message>
<xml_diff>
--- a/STB_AUTOMATION_29052026.docx
+++ b/STB_AUTOMATION_29052026.docx
@@ -689,6 +689,10 @@
           <w:ilvl w:val="0"/>
           <w:numId w:val="2"/>
         </w:numPr>
+        <w:tabs>
+          <w:tab w:val="clear" w:pos="720"/>
+          <w:tab w:val="num" w:pos="1080"/>
+        </w:tabs>
         <w:spacing w:before="100" w:beforeAutospacing="1" w:after="100" w:afterAutospacing="1" w:line="240" w:lineRule="auto"/>
         <w:rPr>
           <w:rFonts w:ascii="Times New Roman" w:eastAsia="Times New Roman" w:hAnsi="Times New Roman" w:cs="Times New Roman"/>
@@ -829,7 +833,7 @@
           <w:lang w:eastAsia="en-IN" w:bidi="ta-IN"/>
         </w:rPr>
         <w:drawing>
-          <wp:inline distT="0" distB="0" distL="0" distR="0" wp14:anchorId="24CA756E" wp14:editId="72B1CBB5">
+          <wp:inline distT="0" distB="0" distL="0" distR="0" wp14:anchorId="5025DDE6" wp14:editId="57BE94D9">
             <wp:extent cx="4442801" cy="4566212"/>
             <wp:effectExtent l="0" t="0" r="0" b="0"/>
             <wp:docPr id="3" name="Picture 3"/>
@@ -2473,7 +2477,7 @@
           <w:lang w:eastAsia="en-IN" w:bidi="ta-IN"/>
         </w:rPr>
         <w:drawing>
-          <wp:inline distT="0" distB="0" distL="0" distR="0" wp14:anchorId="7FC25872" wp14:editId="5DC81256">
+          <wp:inline distT="0" distB="0" distL="0" distR="0" wp14:anchorId="45612FEF" wp14:editId="3C78BB44">
             <wp:extent cx="4977487" cy="8040414"/>
             <wp:effectExtent l="0" t="0" r="0" b="0"/>
             <wp:docPr id="5" name="Picture 5"/>
@@ -3800,7 +3804,7 @@
           <w:lang w:eastAsia="en-IN" w:bidi="ta-IN"/>
         </w:rPr>
         <w:drawing>
-          <wp:inline distT="0" distB="0" distL="0" distR="0" wp14:anchorId="48162B45" wp14:editId="1586D78D">
+          <wp:inline distT="0" distB="0" distL="0" distR="0" wp14:anchorId="7EB4F891" wp14:editId="7FB0BCD8">
             <wp:extent cx="5133372" cy="1458410"/>
             <wp:effectExtent l="0" t="0" r="0" b="8890"/>
             <wp:docPr id="4" name="Picture 4"/>
@@ -6869,7 +6873,7 @@
           <w:lang w:eastAsia="en-IN" w:bidi="ta-IN"/>
         </w:rPr>
         <w:drawing>
-          <wp:inline distT="0" distB="0" distL="0" distR="0" wp14:anchorId="3F7B0584" wp14:editId="3259313F">
+          <wp:inline distT="0" distB="0" distL="0" distR="0" wp14:anchorId="3A49B982" wp14:editId="395E80A0">
             <wp:extent cx="5731510" cy="2774516"/>
             <wp:effectExtent l="0" t="0" r="2540" b="6985"/>
             <wp:docPr id="6" name="Picture 6"/>
@@ -7102,7 +7106,7 @@
           <w:lang w:eastAsia="en-IN" w:bidi="ta-IN"/>
         </w:rPr>
         <w:drawing>
-          <wp:inline distT="0" distB="0" distL="0" distR="0" wp14:anchorId="1075503E" wp14:editId="70C9C690">
+          <wp:inline distT="0" distB="0" distL="0" distR="0" wp14:anchorId="79795024" wp14:editId="3E046300">
             <wp:extent cx="5731510" cy="2003579"/>
             <wp:effectExtent l="0" t="0" r="2540" b="0"/>
             <wp:docPr id="7" name="Picture 7"/>
@@ -7622,16 +7626,7 @@
         <w:pStyle w:val="Heading2"/>
       </w:pPr>
       <w:r>
-        <w:t>TIMING</w:t>
-      </w:r>
-      <w:r>
-        <w:t xml:space="preserve"> (</w:t>
-      </w:r>
-      <w:r>
-        <w:t>timing</w:t>
-      </w:r>
-      <w:r>
-        <w:t>.py)</w:t>
+        <w:t>TIMING (timing.py)</w:t>
       </w:r>
     </w:p>
     <w:p>
@@ -7726,13 +7721,7 @@
         <w:t xml:space="preserve">Note: </w:t>
       </w:r>
       <w:r>
-        <w:t xml:space="preserve">This is one of the most important </w:t>
-      </w:r>
-      <w:r>
-        <w:t>method</w:t>
-      </w:r>
-      <w:r>
-        <w:t xml:space="preserve"> in STB testing — operators have strict SLAs on channel change time (typically under 3 seconds).</w:t>
+        <w:t>This is one of the most important method in STB testing — operators have strict SLAs on channel change time (typically under 3 seconds).</w:t>
       </w:r>
     </w:p>
     <w:p>
@@ -7749,13 +7738,7 @@
         </w:numPr>
       </w:pPr>
       <w:r>
-        <w:t xml:space="preserve">This </w:t>
-      </w:r>
-      <w:r>
-        <w:t xml:space="preserve">timing.py </w:t>
-      </w:r>
-      <w:r>
-        <w:t>module contains the multiple methods are created to validate the following testing.</w:t>
+        <w:t>This timing.py module contains the multiple methods are created to validate the following testing.</w:t>
       </w:r>
     </w:p>
     <w:p>
@@ -7767,16 +7750,7 @@
         </w:numPr>
       </w:pPr>
       <w:r>
-        <w:t>Simpl timer</w:t>
-      </w:r>
-      <w:r>
-        <w:t xml:space="preserve"> → </w:t>
-      </w:r>
-      <w:r>
-        <w:t>To capture the run time of test task</w:t>
-      </w:r>
-      <w:r>
-        <w:t xml:space="preserve"> </w:t>
+        <w:t xml:space="preserve">Simpl timer → To capture the run time of test task </w:t>
       </w:r>
     </w:p>
     <w:p>
@@ -7788,13 +7762,7 @@
         </w:numPr>
       </w:pPr>
       <w:r>
-        <w:t>Measure swap time</w:t>
-      </w:r>
-      <w:r>
-        <w:t xml:space="preserve"> → </w:t>
-      </w:r>
-      <w:r>
-        <w:t>To capture the channel up swap time (</w:t>
+        <w:t>Measure swap time → To capture the channel up swap time (</w:t>
       </w:r>
       <w:r>
         <w:rPr>
@@ -7914,13 +7882,7 @@
       </w:pPr>
       <w:r>
         <w:lastRenderedPageBreak/>
-        <w:t>PHASE –5</w:t>
-      </w:r>
-      <w:r>
-        <w:t xml:space="preserve">: </w:t>
-      </w:r>
-      <w:r>
-        <w:t>TEST FRAMEWORK</w:t>
+        <w:t>PHASE –5: TEST FRAMEWORK</w:t>
       </w:r>
     </w:p>
     <w:p>
@@ -7969,10 +7931,7 @@
         <w:t>I</w:t>
       </w:r>
       <w:r>
-        <w:t>t</w:t>
-      </w:r>
-      <w:r>
-        <w:t xml:space="preserve"> is a modular, reusable Python function designed to set up the environment, state, or data dependencies required before a test runs, and clean them up afterward</w:t>
+        <w:t>t is a modular, reusable Python function designed to set up the environment, state, or data dependencies required before a test runs, and clean them up afterward</w:t>
       </w:r>
     </w:p>
     <w:p>
@@ -7997,10 +7956,7 @@
         <w:t>POM:</w:t>
       </w:r>
       <w:r>
-        <w:t xml:space="preserve"> It’s a</w:t>
-      </w:r>
-      <w:r>
-        <w:t xml:space="preserve"> popular design pattern in test automation that creates an object repository for user interface (UI) elements. Under this pattern, </w:t>
+        <w:t xml:space="preserve"> It’s a popular design pattern in test automation that creates an object repository for user interface (UI) elements. Under this pattern, </w:t>
       </w:r>
       <w:r>
         <w:rPr>
@@ -8134,14 +8090,1530 @@
         </w:rPr>
         <w:t>Framework Layer → Page Objects → Keywords/Business Actions → Tests → Project-specific Config/Templates</w:t>
       </w:r>
+    </w:p>
+    <w:p>
+      <w:pPr>
+        <w:pStyle w:val="Heading1"/>
+      </w:pPr>
+      <w:r>
+        <w:t xml:space="preserve">Phase – 6: CLI &amp; GUI Dashboard </w:t>
+      </w:r>
+      <w:r>
+        <w:t>Architecture</w:t>
+      </w:r>
+    </w:p>
+    <w:p/>
+    <w:p>
+      <w:pPr>
+        <w:pStyle w:val="ListParagraph"/>
+        <w:numPr>
+          <w:ilvl w:val="0"/>
+          <w:numId w:val="33"/>
+        </w:numPr>
+      </w:pPr>
+      <w:r>
+        <w:t>Step 1 — Install dependencies</w:t>
+      </w:r>
+    </w:p>
+    <w:p>
+      <w:pPr>
+        <w:pStyle w:val="ListParagraph"/>
+        <w:numPr>
+          <w:ilvl w:val="0"/>
+          <w:numId w:val="33"/>
+        </w:numPr>
+      </w:pPr>
+      <w:r>
+        <w:t>Step 2 — pytest + Allure integration  ← wire Allure into conftest.py</w:t>
+      </w:r>
+    </w:p>
+    <w:p>
+      <w:pPr>
+        <w:pStyle w:val="ListParagraph"/>
+        <w:numPr>
+          <w:ilvl w:val="0"/>
+          <w:numId w:val="33"/>
+        </w:numPr>
+      </w:pPr>
+      <w:r>
+        <w:t>Step 3 — Flask app.py + runner.py     ← backend server</w:t>
+      </w:r>
+    </w:p>
+    <w:p>
+      <w:pPr>
+        <w:pStyle w:val="ListParagraph"/>
+        <w:numPr>
+          <w:ilvl w:val="0"/>
+          <w:numId w:val="33"/>
+        </w:numPr>
+      </w:pPr>
+      <w:r>
+        <w:t>Step 4 — SSE log streaming            ← live logs in browser</w:t>
+      </w:r>
+    </w:p>
+    <w:p>
+      <w:pPr>
+        <w:pStyle w:val="ListParagraph"/>
+        <w:numPr>
+          <w:ilvl w:val="0"/>
+          <w:numId w:val="33"/>
+        </w:numPr>
+      </w:pPr>
+      <w:r>
+        <w:t>Step 5 — MJPEG live preview           ← PiBox frame → browser</w:t>
+      </w:r>
+    </w:p>
+    <w:p>
+      <w:pPr>
+        <w:pStyle w:val="ListParagraph"/>
+        <w:numPr>
+          <w:ilvl w:val="0"/>
+          <w:numId w:val="33"/>
+        </w:numPr>
+      </w:pPr>
+      <w:r>
+        <w:t>Step 6 — dashboard HTML               ← the UI you see above</w:t>
+      </w:r>
+    </w:p>
+    <w:p>
+      <w:pPr>
+        <w:pStyle w:val="ListParagraph"/>
+        <w:numPr>
+          <w:ilvl w:val="0"/>
+          <w:numId w:val="33"/>
+        </w:numPr>
+      </w:pPr>
+      <w:r>
+        <w:t>Step 7 — run_dashboard.bat            ← one-click launch on Windows</w:t>
+      </w:r>
+    </w:p>
+    <w:p>
+      <w:pPr>
+        <w:pStyle w:val="Heading2"/>
+      </w:pPr>
+      <w:r>
+        <w:t>Step 1 — Install dependencies</w:t>
+      </w:r>
+    </w:p>
+    <w:p/>
+    <w:p>
+      <w:pPr>
+        <w:spacing w:before="100" w:beforeAutospacing="1" w:after="100" w:afterAutospacing="1" w:line="240" w:lineRule="auto"/>
+        <w:rPr>
+          <w:rFonts w:ascii="Times New Roman" w:eastAsia="Times New Roman" w:hAnsi="Times New Roman" w:cs="Times New Roman"/>
+          <w:sz w:val="24"/>
+          <w:szCs w:val="24"/>
+          <w:lang w:eastAsia="en-IN" w:bidi="ta-IN"/>
+        </w:rPr>
+      </w:pPr>
+      <w:r>
+        <w:rPr>
+          <w:rFonts w:ascii="Times New Roman" w:eastAsia="Times New Roman" w:hAnsi="Times New Roman" w:cs="Times New Roman"/>
+          <w:sz w:val="24"/>
+          <w:szCs w:val="24"/>
+          <w:lang w:eastAsia="en-IN" w:bidi="ta-IN"/>
+        </w:rPr>
+        <w:t>Run these in your venv:</w:t>
+      </w:r>
+    </w:p>
+    <w:p>
+      <w:pPr>
+        <w:spacing w:after="0" w:line="240" w:lineRule="auto"/>
+        <w:rPr>
+          <w:rFonts w:ascii="Times New Roman" w:eastAsia="Times New Roman" w:hAnsi="Times New Roman" w:cs="Times New Roman"/>
+          <w:sz w:val="24"/>
+          <w:szCs w:val="24"/>
+          <w:lang w:eastAsia="en-IN" w:bidi="ta-IN"/>
+        </w:rPr>
+      </w:pPr>
+      <w:r>
+        <w:rPr>
+          <w:rFonts w:ascii="Times New Roman" w:eastAsia="Times New Roman" w:hAnsi="Times New Roman" w:cs="Times New Roman"/>
+          <w:sz w:val="24"/>
+          <w:szCs w:val="24"/>
+          <w:lang w:eastAsia="en-IN" w:bidi="ta-IN"/>
+        </w:rPr>
+        <w:t>Powershell</w:t>
+      </w:r>
+      <w:r>
+        <w:rPr>
+          <w:rFonts w:ascii="Times New Roman" w:eastAsia="Times New Roman" w:hAnsi="Times New Roman" w:cs="Times New Roman"/>
+          <w:sz w:val="24"/>
+          <w:szCs w:val="24"/>
+          <w:lang w:eastAsia="en-IN" w:bidi="ta-IN"/>
+        </w:rPr>
+        <w:t>:</w:t>
+      </w:r>
+    </w:p>
+    <w:p>
+      <w:pPr>
+        <w:tabs>
+          <w:tab w:val="left" w:pos="916"/>
+          <w:tab w:val="left" w:pos="1832"/>
+          <w:tab w:val="left" w:pos="2748"/>
+          <w:tab w:val="left" w:pos="3664"/>
+          <w:tab w:val="left" w:pos="4580"/>
+          <w:tab w:val="left" w:pos="5496"/>
+          <w:tab w:val="left" w:pos="6412"/>
+          <w:tab w:val="left" w:pos="7328"/>
+          <w:tab w:val="left" w:pos="8244"/>
+          <w:tab w:val="left" w:pos="9160"/>
+          <w:tab w:val="left" w:pos="10076"/>
+          <w:tab w:val="left" w:pos="10992"/>
+          <w:tab w:val="left" w:pos="11908"/>
+          <w:tab w:val="left" w:pos="12824"/>
+          <w:tab w:val="left" w:pos="13740"/>
+          <w:tab w:val="left" w:pos="14656"/>
+        </w:tabs>
+        <w:spacing w:after="0" w:line="240" w:lineRule="auto"/>
+        <w:rPr>
+          <w:rFonts w:ascii="var(--font-mono)" w:eastAsia="Times New Roman" w:hAnsi="var(--font-mono)" w:cs="Courier New"/>
+          <w:color w:val="14181F"/>
+          <w:sz w:val="20"/>
+          <w:szCs w:val="20"/>
+          <w:lang w:eastAsia="en-IN" w:bidi="ta-IN"/>
+        </w:rPr>
+      </w:pPr>
+      <w:r>
+        <w:rPr>
+          <w:rFonts w:ascii="var(--font-mono)" w:eastAsia="Times New Roman" w:hAnsi="var(--font-mono)" w:cs="Courier New"/>
+          <w:color w:val="14181F"/>
+          <w:sz w:val="20"/>
+          <w:szCs w:val="20"/>
+          <w:lang w:eastAsia="en-IN" w:bidi="ta-IN"/>
+        </w:rPr>
+        <w:t>pip install flask flask-cors allure-pytest</w:t>
+      </w:r>
+    </w:p>
+    <w:p>
+      <w:pPr>
+        <w:spacing w:before="100" w:beforeAutospacing="1" w:after="100" w:afterAutospacing="1" w:line="240" w:lineRule="auto"/>
+        <w:rPr>
+          <w:rFonts w:ascii="Times New Roman" w:eastAsia="Times New Roman" w:hAnsi="Times New Roman" w:cs="Times New Roman"/>
+          <w:sz w:val="24"/>
+          <w:szCs w:val="24"/>
+          <w:lang w:eastAsia="en-IN" w:bidi="ta-IN"/>
+        </w:rPr>
+      </w:pPr>
+      <w:r>
+        <w:rPr>
+          <w:rFonts w:ascii="Times New Roman" w:eastAsia="Times New Roman" w:hAnsi="Times New Roman" w:cs="Times New Roman"/>
+          <w:sz w:val="24"/>
+          <w:szCs w:val="24"/>
+          <w:lang w:eastAsia="en-IN" w:bidi="ta-IN"/>
+        </w:rPr>
+        <w:t>Verify:</w:t>
+      </w:r>
+    </w:p>
+    <w:p>
+      <w:pPr>
+        <w:spacing w:after="0" w:line="240" w:lineRule="auto"/>
+        <w:rPr>
+          <w:rFonts w:ascii="Times New Roman" w:eastAsia="Times New Roman" w:hAnsi="Times New Roman" w:cs="Times New Roman"/>
+          <w:sz w:val="24"/>
+          <w:szCs w:val="24"/>
+          <w:lang w:eastAsia="en-IN" w:bidi="ta-IN"/>
+        </w:rPr>
+      </w:pPr>
+      <w:r>
+        <w:rPr>
+          <w:rFonts w:ascii="Times New Roman" w:eastAsia="Times New Roman" w:hAnsi="Times New Roman" w:cs="Times New Roman"/>
+          <w:sz w:val="24"/>
+          <w:szCs w:val="24"/>
+          <w:lang w:eastAsia="en-IN" w:bidi="ta-IN"/>
+        </w:rPr>
+        <w:t>powershell</w:t>
+      </w:r>
+    </w:p>
+    <w:p>
+      <w:pPr>
+        <w:tabs>
+          <w:tab w:val="left" w:pos="916"/>
+          <w:tab w:val="left" w:pos="1832"/>
+          <w:tab w:val="left" w:pos="2748"/>
+          <w:tab w:val="left" w:pos="3664"/>
+          <w:tab w:val="left" w:pos="4580"/>
+          <w:tab w:val="left" w:pos="5496"/>
+          <w:tab w:val="left" w:pos="6412"/>
+          <w:tab w:val="left" w:pos="7328"/>
+          <w:tab w:val="left" w:pos="8244"/>
+          <w:tab w:val="left" w:pos="9160"/>
+          <w:tab w:val="left" w:pos="10076"/>
+          <w:tab w:val="left" w:pos="10992"/>
+          <w:tab w:val="left" w:pos="11908"/>
+          <w:tab w:val="left" w:pos="12824"/>
+          <w:tab w:val="left" w:pos="13740"/>
+          <w:tab w:val="left" w:pos="14656"/>
+        </w:tabs>
+        <w:spacing w:after="0" w:line="240" w:lineRule="auto"/>
+        <w:rPr>
+          <w:rFonts w:ascii="var(--font-mono)" w:eastAsia="Times New Roman" w:hAnsi="var(--font-mono)" w:cs="Courier New"/>
+          <w:color w:val="14181F"/>
+          <w:sz w:val="20"/>
+          <w:szCs w:val="20"/>
+          <w:lang w:eastAsia="en-IN" w:bidi="ta-IN"/>
+        </w:rPr>
+      </w:pPr>
+      <w:r>
+        <w:rPr>
+          <w:rFonts w:ascii="var(--font-mono)" w:eastAsia="Times New Roman" w:hAnsi="var(--font-mono)" w:cs="Courier New"/>
+          <w:color w:val="14181F"/>
+          <w:sz w:val="20"/>
+          <w:szCs w:val="20"/>
+          <w:lang w:eastAsia="en-IN" w:bidi="ta-IN"/>
+        </w:rPr>
+        <w:t>pip show flask allure-pytest</w:t>
+      </w:r>
+    </w:p>
+    <w:p/>
+    <w:p>
+      <w:pPr>
+        <w:pStyle w:val="Heading2"/>
+      </w:pPr>
+      <w:r>
+        <w:lastRenderedPageBreak/>
+        <w:t>Step 2 — Install Allure CLI on Windows</w:t>
+      </w:r>
+    </w:p>
+    <w:p>
+      <w:pPr>
+        <w:pStyle w:val="font-claude-response-body"/>
+      </w:pPr>
+      <w:r>
+        <w:t>Allure CLI is a separate tool (not a pip package) — it generates and opens the HTML report.</w:t>
+      </w:r>
+    </w:p>
+    <w:p>
+      <w:pPr>
+        <w:pStyle w:val="font-claude-response-body"/>
+      </w:pPr>
+      <w:r>
+        <w:rPr>
+          <w:rStyle w:val="Strong"/>
+          <w:rFonts w:eastAsiaTheme="majorEastAsia"/>
+        </w:rPr>
+        <w:t>Option A — via Scoop (recommended, easiest):</w:t>
+      </w:r>
+    </w:p>
+    <w:p>
+      <w:r>
+        <w:t>powershell</w:t>
+      </w:r>
+    </w:p>
+    <w:p>
+      <w:pPr>
+        <w:pStyle w:val="HTMLPreformatted"/>
+        <w:rPr>
+          <w:rStyle w:val="HTMLCode"/>
+          <w:rFonts w:ascii="var(--font-mono)" w:hAnsi="var(--font-mono)"/>
+          <w:color w:val="14181F"/>
+        </w:rPr>
+      </w:pPr>
+      <w:r>
+        <w:rPr>
+          <w:rStyle w:val="HTMLCode"/>
+          <w:rFonts w:ascii="var(--font-mono)" w:hAnsi="var(--font-mono)"/>
+          <w:color w:val="6E7687"/>
+        </w:rPr>
+        <w:t># Install Scoop first if you don't have it</w:t>
+      </w:r>
+    </w:p>
+    <w:p>
+      <w:pPr>
+        <w:pStyle w:val="HTMLPreformatted"/>
+        <w:rPr>
+          <w:rStyle w:val="HTMLCode"/>
+          <w:rFonts w:ascii="var(--font-mono)" w:hAnsi="var(--font-mono)"/>
+          <w:color w:val="14181F"/>
+        </w:rPr>
+      </w:pPr>
+      <w:r>
+        <w:rPr>
+          <w:rStyle w:val="HTMLCode"/>
+          <w:rFonts w:ascii="var(--font-mono)" w:hAnsi="var(--font-mono)"/>
+          <w:color w:val="0051C2"/>
+        </w:rPr>
+        <w:t>Set-ExecutionPolicy</w:t>
+      </w:r>
+      <w:r>
+        <w:rPr>
+          <w:rStyle w:val="HTMLCode"/>
+          <w:rFonts w:ascii="var(--font-mono)" w:hAnsi="var(--font-mono)"/>
+          <w:color w:val="14181F"/>
+        </w:rPr>
+        <w:t xml:space="preserve"> -ExecutionPolicy RemoteSigned -Scope CurrentUser</w:t>
+      </w:r>
+    </w:p>
+    <w:p>
+      <w:pPr>
+        <w:pStyle w:val="HTMLPreformatted"/>
+        <w:rPr>
+          <w:rStyle w:val="HTMLCode"/>
+          <w:rFonts w:ascii="var(--font-mono)" w:hAnsi="var(--font-mono)"/>
+          <w:color w:val="14181F"/>
+        </w:rPr>
+      </w:pPr>
+      <w:r>
+        <w:rPr>
+          <w:rStyle w:val="HTMLCode"/>
+          <w:rFonts w:ascii="var(--font-mono)" w:hAnsi="var(--font-mono)"/>
+          <w:color w:val="14181F"/>
+        </w:rPr>
+        <w:t>irm get.scoop.sh | iex</w:t>
+      </w:r>
+    </w:p>
+    <w:p>
+      <w:pPr>
+        <w:pStyle w:val="HTMLPreformatted"/>
+        <w:rPr>
+          <w:rStyle w:val="HTMLCode"/>
+          <w:rFonts w:ascii="var(--font-mono)" w:hAnsi="var(--font-mono)"/>
+          <w:color w:val="14181F"/>
+        </w:rPr>
+      </w:pPr>
+    </w:p>
+    <w:p>
+      <w:pPr>
+        <w:pStyle w:val="HTMLPreformatted"/>
+        <w:rPr>
+          <w:rStyle w:val="HTMLCode"/>
+          <w:rFonts w:ascii="var(--font-mono)" w:hAnsi="var(--font-mono)"/>
+          <w:color w:val="14181F"/>
+        </w:rPr>
+      </w:pPr>
+      <w:r>
+        <w:rPr>
+          <w:rStyle w:val="HTMLCode"/>
+          <w:rFonts w:ascii="var(--font-mono)" w:hAnsi="var(--font-mono)"/>
+          <w:color w:val="6E7687"/>
+        </w:rPr>
+        <w:t># Then install Allure</w:t>
+      </w:r>
+    </w:p>
+    <w:p>
+      <w:pPr>
+        <w:pStyle w:val="HTMLPreformatted"/>
+        <w:rPr>
+          <w:rFonts w:ascii="var(--font-mono)" w:hAnsi="var(--font-mono)"/>
+          <w:color w:val="14181F"/>
+        </w:rPr>
+      </w:pPr>
+      <w:r>
+        <w:rPr>
+          <w:rStyle w:val="HTMLCode"/>
+          <w:rFonts w:ascii="var(--font-mono)" w:hAnsi="var(--font-mono)"/>
+          <w:color w:val="14181F"/>
+        </w:rPr>
+        <w:t>scoop install allure</w:t>
+      </w:r>
+    </w:p>
+    <w:p>
+      <w:pPr>
+        <w:pStyle w:val="font-claude-response-body"/>
+      </w:pPr>
+      <w:r>
+        <w:rPr>
+          <w:rStyle w:val="Strong"/>
+          <w:rFonts w:eastAsiaTheme="majorEastAsia"/>
+        </w:rPr>
+        <w:t>Option B — via direct download:</w:t>
+      </w:r>
+    </w:p>
+    <w:p>
+      <w:pPr>
+        <w:pStyle w:val="HTMLPreformatted"/>
+        <w:rPr>
+          <w:rFonts w:ascii="var(--font-mono)" w:hAnsi="var(--font-mono)"/>
+          <w:color w:val="14181F"/>
+        </w:rPr>
+      </w:pPr>
+      <w:r>
+        <w:rPr>
+          <w:rStyle w:val="HTMLCode"/>
+          <w:rFonts w:ascii="var(--font-mono)" w:hAnsi="var(--font-mono)"/>
+          <w:color w:val="14181F"/>
+        </w:rPr>
+        <w:t>https://github.com/allure-framework/allure2/releases/latest</w:t>
+      </w:r>
+    </w:p>
+    <w:p>
+      <w:pPr>
+        <w:pStyle w:val="font-claude-response-body"/>
+      </w:pPr>
+      <w:r>
+        <w:t xml:space="preserve">Download </w:t>
+      </w:r>
+      <w:r>
+        <w:rPr>
+          <w:rStyle w:val="HTMLCode"/>
+        </w:rPr>
+        <w:t>allure-2.x.x.zip</w:t>
+      </w:r>
+      <w:r>
+        <w:t xml:space="preserve">, extract to </w:t>
+      </w:r>
+      <w:r>
+        <w:rPr>
+          <w:rStyle w:val="HTMLCode"/>
+        </w:rPr>
+        <w:t>C:\allure\</w:t>
+      </w:r>
+      <w:r>
+        <w:t xml:space="preserve">, then add </w:t>
+      </w:r>
+      <w:r>
+        <w:rPr>
+          <w:rStyle w:val="HTMLCode"/>
+        </w:rPr>
+        <w:t>C:\allure\bin</w:t>
+      </w:r>
+      <w:r>
+        <w:t xml:space="preserve"> to your Windows PATH.</w:t>
+      </w:r>
+    </w:p>
+    <w:p>
+      <w:pPr>
+        <w:pStyle w:val="font-claude-response-body"/>
+      </w:pPr>
+      <w:r>
+        <w:rPr>
+          <w:rStyle w:val="Strong"/>
+          <w:rFonts w:eastAsiaTheme="majorEastAsia"/>
+        </w:rPr>
+        <w:t>Verify Allure CLI:</w:t>
+      </w:r>
+    </w:p>
+    <w:p>
+      <w:r>
+        <w:t>P</w:t>
+      </w:r>
+      <w:r>
+        <w:t>owershell</w:t>
+      </w:r>
+      <w:r>
+        <w:t>:</w:t>
+      </w:r>
+    </w:p>
+    <w:p>
+      <w:pPr>
+        <w:pStyle w:val="HTMLPreformatted"/>
+        <w:rPr>
+          <w:rFonts w:ascii="var(--font-mono)" w:hAnsi="var(--font-mono)"/>
+          <w:color w:val="14181F"/>
+        </w:rPr>
+      </w:pPr>
+      <w:r>
+        <w:rPr>
+          <w:rStyle w:val="HTMLCode"/>
+          <w:rFonts w:ascii="var(--font-mono)" w:hAnsi="var(--font-mono)"/>
+          <w:color w:val="14181F"/>
+        </w:rPr>
+        <w:t>allure --version</w:t>
+      </w:r>
+    </w:p>
+    <w:p/>
+    <w:p>
+      <w:pPr>
+        <w:pStyle w:val="Heading2"/>
+      </w:pPr>
+      <w:r>
+        <w:t>Step 4 — Add</w:t>
+      </w:r>
+      <w:r>
+        <w:t>ed</w:t>
+      </w:r>
+      <w:r>
+        <w:t xml:space="preserve"> Allure decorators to test cases</w:t>
+      </w:r>
+    </w:p>
+    <w:p>
+      <w:pPr>
+        <w:pStyle w:val="ListParagraph"/>
+        <w:numPr>
+          <w:ilvl w:val="0"/>
+          <w:numId w:val="34"/>
+        </w:numPr>
+      </w:pPr>
+      <w:r>
+        <w:t>Check smoke test cases, allure decorators are added.</w:t>
+      </w:r>
+    </w:p>
+    <w:p>
+      <w:pPr>
+        <w:pStyle w:val="ListParagraph"/>
+        <w:numPr>
+          <w:ilvl w:val="0"/>
+          <w:numId w:val="34"/>
+        </w:numPr>
+      </w:pPr>
+      <w:r>
+        <w:t>Allure knows which suite, feature, and</w:t>
+      </w:r>
+      <w:r>
+        <w:t xml:space="preserve"> severity each test belongs </w:t>
+      </w:r>
+      <w:r>
+        <w:t>to.</w:t>
+      </w:r>
+    </w:p>
+    <w:p>
+      <w:pPr>
+        <w:pStyle w:val="Heading2"/>
+      </w:pPr>
+      <w:r>
+        <w:t>Step 5 — Verify Allure works with pytest</w:t>
+      </w:r>
+    </w:p>
+    <w:p>
+      <w:pPr>
+        <w:pStyle w:val="ListParagraph"/>
+        <w:numPr>
+          <w:ilvl w:val="0"/>
+          <w:numId w:val="35"/>
+        </w:numPr>
+      </w:pPr>
+      <w:r>
+        <w:t>Run your smoke suite with Allure:</w:t>
+      </w:r>
+    </w:p>
+    <w:p>
+      <w:pPr>
+        <w:pStyle w:val="ListParagraph"/>
+      </w:pPr>
+      <w:r>
+        <w:t xml:space="preserve"># </w:t>
+      </w:r>
+      <w:r>
+        <w:t>pytest tests\smoke_tests\test_boot_to_live_tv.py -s -v --alluredir=allure-results/</w:t>
+      </w:r>
+    </w:p>
+    <w:p>
+      <w:pPr>
+        <w:pStyle w:val="ListParagraph"/>
+      </w:pPr>
+    </w:p>
+    <w:p>
+      <w:pPr>
+        <w:pStyle w:val="ListParagraph"/>
+        <w:numPr>
+          <w:ilvl w:val="0"/>
+          <w:numId w:val="35"/>
+        </w:numPr>
+      </w:pPr>
+      <w:r>
+        <w:t>Then generate and open the report:</w:t>
+      </w:r>
+    </w:p>
+    <w:p>
+      <w:pPr>
+        <w:pStyle w:val="ListParagraph"/>
+      </w:pPr>
+      <w:r>
+        <w:t xml:space="preserve"># </w:t>
+      </w:r>
+      <w:r>
+        <w:t>allure generate allure-results/ -o allure-report/ --clean allure open allure-report/</w:t>
+      </w:r>
+    </w:p>
+    <w:p>
+      <w:pPr>
+        <w:spacing w:before="100" w:beforeAutospacing="1" w:after="100" w:afterAutospacing="1" w:line="240" w:lineRule="auto"/>
+        <w:ind w:left="360"/>
+        <w:rPr>
+          <w:rFonts w:ascii="Times New Roman" w:eastAsia="Times New Roman" w:hAnsi="Times New Roman" w:cs="Times New Roman"/>
+          <w:sz w:val="24"/>
+          <w:szCs w:val="24"/>
+          <w:lang w:eastAsia="en-IN" w:bidi="ta-IN"/>
+        </w:rPr>
+      </w:pPr>
+      <w:r>
+        <w:rPr>
+          <w:rFonts w:ascii="Times New Roman" w:eastAsia="Times New Roman" w:hAnsi="Times New Roman" w:cs="Times New Roman"/>
+          <w:sz w:val="24"/>
+          <w:szCs w:val="24"/>
+          <w:lang w:eastAsia="en-IN" w:bidi="ta-IN"/>
+        </w:rPr>
+        <w:t>A browser window should open showing your full test report with:</w:t>
+      </w:r>
+    </w:p>
+    <w:p>
+      <w:pPr>
+        <w:numPr>
+          <w:ilvl w:val="0"/>
+          <w:numId w:val="36"/>
+        </w:numPr>
+        <w:tabs>
+          <w:tab w:val="clear" w:pos="720"/>
+          <w:tab w:val="num" w:pos="1080"/>
+        </w:tabs>
+        <w:spacing w:before="100" w:beforeAutospacing="1" w:after="100" w:afterAutospacing="1" w:line="240" w:lineRule="auto"/>
+        <w:ind w:left="1080"/>
+        <w:rPr>
+          <w:rFonts w:ascii="Times New Roman" w:eastAsia="Times New Roman" w:hAnsi="Times New Roman" w:cs="Times New Roman"/>
+          <w:sz w:val="24"/>
+          <w:szCs w:val="24"/>
+          <w:lang w:eastAsia="en-IN" w:bidi="ta-IN"/>
+        </w:rPr>
+      </w:pPr>
+      <w:r>
+        <w:rPr>
+          <w:rFonts w:ascii="Times New Roman" w:eastAsia="Times New Roman" w:hAnsi="Times New Roman" w:cs="Times New Roman"/>
+          <w:sz w:val="24"/>
+          <w:szCs w:val="24"/>
+          <w:lang w:eastAsia="en-IN" w:bidi="ta-IN"/>
+        </w:rPr>
+        <w:t>Pass / fail breakdown</w:t>
+      </w:r>
+    </w:p>
+    <w:p>
+      <w:pPr>
+        <w:numPr>
+          <w:ilvl w:val="0"/>
+          <w:numId w:val="36"/>
+        </w:numPr>
+        <w:spacing w:before="100" w:beforeAutospacing="1" w:after="100" w:afterAutospacing="1" w:line="240" w:lineRule="auto"/>
+        <w:ind w:left="1080"/>
+        <w:rPr>
+          <w:rFonts w:ascii="Times New Roman" w:eastAsia="Times New Roman" w:hAnsi="Times New Roman" w:cs="Times New Roman"/>
+          <w:sz w:val="24"/>
+          <w:szCs w:val="24"/>
+          <w:lang w:eastAsia="en-IN" w:bidi="ta-IN"/>
+        </w:rPr>
+      </w:pPr>
+      <w:r>
+        <w:rPr>
+          <w:rFonts w:ascii="Times New Roman" w:eastAsia="Times New Roman" w:hAnsi="Times New Roman" w:cs="Times New Roman"/>
+          <w:sz w:val="24"/>
+          <w:szCs w:val="24"/>
+          <w:lang w:eastAsia="en-IN" w:bidi="ta-IN"/>
+        </w:rPr>
+        <w:t>Test steps</w:t>
+      </w:r>
+    </w:p>
+    <w:p>
+      <w:pPr>
+        <w:numPr>
+          <w:ilvl w:val="0"/>
+          <w:numId w:val="36"/>
+        </w:numPr>
+        <w:tabs>
+          <w:tab w:val="clear" w:pos="720"/>
+          <w:tab w:val="num" w:pos="1080"/>
+        </w:tabs>
+        <w:spacing w:before="100" w:beforeAutospacing="1" w:after="100" w:afterAutospacing="1" w:line="240" w:lineRule="auto"/>
+        <w:ind w:left="1080"/>
+        <w:rPr>
+          <w:rFonts w:ascii="Times New Roman" w:eastAsia="Times New Roman" w:hAnsi="Times New Roman" w:cs="Times New Roman"/>
+          <w:sz w:val="24"/>
+          <w:szCs w:val="24"/>
+          <w:lang w:eastAsia="en-IN" w:bidi="ta-IN"/>
+        </w:rPr>
+      </w:pPr>
+      <w:r>
+        <w:rPr>
+          <w:rFonts w:ascii="Times New Roman" w:eastAsia="Times New Roman" w:hAnsi="Times New Roman" w:cs="Times New Roman"/>
+          <w:sz w:val="24"/>
+          <w:szCs w:val="24"/>
+          <w:lang w:eastAsia="en-IN" w:bidi="ta-IN"/>
+        </w:rPr>
+        <w:t>Duration per test</w:t>
+      </w:r>
+    </w:p>
+    <w:p>
+      <w:pPr>
+        <w:numPr>
+          <w:ilvl w:val="0"/>
+          <w:numId w:val="36"/>
+        </w:numPr>
+        <w:spacing w:before="100" w:beforeAutospacing="1" w:after="100" w:afterAutospacing="1" w:line="240" w:lineRule="auto"/>
+        <w:ind w:left="1080"/>
+        <w:rPr>
+          <w:rFonts w:ascii="Times New Roman" w:eastAsia="Times New Roman" w:hAnsi="Times New Roman" w:cs="Times New Roman"/>
+          <w:sz w:val="24"/>
+          <w:szCs w:val="24"/>
+          <w:lang w:eastAsia="en-IN" w:bidi="ta-IN"/>
+        </w:rPr>
+      </w:pPr>
+      <w:r>
+        <w:rPr>
+          <w:rFonts w:ascii="Times New Roman" w:eastAsia="Times New Roman" w:hAnsi="Times New Roman" w:cs="Times New Roman"/>
+          <w:sz w:val="24"/>
+          <w:szCs w:val="24"/>
+          <w:lang w:eastAsia="en-IN" w:bidi="ta-IN"/>
+        </w:rPr>
+        <w:t>Screenshots on failures</w:t>
+      </w:r>
+    </w:p>
+    <w:p/>
+    <w:p/>
+    <w:p>
+      <w:pPr>
+        <w:pStyle w:val="Heading2"/>
+      </w:pPr>
+      <w:r>
+        <w:lastRenderedPageBreak/>
+        <w:t>Step 6</w:t>
+      </w:r>
+      <w:r>
+        <w:t xml:space="preserve"> to 9 </w:t>
+      </w:r>
+      <w:r>
+        <w:t xml:space="preserve"> — Create </w:t>
+      </w:r>
+      <w:r>
+        <w:rPr>
+          <w:rStyle w:val="HTMLCode"/>
+          <w:rFonts w:eastAsiaTheme="majorEastAsia"/>
+        </w:rPr>
+        <w:t>dashboard/</w:t>
+      </w:r>
+      <w:r>
+        <w:t xml:space="preserve"> folder structure</w:t>
+      </w:r>
+      <w:r>
+        <w:t>:</w:t>
+      </w:r>
+    </w:p>
+    <w:p>
+      <w:pPr>
+        <w:pStyle w:val="ListParagraph"/>
+        <w:numPr>
+          <w:ilvl w:val="0"/>
+          <w:numId w:val="35"/>
+        </w:numPr>
+      </w:pPr>
+      <w:r>
+        <w:t>Create Directory:</w:t>
+      </w:r>
+    </w:p>
+    <w:p>
+      <w:pPr>
+        <w:pStyle w:val="ListParagraph"/>
+      </w:pPr>
+      <w:r>
+        <w:t xml:space="preserve"># </w:t>
+      </w:r>
+      <w:r>
+        <w:t xml:space="preserve">mkdir dashboard </w:t>
+      </w:r>
+    </w:p>
+    <w:p>
+      <w:pPr>
+        <w:pStyle w:val="ListParagraph"/>
+      </w:pPr>
+      <w:r>
+        <w:t xml:space="preserve"># </w:t>
+      </w:r>
+      <w:r>
+        <w:t>mkdir dashboard\templates</w:t>
+      </w:r>
+    </w:p>
+    <w:p>
+      <w:pPr>
+        <w:spacing w:before="100" w:beforeAutospacing="1" w:after="100" w:afterAutospacing="1" w:line="240" w:lineRule="auto"/>
+        <w:ind w:left="720"/>
+        <w:rPr>
+          <w:rFonts w:ascii="Times New Roman" w:eastAsia="Times New Roman" w:hAnsi="Times New Roman" w:cs="Times New Roman"/>
+          <w:sz w:val="24"/>
+          <w:szCs w:val="24"/>
+          <w:lang w:eastAsia="en-IN" w:bidi="ta-IN"/>
+        </w:rPr>
+      </w:pPr>
+      <w:r>
+        <w:rPr>
+          <w:rFonts w:ascii="Times New Roman" w:eastAsia="Times New Roman" w:hAnsi="Times New Roman" w:cs="Times New Roman"/>
+          <w:sz w:val="24"/>
+          <w:szCs w:val="24"/>
+          <w:lang w:eastAsia="en-IN" w:bidi="ta-IN"/>
+        </w:rPr>
+        <w:t>Your structure will be:</w:t>
+      </w:r>
+    </w:p>
+    <w:p>
+      <w:pPr>
+        <w:tabs>
+          <w:tab w:val="left" w:pos="916"/>
+          <w:tab w:val="left" w:pos="1832"/>
+          <w:tab w:val="left" w:pos="2748"/>
+          <w:tab w:val="left" w:pos="3664"/>
+          <w:tab w:val="left" w:pos="4580"/>
+          <w:tab w:val="left" w:pos="5496"/>
+          <w:tab w:val="left" w:pos="6412"/>
+          <w:tab w:val="left" w:pos="7328"/>
+          <w:tab w:val="left" w:pos="8244"/>
+          <w:tab w:val="left" w:pos="9160"/>
+          <w:tab w:val="left" w:pos="10076"/>
+          <w:tab w:val="left" w:pos="10992"/>
+          <w:tab w:val="left" w:pos="11908"/>
+          <w:tab w:val="left" w:pos="12824"/>
+          <w:tab w:val="left" w:pos="13740"/>
+          <w:tab w:val="left" w:pos="14656"/>
+        </w:tabs>
+        <w:spacing w:after="0" w:line="240" w:lineRule="auto"/>
+        <w:ind w:left="720"/>
+        <w:rPr>
+          <w:rFonts w:ascii="var(--font-mono)" w:eastAsia="Times New Roman" w:hAnsi="var(--font-mono)" w:cs="Courier New"/>
+          <w:color w:val="14181F"/>
+          <w:sz w:val="20"/>
+          <w:szCs w:val="20"/>
+          <w:lang w:eastAsia="en-IN" w:bidi="ta-IN"/>
+        </w:rPr>
+      </w:pPr>
+      <w:r>
+        <w:rPr>
+          <w:rFonts w:ascii="var(--font-mono)" w:eastAsia="Times New Roman" w:hAnsi="var(--font-mono)" w:cs="Courier New"/>
+          <w:color w:val="14181F"/>
+          <w:sz w:val="20"/>
+          <w:szCs w:val="20"/>
+          <w:lang w:eastAsia="en-IN" w:bidi="ta-IN"/>
+        </w:rPr>
+        <w:t>dashboard/</w:t>
+      </w:r>
+    </w:p>
+    <w:p>
+      <w:pPr>
+        <w:tabs>
+          <w:tab w:val="left" w:pos="916"/>
+          <w:tab w:val="left" w:pos="1832"/>
+          <w:tab w:val="left" w:pos="2748"/>
+          <w:tab w:val="left" w:pos="3664"/>
+          <w:tab w:val="left" w:pos="4580"/>
+          <w:tab w:val="left" w:pos="5496"/>
+          <w:tab w:val="left" w:pos="6412"/>
+          <w:tab w:val="left" w:pos="7328"/>
+          <w:tab w:val="left" w:pos="8244"/>
+          <w:tab w:val="left" w:pos="9160"/>
+          <w:tab w:val="left" w:pos="10076"/>
+          <w:tab w:val="left" w:pos="10992"/>
+          <w:tab w:val="left" w:pos="11908"/>
+          <w:tab w:val="left" w:pos="12824"/>
+          <w:tab w:val="left" w:pos="13740"/>
+          <w:tab w:val="left" w:pos="14656"/>
+        </w:tabs>
+        <w:spacing w:after="0" w:line="240" w:lineRule="auto"/>
+        <w:ind w:left="720"/>
+        <w:rPr>
+          <w:rFonts w:ascii="var(--font-mono)" w:eastAsia="Times New Roman" w:hAnsi="var(--font-mono)" w:cs="Courier New"/>
+          <w:color w:val="14181F"/>
+          <w:sz w:val="20"/>
+          <w:szCs w:val="20"/>
+          <w:lang w:eastAsia="en-IN" w:bidi="ta-IN"/>
+        </w:rPr>
+      </w:pPr>
+      <w:r>
+        <w:rPr>
+          <w:rFonts w:ascii="var(--font-mono)" w:eastAsia="Times New Roman" w:hAnsi="var(--font-mono)" w:cs="Courier New"/>
+          <w:color w:val="14181F"/>
+          <w:sz w:val="20"/>
+          <w:szCs w:val="20"/>
+          <w:lang w:eastAsia="en-IN" w:bidi="ta-IN"/>
+        </w:rPr>
+        <w:t>├── app.py</w:t>
+      </w:r>
+      <w:r>
+        <w:rPr>
+          <w:rFonts w:ascii="var(--font-mono)" w:eastAsia="Times New Roman" w:hAnsi="var(--font-mono)" w:cs="Courier New"/>
+          <w:color w:val="14181F"/>
+          <w:sz w:val="20"/>
+          <w:szCs w:val="20"/>
+          <w:lang w:eastAsia="en-IN" w:bidi="ta-IN"/>
+        </w:rPr>
+        <w:t xml:space="preserve"> -------&gt; </w:t>
+      </w:r>
+      <w:r>
+        <w:t>Flask server</w:t>
+      </w:r>
+    </w:p>
+    <w:p>
+      <w:pPr>
+        <w:tabs>
+          <w:tab w:val="left" w:pos="916"/>
+          <w:tab w:val="left" w:pos="1832"/>
+          <w:tab w:val="left" w:pos="2748"/>
+          <w:tab w:val="left" w:pos="3664"/>
+          <w:tab w:val="left" w:pos="4580"/>
+          <w:tab w:val="left" w:pos="5496"/>
+          <w:tab w:val="left" w:pos="6412"/>
+          <w:tab w:val="left" w:pos="7328"/>
+          <w:tab w:val="left" w:pos="8244"/>
+          <w:tab w:val="left" w:pos="9160"/>
+          <w:tab w:val="left" w:pos="10076"/>
+          <w:tab w:val="left" w:pos="10992"/>
+          <w:tab w:val="left" w:pos="11908"/>
+          <w:tab w:val="left" w:pos="12824"/>
+          <w:tab w:val="left" w:pos="13740"/>
+          <w:tab w:val="left" w:pos="14656"/>
+        </w:tabs>
+        <w:spacing w:after="0" w:line="240" w:lineRule="auto"/>
+        <w:ind w:left="720"/>
+        <w:rPr>
+          <w:rFonts w:ascii="var(--font-mono)" w:eastAsia="Times New Roman" w:hAnsi="var(--font-mono)" w:cs="Courier New"/>
+          <w:color w:val="14181F"/>
+          <w:sz w:val="20"/>
+          <w:szCs w:val="20"/>
+          <w:lang w:eastAsia="en-IN" w:bidi="ta-IN"/>
+        </w:rPr>
+      </w:pPr>
+      <w:r>
+        <w:rPr>
+          <w:rFonts w:ascii="var(--font-mono)" w:eastAsia="Times New Roman" w:hAnsi="var(--font-mono)" w:cs="Courier New"/>
+          <w:color w:val="14181F"/>
+          <w:sz w:val="20"/>
+          <w:szCs w:val="20"/>
+          <w:lang w:eastAsia="en-IN" w:bidi="ta-IN"/>
+        </w:rPr>
+        <w:t>├── runner.py</w:t>
+      </w:r>
+      <w:r>
+        <w:rPr>
+          <w:rFonts w:ascii="var(--font-mono)" w:eastAsia="Times New Roman" w:hAnsi="var(--font-mono)" w:cs="Courier New"/>
+          <w:color w:val="14181F"/>
+          <w:sz w:val="20"/>
+          <w:szCs w:val="20"/>
+          <w:lang w:eastAsia="en-IN" w:bidi="ta-IN"/>
+        </w:rPr>
+        <w:t xml:space="preserve"> ----&gt; </w:t>
+      </w:r>
+      <w:r>
+        <w:t>pytest subprocess manager</w:t>
+      </w:r>
+    </w:p>
+    <w:p>
+      <w:pPr>
+        <w:tabs>
+          <w:tab w:val="left" w:pos="916"/>
+          <w:tab w:val="left" w:pos="1832"/>
+          <w:tab w:val="left" w:pos="2748"/>
+          <w:tab w:val="left" w:pos="3664"/>
+          <w:tab w:val="left" w:pos="4580"/>
+          <w:tab w:val="left" w:pos="5496"/>
+          <w:tab w:val="left" w:pos="6412"/>
+          <w:tab w:val="left" w:pos="7328"/>
+          <w:tab w:val="left" w:pos="8244"/>
+          <w:tab w:val="left" w:pos="9160"/>
+          <w:tab w:val="left" w:pos="10076"/>
+          <w:tab w:val="left" w:pos="10992"/>
+          <w:tab w:val="left" w:pos="11908"/>
+          <w:tab w:val="left" w:pos="12824"/>
+          <w:tab w:val="left" w:pos="13740"/>
+          <w:tab w:val="left" w:pos="14656"/>
+        </w:tabs>
+        <w:spacing w:after="0" w:line="240" w:lineRule="auto"/>
+        <w:ind w:left="720"/>
+        <w:rPr>
+          <w:rFonts w:ascii="var(--font-mono)" w:eastAsia="Times New Roman" w:hAnsi="var(--font-mono)" w:cs="Courier New"/>
+          <w:color w:val="14181F"/>
+          <w:sz w:val="20"/>
+          <w:szCs w:val="20"/>
+          <w:lang w:eastAsia="en-IN" w:bidi="ta-IN"/>
+        </w:rPr>
+      </w:pPr>
+      <w:r>
+        <w:rPr>
+          <w:rFonts w:ascii="var(--font-mono)" w:eastAsia="Times New Roman" w:hAnsi="var(--font-mono)" w:cs="Courier New"/>
+          <w:color w:val="14181F"/>
+          <w:sz w:val="20"/>
+          <w:szCs w:val="20"/>
+          <w:lang w:eastAsia="en-IN" w:bidi="ta-IN"/>
+        </w:rPr>
+        <w:t>├── stream.py</w:t>
+      </w:r>
+    </w:p>
+    <w:p>
+      <w:pPr>
+        <w:tabs>
+          <w:tab w:val="left" w:pos="916"/>
+          <w:tab w:val="left" w:pos="1832"/>
+          <w:tab w:val="left" w:pos="2748"/>
+          <w:tab w:val="left" w:pos="3664"/>
+          <w:tab w:val="left" w:pos="4580"/>
+          <w:tab w:val="left" w:pos="5496"/>
+          <w:tab w:val="left" w:pos="6412"/>
+          <w:tab w:val="left" w:pos="7328"/>
+          <w:tab w:val="left" w:pos="8244"/>
+          <w:tab w:val="left" w:pos="9160"/>
+          <w:tab w:val="left" w:pos="10076"/>
+          <w:tab w:val="left" w:pos="10992"/>
+          <w:tab w:val="left" w:pos="11908"/>
+          <w:tab w:val="left" w:pos="12824"/>
+          <w:tab w:val="left" w:pos="13740"/>
+          <w:tab w:val="left" w:pos="14656"/>
+        </w:tabs>
+        <w:spacing w:after="0" w:line="240" w:lineRule="auto"/>
+        <w:ind w:left="720"/>
+        <w:rPr>
+          <w:rFonts w:ascii="var(--font-mono)" w:eastAsia="Times New Roman" w:hAnsi="var(--font-mono)" w:cs="Courier New"/>
+          <w:color w:val="14181F"/>
+          <w:sz w:val="20"/>
+          <w:szCs w:val="20"/>
+          <w:lang w:eastAsia="en-IN" w:bidi="ta-IN"/>
+        </w:rPr>
+      </w:pPr>
+      <w:r>
+        <w:rPr>
+          <w:rFonts w:ascii="var(--font-mono)" w:eastAsia="Times New Roman" w:hAnsi="var(--font-mono)" w:cs="Courier New"/>
+          <w:color w:val="14181F"/>
+          <w:sz w:val="20"/>
+          <w:szCs w:val="20"/>
+          <w:lang w:eastAsia="en-IN" w:bidi="ta-IN"/>
+        </w:rPr>
+        <w:t>└── templates/</w:t>
+      </w:r>
+    </w:p>
+    <w:p>
+      <w:pPr>
+        <w:tabs>
+          <w:tab w:val="left" w:pos="916"/>
+          <w:tab w:val="left" w:pos="1832"/>
+          <w:tab w:val="left" w:pos="2748"/>
+          <w:tab w:val="left" w:pos="3664"/>
+          <w:tab w:val="left" w:pos="4580"/>
+          <w:tab w:val="left" w:pos="5496"/>
+          <w:tab w:val="left" w:pos="6412"/>
+          <w:tab w:val="left" w:pos="7328"/>
+          <w:tab w:val="left" w:pos="8244"/>
+          <w:tab w:val="left" w:pos="9160"/>
+          <w:tab w:val="left" w:pos="10076"/>
+          <w:tab w:val="left" w:pos="10992"/>
+          <w:tab w:val="left" w:pos="11908"/>
+          <w:tab w:val="left" w:pos="12824"/>
+          <w:tab w:val="left" w:pos="13740"/>
+          <w:tab w:val="left" w:pos="14656"/>
+        </w:tabs>
+        <w:spacing w:after="0" w:line="240" w:lineRule="auto"/>
+        <w:ind w:left="720"/>
+        <w:rPr>
+          <w:rFonts w:ascii="var(--font-mono)" w:eastAsia="Times New Roman" w:hAnsi="var(--font-mono)" w:cs="Courier New"/>
+          <w:color w:val="14181F"/>
+          <w:sz w:val="20"/>
+          <w:szCs w:val="20"/>
+          <w:lang w:eastAsia="en-IN" w:bidi="ta-IN"/>
+        </w:rPr>
+      </w:pPr>
+      <w:r>
+        <w:rPr>
+          <w:rFonts w:ascii="var(--font-mono)" w:eastAsia="Times New Roman" w:hAnsi="var(--font-mono)" w:cs="Courier New"/>
+          <w:color w:val="14181F"/>
+          <w:sz w:val="20"/>
+          <w:szCs w:val="20"/>
+          <w:lang w:eastAsia="en-IN" w:bidi="ta-IN"/>
+        </w:rPr>
+        <w:t xml:space="preserve">    └── index.html</w:t>
+      </w:r>
+    </w:p>
+    <w:p/>
+    <w:p>
+      <w:r>
+        <w:t>Note: Refer above directory and their files to understand the code.</w:t>
+      </w:r>
+    </w:p>
+    <w:p>
+      <w:pPr>
+        <w:pStyle w:val="Heading2"/>
+      </w:pPr>
+      <w:r>
+        <w:t xml:space="preserve">Step 10 — </w:t>
+      </w:r>
+      <w:r>
+        <w:rPr>
+          <w:rStyle w:val="HTMLCode"/>
+          <w:rFonts w:eastAsiaTheme="majorEastAsia"/>
+        </w:rPr>
+        <w:t>run_dashboard.bat</w:t>
+      </w:r>
+      <w:r>
+        <w:t xml:space="preserve"> — one-click launch</w:t>
+      </w:r>
+      <w:r>
+        <w:t>:</w:t>
+      </w:r>
+    </w:p>
+    <w:p/>
+    <w:p>
+      <w:pPr>
+        <w:pStyle w:val="Heading2"/>
+      </w:pPr>
+      <w:r>
+        <w:t>Step 11 — Launch and test</w:t>
+      </w:r>
+    </w:p>
+    <w:p>
+      <w:r>
+        <w:t>powershell</w:t>
+      </w:r>
+    </w:p>
+    <w:p>
+      <w:pPr>
+        <w:pStyle w:val="HTMLPreformatted"/>
+        <w:rPr>
+          <w:rStyle w:val="HTMLCode"/>
+          <w:rFonts w:ascii="var(--font-mono)" w:hAnsi="var(--font-mono)"/>
+          <w:color w:val="14181F"/>
+        </w:rPr>
+      </w:pPr>
+      <w:r>
+        <w:rPr>
+          <w:rStyle w:val="HTMLCode"/>
+          <w:rFonts w:ascii="var(--font-mono)" w:hAnsi="var(--font-mono)"/>
+          <w:color w:val="6E7687"/>
+        </w:rPr>
+        <w:t># From project root</w:t>
+      </w:r>
+    </w:p>
+    <w:p>
+      <w:pPr>
+        <w:pStyle w:val="HTMLPreformatted"/>
+        <w:rPr>
+          <w:rFonts w:ascii="var(--font-mono)" w:hAnsi="var(--font-mono)"/>
+          <w:color w:val="14181F"/>
+        </w:rPr>
+      </w:pPr>
+      <w:r>
+        <w:rPr>
+          <w:rStyle w:val="HTMLCode"/>
+          <w:rFonts w:ascii="var(--font-mono)" w:hAnsi="var(--font-mono)"/>
+          <w:color w:val="14181F"/>
+        </w:rPr>
+        <w:t>python -m dashboard.app</w:t>
+      </w:r>
+    </w:p>
+    <w:p>
+      <w:pPr>
+        <w:pStyle w:val="font-claude-response-body"/>
+      </w:pPr>
+      <w:r>
+        <w:t>Open browser:</w:t>
+      </w:r>
+    </w:p>
+    <w:p>
+      <w:pPr>
+        <w:pStyle w:val="HTMLPreformatted"/>
+        <w:rPr>
+          <w:rFonts w:ascii="var(--font-mono)" w:hAnsi="var(--font-mono)"/>
+          <w:color w:val="14181F"/>
+        </w:rPr>
+      </w:pPr>
+      <w:r>
+        <w:rPr>
+          <w:rStyle w:val="HTMLCode"/>
+          <w:rFonts w:ascii="var(--font-mono)" w:hAnsi="var(--font-mono)"/>
+          <w:color w:val="14181F"/>
+        </w:rPr>
+        <w:t>http://127.0.0.1:5000</w:t>
+      </w:r>
+    </w:p>
+    <w:p>
+      <w:pPr>
+        <w:pStyle w:val="font-claude-response-body"/>
+      </w:pPr>
+      <w:r>
+        <w:t>Select customer → select suite → press Run. You should see:</w:t>
+      </w:r>
+    </w:p>
+    <w:p>
+      <w:pPr>
+        <w:numPr>
+          <w:ilvl w:val="0"/>
+          <w:numId w:val="37"/>
+        </w:numPr>
+        <w:spacing w:before="100" w:beforeAutospacing="1" w:after="100" w:afterAutospacing="1" w:line="240" w:lineRule="auto"/>
+      </w:pPr>
+      <w:r>
+        <w:t>Live HDMI feed refreshing every 200ms</w:t>
+      </w:r>
+    </w:p>
+    <w:p>
+      <w:pPr>
+        <w:numPr>
+          <w:ilvl w:val="0"/>
+          <w:numId w:val="37"/>
+        </w:numPr>
+        <w:spacing w:before="100" w:beforeAutospacing="1" w:after="100" w:afterAutospacing="1" w:line="240" w:lineRule="auto"/>
+      </w:pPr>
+      <w:r>
+        <w:t>Log lines streaming in real time</w:t>
+      </w:r>
+    </w:p>
+    <w:p>
+      <w:pPr>
+        <w:numPr>
+          <w:ilvl w:val="0"/>
+          <w:numId w:val="37"/>
+        </w:numPr>
+        <w:spacing w:before="100" w:beforeAutospacing="1" w:after="100" w:afterAutospacing="1" w:line="240" w:lineRule="auto"/>
+      </w:pPr>
+      <w:r>
+        <w:t>Test rows appearing as tests run</w:t>
+      </w:r>
+    </w:p>
+    <w:p>
+      <w:pPr>
+        <w:numPr>
+          <w:ilvl w:val="0"/>
+          <w:numId w:val="37"/>
+        </w:numPr>
+        <w:spacing w:before="100" w:beforeAutospacing="1" w:after="100" w:afterAutospacing="1" w:line="240" w:lineRule="auto"/>
+      </w:pPr>
+      <w:r>
+        <w:t>Stats updating live</w:t>
+      </w:r>
+    </w:p>
+    <w:p>
+      <w:pPr>
+        <w:numPr>
+          <w:ilvl w:val="0"/>
+          <w:numId w:val="37"/>
+        </w:numPr>
+        <w:spacing w:before="100" w:beforeAutospacing="1" w:after="100" w:afterAutospacing="1" w:line="240" w:lineRule="auto"/>
+      </w:pPr>
+      <w:r>
+        <w:t>Allure report opens when run completes</w:t>
+      </w:r>
       <w:bookmarkStart w:id="0" w:name="_GoBack"/>
       <w:bookmarkEnd w:id="0"/>
     </w:p>
     <w:p>
       <w:pPr>
-        <w:ind w:left="360"/>
-      </w:pPr>
-    </w:p>
+        <w:pStyle w:val="Heading4"/>
+      </w:pPr>
+      <w:r>
+        <w:t>Complete Phase 6 flow</w:t>
+      </w:r>
+    </w:p>
+    <w:p>
+      <w:pPr>
+        <w:pStyle w:val="HTMLPreformatted"/>
+        <w:rPr>
+          <w:rStyle w:val="HTMLCode"/>
+          <w:rFonts w:ascii="var(--font-mono)" w:hAnsi="var(--font-mono)"/>
+          <w:color w:val="14181F"/>
+        </w:rPr>
+      </w:pPr>
+      <w:r>
+        <w:rPr>
+          <w:rStyle w:val="HTMLCode"/>
+          <w:rFonts w:ascii="var(--font-mono)" w:hAnsi="var(--font-mono)"/>
+          <w:color w:val="14181F"/>
+        </w:rPr>
+        <w:t>Run button clicked</w:t>
+      </w:r>
+    </w:p>
+    <w:p>
+      <w:pPr>
+        <w:pStyle w:val="HTMLPreformatted"/>
+        <w:rPr>
+          <w:rStyle w:val="HTMLCode"/>
+          <w:rFonts w:ascii="var(--font-mono)" w:hAnsi="var(--font-mono)"/>
+          <w:color w:val="14181F"/>
+        </w:rPr>
+      </w:pPr>
+      <w:r>
+        <w:rPr>
+          <w:rStyle w:val="HTMLCode"/>
+          <w:rFonts w:ascii="var(--font-mono)" w:hAnsi="var(--font-mono)"/>
+          <w:color w:val="14181F"/>
+        </w:rPr>
+        <w:t xml:space="preserve">      ↓</w:t>
+      </w:r>
+    </w:p>
+    <w:p>
+      <w:pPr>
+        <w:pStyle w:val="HTMLPreformatted"/>
+        <w:rPr>
+          <w:rStyle w:val="HTMLCode"/>
+          <w:rFonts w:ascii="var(--font-mono)" w:hAnsi="var(--font-mono)"/>
+          <w:color w:val="14181F"/>
+        </w:rPr>
+      </w:pPr>
+      <w:r>
+        <w:rPr>
+          <w:rStyle w:val="HTMLCode"/>
+          <w:rFonts w:ascii="var(--font-mono)" w:hAnsi="var(--font-mono)"/>
+          <w:color w:val="14181F"/>
+        </w:rPr>
+        <w:t>Flask POST /api/run</w:t>
+      </w:r>
+    </w:p>
+    <w:p>
+      <w:pPr>
+        <w:pStyle w:val="HTMLPreformatted"/>
+        <w:rPr>
+          <w:rStyle w:val="HTMLCode"/>
+          <w:rFonts w:ascii="var(--font-mono)" w:hAnsi="var(--font-mono)"/>
+          <w:color w:val="14181F"/>
+        </w:rPr>
+      </w:pPr>
+      <w:r>
+        <w:rPr>
+          <w:rStyle w:val="HTMLCode"/>
+          <w:rFonts w:ascii="var(--font-mono)" w:hAnsi="var(--font-mono)"/>
+          <w:color w:val="14181F"/>
+        </w:rPr>
+        <w:t xml:space="preserve">      ↓</w:t>
+      </w:r>
+    </w:p>
+    <w:p>
+      <w:pPr>
+        <w:pStyle w:val="HTMLPreformatted"/>
+        <w:rPr>
+          <w:rStyle w:val="HTMLCode"/>
+          <w:rFonts w:ascii="var(--font-mono)" w:hAnsi="var(--font-mono)"/>
+          <w:color w:val="14181F"/>
+        </w:rPr>
+      </w:pPr>
+      <w:r>
+        <w:rPr>
+          <w:rStyle w:val="HTMLCode"/>
+          <w:rFonts w:ascii="var(--font-mono)" w:hAnsi="var(--font-mono)"/>
+          <w:color w:val="14181F"/>
+        </w:rPr>
+        <w:t>runner.py starts pytest subprocess</w:t>
+      </w:r>
+    </w:p>
+    <w:p>
+      <w:pPr>
+        <w:pStyle w:val="HTMLPreformatted"/>
+        <w:rPr>
+          <w:rStyle w:val="HTMLCode"/>
+          <w:rFonts w:ascii="var(--font-mono)" w:hAnsi="var(--font-mono)"/>
+          <w:color w:val="14181F"/>
+        </w:rPr>
+      </w:pPr>
+      <w:r>
+        <w:rPr>
+          <w:rStyle w:val="HTMLCode"/>
+          <w:rFonts w:ascii="var(--font-mono)" w:hAnsi="var(--font-mono)"/>
+          <w:color w:val="14181F"/>
+        </w:rPr>
+        <w:t xml:space="preserve">      ↓</w:t>
+      </w:r>
+    </w:p>
+    <w:p>
+      <w:pPr>
+        <w:pStyle w:val="HTMLPreformatted"/>
+        <w:rPr>
+          <w:rStyle w:val="HTMLCode"/>
+          <w:rFonts w:ascii="var(--font-mono)" w:hAnsi="var(--font-mono)"/>
+          <w:color w:val="14181F"/>
+        </w:rPr>
+      </w:pPr>
+      <w:r>
+        <w:rPr>
+          <w:rStyle w:val="HTMLCode"/>
+          <w:rFonts w:ascii="var(--font-mono)" w:hAnsi="var(--font-mono)"/>
+          <w:color w:val="14181F"/>
+        </w:rPr>
+        <w:t>SSE /api/stream → live logs → browser</w:t>
+      </w:r>
+    </w:p>
+    <w:p>
+      <w:pPr>
+        <w:pStyle w:val="HTMLPreformatted"/>
+        <w:rPr>
+          <w:rStyle w:val="HTMLCode"/>
+          <w:rFonts w:ascii="var(--font-mono)" w:hAnsi="var(--font-mono)"/>
+          <w:color w:val="14181F"/>
+        </w:rPr>
+      </w:pPr>
+      <w:r>
+        <w:rPr>
+          <w:rStyle w:val="HTMLCode"/>
+          <w:rFonts w:ascii="var(--font-mono)" w:hAnsi="var(--font-mono)"/>
+          <w:color w:val="14181F"/>
+        </w:rPr>
+        <w:t xml:space="preserve">      ↓</w:t>
+      </w:r>
+    </w:p>
+    <w:p>
+      <w:pPr>
+        <w:pStyle w:val="HTMLPreformatted"/>
+        <w:rPr>
+          <w:rStyle w:val="HTMLCode"/>
+          <w:rFonts w:ascii="var(--font-mono)" w:hAnsi="var(--font-mono)"/>
+          <w:color w:val="14181F"/>
+        </w:rPr>
+      </w:pPr>
+      <w:r>
+        <w:rPr>
+          <w:rStyle w:val="HTMLCode"/>
+          <w:rFonts w:ascii="var(--font-mono)" w:hAnsi="var(--font-mono)"/>
+          <w:color w:val="14181F"/>
+        </w:rPr>
+        <w:t>/api/frame → MJPEG frames → HDMI preview</w:t>
+      </w:r>
+    </w:p>
+    <w:p>
+      <w:pPr>
+        <w:pStyle w:val="HTMLPreformatted"/>
+        <w:rPr>
+          <w:rStyle w:val="HTMLCode"/>
+          <w:rFonts w:ascii="var(--font-mono)" w:hAnsi="var(--font-mono)"/>
+          <w:color w:val="14181F"/>
+        </w:rPr>
+      </w:pPr>
+      <w:r>
+        <w:rPr>
+          <w:rStyle w:val="HTMLCode"/>
+          <w:rFonts w:ascii="var(--font-mono)" w:hAnsi="var(--font-mono)"/>
+          <w:color w:val="14181F"/>
+        </w:rPr>
+        <w:t xml:space="preserve">      ↓</w:t>
+      </w:r>
+    </w:p>
+    <w:p>
+      <w:pPr>
+        <w:pStyle w:val="HTMLPreformatted"/>
+        <w:rPr>
+          <w:rStyle w:val="HTMLCode"/>
+          <w:rFonts w:ascii="var(--font-mono)" w:hAnsi="var(--font-mono)"/>
+          <w:color w:val="14181F"/>
+        </w:rPr>
+      </w:pPr>
+      <w:r>
+        <w:rPr>
+          <w:rStyle w:val="HTMLCode"/>
+          <w:rFonts w:ascii="var(--font-mono)" w:hAnsi="var(--font-mono)"/>
+          <w:color w:val="14181F"/>
+        </w:rPr>
+        <w:t>pytest finishes → allure generate</w:t>
+      </w:r>
+    </w:p>
+    <w:p>
+      <w:pPr>
+        <w:pStyle w:val="HTMLPreformatted"/>
+        <w:rPr>
+          <w:rStyle w:val="HTMLCode"/>
+          <w:rFonts w:ascii="var(--font-mono)" w:hAnsi="var(--font-mono)"/>
+          <w:color w:val="14181F"/>
+        </w:rPr>
+      </w:pPr>
+      <w:r>
+        <w:rPr>
+          <w:rStyle w:val="HTMLCode"/>
+          <w:rFonts w:ascii="var(--font-mono)" w:hAnsi="var(--font-mono)"/>
+          <w:color w:val="14181F"/>
+        </w:rPr>
+        <w:t xml:space="preserve">      ↓</w:t>
+      </w:r>
+    </w:p>
+    <w:p>
+      <w:pPr>
+        <w:pStyle w:val="HTMLPreformatted"/>
+        <w:rPr>
+          <w:rFonts w:ascii="var(--font-mono)" w:hAnsi="var(--font-mono)"/>
+          <w:color w:val="14181F"/>
+        </w:rPr>
+      </w:pPr>
+      <w:r>
+        <w:rPr>
+          <w:rStyle w:val="HTMLCode"/>
+          <w:rFonts w:ascii="var(--font-mono)" w:hAnsi="var(--font-mono)"/>
+          <w:color w:val="14181F"/>
+        </w:rPr>
+        <w:t>"Open report" → allure open → browser tab</w:t>
+      </w:r>
+    </w:p>
+    <w:p/>
     <w:sectPr>
       <w:pgSz w:w="11906" w:h="16838"/>
       <w:pgMar w:top="1440" w:right="1440" w:bottom="1440" w:left="1440" w:header="708" w:footer="708" w:gutter="0"/>
@@ -8809,6 +10281,232 @@
     </w:lvl>
   </w:abstractNum>
   <w:abstractNum w:abstractNumId="6">
+    <w:nsid w:val="234C5C01"/>
+    <w:multiLevelType w:val="hybridMultilevel"/>
+    <w:tmpl w:val="944EE01E"/>
+    <w:lvl w:ilvl="0" w:tplc="40090001">
+      <w:start w:val="1"/>
+      <w:numFmt w:val="bullet"/>
+      <w:lvlText w:val=""/>
+      <w:lvlJc w:val="left"/>
+      <w:pPr>
+        <w:ind w:left="720" w:hanging="360"/>
+      </w:pPr>
+      <w:rPr>
+        <w:rFonts w:ascii="Symbol" w:hAnsi="Symbol" w:hint="default"/>
+      </w:rPr>
+    </w:lvl>
+    <w:lvl w:ilvl="1" w:tplc="40090003" w:tentative="1">
+      <w:start w:val="1"/>
+      <w:numFmt w:val="bullet"/>
+      <w:lvlText w:val="o"/>
+      <w:lvlJc w:val="left"/>
+      <w:pPr>
+        <w:ind w:left="1440" w:hanging="360"/>
+      </w:pPr>
+      <w:rPr>
+        <w:rFonts w:ascii="Courier New" w:hAnsi="Courier New" w:cs="Courier New" w:hint="default"/>
+      </w:rPr>
+    </w:lvl>
+    <w:lvl w:ilvl="2" w:tplc="40090005" w:tentative="1">
+      <w:start w:val="1"/>
+      <w:numFmt w:val="bullet"/>
+      <w:lvlText w:val=""/>
+      <w:lvlJc w:val="left"/>
+      <w:pPr>
+        <w:ind w:left="2160" w:hanging="360"/>
+      </w:pPr>
+      <w:rPr>
+        <w:rFonts w:ascii="Wingdings" w:hAnsi="Wingdings" w:hint="default"/>
+      </w:rPr>
+    </w:lvl>
+    <w:lvl w:ilvl="3" w:tplc="40090001" w:tentative="1">
+      <w:start w:val="1"/>
+      <w:numFmt w:val="bullet"/>
+      <w:lvlText w:val=""/>
+      <w:lvlJc w:val="left"/>
+      <w:pPr>
+        <w:ind w:left="2880" w:hanging="360"/>
+      </w:pPr>
+      <w:rPr>
+        <w:rFonts w:ascii="Symbol" w:hAnsi="Symbol" w:hint="default"/>
+      </w:rPr>
+    </w:lvl>
+    <w:lvl w:ilvl="4" w:tplc="40090003" w:tentative="1">
+      <w:start w:val="1"/>
+      <w:numFmt w:val="bullet"/>
+      <w:lvlText w:val="o"/>
+      <w:lvlJc w:val="left"/>
+      <w:pPr>
+        <w:ind w:left="3600" w:hanging="360"/>
+      </w:pPr>
+      <w:rPr>
+        <w:rFonts w:ascii="Courier New" w:hAnsi="Courier New" w:cs="Courier New" w:hint="default"/>
+      </w:rPr>
+    </w:lvl>
+    <w:lvl w:ilvl="5" w:tplc="40090005" w:tentative="1">
+      <w:start w:val="1"/>
+      <w:numFmt w:val="bullet"/>
+      <w:lvlText w:val=""/>
+      <w:lvlJc w:val="left"/>
+      <w:pPr>
+        <w:ind w:left="4320" w:hanging="360"/>
+      </w:pPr>
+      <w:rPr>
+        <w:rFonts w:ascii="Wingdings" w:hAnsi="Wingdings" w:hint="default"/>
+      </w:rPr>
+    </w:lvl>
+    <w:lvl w:ilvl="6" w:tplc="40090001" w:tentative="1">
+      <w:start w:val="1"/>
+      <w:numFmt w:val="bullet"/>
+      <w:lvlText w:val=""/>
+      <w:lvlJc w:val="left"/>
+      <w:pPr>
+        <w:ind w:left="5040" w:hanging="360"/>
+      </w:pPr>
+      <w:rPr>
+        <w:rFonts w:ascii="Symbol" w:hAnsi="Symbol" w:hint="default"/>
+      </w:rPr>
+    </w:lvl>
+    <w:lvl w:ilvl="7" w:tplc="40090003" w:tentative="1">
+      <w:start w:val="1"/>
+      <w:numFmt w:val="bullet"/>
+      <w:lvlText w:val="o"/>
+      <w:lvlJc w:val="left"/>
+      <w:pPr>
+        <w:ind w:left="5760" w:hanging="360"/>
+      </w:pPr>
+      <w:rPr>
+        <w:rFonts w:ascii="Courier New" w:hAnsi="Courier New" w:cs="Courier New" w:hint="default"/>
+      </w:rPr>
+    </w:lvl>
+    <w:lvl w:ilvl="8" w:tplc="40090005" w:tentative="1">
+      <w:start w:val="1"/>
+      <w:numFmt w:val="bullet"/>
+      <w:lvlText w:val=""/>
+      <w:lvlJc w:val="left"/>
+      <w:pPr>
+        <w:ind w:left="6480" w:hanging="360"/>
+      </w:pPr>
+      <w:rPr>
+        <w:rFonts w:ascii="Wingdings" w:hAnsi="Wingdings" w:hint="default"/>
+      </w:rPr>
+    </w:lvl>
+  </w:abstractNum>
+  <w:abstractNum w:abstractNumId="7">
+    <w:nsid w:val="27C9788B"/>
+    <w:multiLevelType w:val="hybridMultilevel"/>
+    <w:tmpl w:val="9CA87982"/>
+    <w:lvl w:ilvl="0" w:tplc="40090001">
+      <w:start w:val="1"/>
+      <w:numFmt w:val="bullet"/>
+      <w:lvlText w:val=""/>
+      <w:lvlJc w:val="left"/>
+      <w:pPr>
+        <w:ind w:left="720" w:hanging="360"/>
+      </w:pPr>
+      <w:rPr>
+        <w:rFonts w:ascii="Symbol" w:hAnsi="Symbol" w:hint="default"/>
+      </w:rPr>
+    </w:lvl>
+    <w:lvl w:ilvl="1" w:tplc="40090003" w:tentative="1">
+      <w:start w:val="1"/>
+      <w:numFmt w:val="bullet"/>
+      <w:lvlText w:val="o"/>
+      <w:lvlJc w:val="left"/>
+      <w:pPr>
+        <w:ind w:left="1440" w:hanging="360"/>
+      </w:pPr>
+      <w:rPr>
+        <w:rFonts w:ascii="Courier New" w:hAnsi="Courier New" w:cs="Courier New" w:hint="default"/>
+      </w:rPr>
+    </w:lvl>
+    <w:lvl w:ilvl="2" w:tplc="40090005" w:tentative="1">
+      <w:start w:val="1"/>
+      <w:numFmt w:val="bullet"/>
+      <w:lvlText w:val=""/>
+      <w:lvlJc w:val="left"/>
+      <w:pPr>
+        <w:ind w:left="2160" w:hanging="360"/>
+      </w:pPr>
+      <w:rPr>
+        <w:rFonts w:ascii="Wingdings" w:hAnsi="Wingdings" w:hint="default"/>
+      </w:rPr>
+    </w:lvl>
+    <w:lvl w:ilvl="3" w:tplc="40090001" w:tentative="1">
+      <w:start w:val="1"/>
+      <w:numFmt w:val="bullet"/>
+      <w:lvlText w:val=""/>
+      <w:lvlJc w:val="left"/>
+      <w:pPr>
+        <w:ind w:left="2880" w:hanging="360"/>
+      </w:pPr>
+      <w:rPr>
+        <w:rFonts w:ascii="Symbol" w:hAnsi="Symbol" w:hint="default"/>
+      </w:rPr>
+    </w:lvl>
+    <w:lvl w:ilvl="4" w:tplc="40090003" w:tentative="1">
+      <w:start w:val="1"/>
+      <w:numFmt w:val="bullet"/>
+      <w:lvlText w:val="o"/>
+      <w:lvlJc w:val="left"/>
+      <w:pPr>
+        <w:ind w:left="3600" w:hanging="360"/>
+      </w:pPr>
+      <w:rPr>
+        <w:rFonts w:ascii="Courier New" w:hAnsi="Courier New" w:cs="Courier New" w:hint="default"/>
+      </w:rPr>
+    </w:lvl>
+    <w:lvl w:ilvl="5" w:tplc="40090005" w:tentative="1">
+      <w:start w:val="1"/>
+      <w:numFmt w:val="bullet"/>
+      <w:lvlText w:val=""/>
+      <w:lvlJc w:val="left"/>
+      <w:pPr>
+        <w:ind w:left="4320" w:hanging="360"/>
+      </w:pPr>
+      <w:rPr>
+        <w:rFonts w:ascii="Wingdings" w:hAnsi="Wingdings" w:hint="default"/>
+      </w:rPr>
+    </w:lvl>
+    <w:lvl w:ilvl="6" w:tplc="40090001" w:tentative="1">
+      <w:start w:val="1"/>
+      <w:numFmt w:val="bullet"/>
+      <w:lvlText w:val=""/>
+      <w:lvlJc w:val="left"/>
+      <w:pPr>
+        <w:ind w:left="5040" w:hanging="360"/>
+      </w:pPr>
+      <w:rPr>
+        <w:rFonts w:ascii="Symbol" w:hAnsi="Symbol" w:hint="default"/>
+      </w:rPr>
+    </w:lvl>
+    <w:lvl w:ilvl="7" w:tplc="40090003" w:tentative="1">
+      <w:start w:val="1"/>
+      <w:numFmt w:val="bullet"/>
+      <w:lvlText w:val="o"/>
+      <w:lvlJc w:val="left"/>
+      <w:pPr>
+        <w:ind w:left="5760" w:hanging="360"/>
+      </w:pPr>
+      <w:rPr>
+        <w:rFonts w:ascii="Courier New" w:hAnsi="Courier New" w:cs="Courier New" w:hint="default"/>
+      </w:rPr>
+    </w:lvl>
+    <w:lvl w:ilvl="8" w:tplc="40090005" w:tentative="1">
+      <w:start w:val="1"/>
+      <w:numFmt w:val="bullet"/>
+      <w:lvlText w:val=""/>
+      <w:lvlJc w:val="left"/>
+      <w:pPr>
+        <w:ind w:left="6480" w:hanging="360"/>
+      </w:pPr>
+      <w:rPr>
+        <w:rFonts w:ascii="Wingdings" w:hAnsi="Wingdings" w:hint="default"/>
+      </w:rPr>
+    </w:lvl>
+  </w:abstractNum>
+  <w:abstractNum w:abstractNumId="8">
     <w:nsid w:val="2A6C1C56"/>
     <w:multiLevelType w:val="hybridMultilevel"/>
     <w:tmpl w:val="99CE2212"/>
@@ -8921,7 +10619,7 @@
       </w:rPr>
     </w:lvl>
   </w:abstractNum>
-  <w:abstractNum w:abstractNumId="7">
+  <w:abstractNum w:abstractNumId="9">
     <w:nsid w:val="2B470739"/>
     <w:multiLevelType w:val="hybridMultilevel"/>
     <w:tmpl w:val="AE7EB0AA"/>
@@ -9034,7 +10732,7 @@
       </w:rPr>
     </w:lvl>
   </w:abstractNum>
-  <w:abstractNum w:abstractNumId="8">
+  <w:abstractNum w:abstractNumId="10">
     <w:nsid w:val="2E0F32D6"/>
     <w:multiLevelType w:val="hybridMultilevel"/>
     <w:tmpl w:val="074E82E0"/>
@@ -9147,7 +10845,7 @@
       </w:rPr>
     </w:lvl>
   </w:abstractNum>
-  <w:abstractNum w:abstractNumId="9">
+  <w:abstractNum w:abstractNumId="11">
     <w:nsid w:val="2E994F8F"/>
     <w:multiLevelType w:val="hybridMultilevel"/>
     <w:tmpl w:val="E0E4485E"/>
@@ -9260,7 +10958,7 @@
       </w:rPr>
     </w:lvl>
   </w:abstractNum>
-  <w:abstractNum w:abstractNumId="10">
+  <w:abstractNum w:abstractNumId="12">
     <w:nsid w:val="2E9D014F"/>
     <w:multiLevelType w:val="hybridMultilevel"/>
     <w:tmpl w:val="77208F34"/>
@@ -9349,7 +11047,7 @@
       </w:pPr>
     </w:lvl>
   </w:abstractNum>
-  <w:abstractNum w:abstractNumId="11">
+  <w:abstractNum w:abstractNumId="13">
     <w:nsid w:val="2EF52400"/>
     <w:multiLevelType w:val="hybridMultilevel"/>
     <w:tmpl w:val="07DA6EEA"/>
@@ -9462,7 +11160,7 @@
       </w:rPr>
     </w:lvl>
   </w:abstractNum>
-  <w:abstractNum w:abstractNumId="12">
+  <w:abstractNum w:abstractNumId="14">
     <w:nsid w:val="30462668"/>
     <w:multiLevelType w:val="hybridMultilevel"/>
     <w:tmpl w:val="3C8657E2"/>
@@ -9575,7 +11273,7 @@
       </w:rPr>
     </w:lvl>
   </w:abstractNum>
-  <w:abstractNum w:abstractNumId="13">
+  <w:abstractNum w:abstractNumId="15">
     <w:nsid w:val="30F42D95"/>
     <w:multiLevelType w:val="hybridMultilevel"/>
     <w:tmpl w:val="48CC4546"/>
@@ -9688,7 +11386,7 @@
       </w:rPr>
     </w:lvl>
   </w:abstractNum>
-  <w:abstractNum w:abstractNumId="14">
+  <w:abstractNum w:abstractNumId="16">
     <w:nsid w:val="3856787E"/>
     <w:multiLevelType w:val="hybridMultilevel"/>
     <w:tmpl w:val="8998F188"/>
@@ -9801,7 +11499,7 @@
       </w:rPr>
     </w:lvl>
   </w:abstractNum>
-  <w:abstractNum w:abstractNumId="15">
+  <w:abstractNum w:abstractNumId="17">
     <w:nsid w:val="385A04AD"/>
     <w:multiLevelType w:val="hybridMultilevel"/>
     <w:tmpl w:val="3E662334"/>
@@ -9914,7 +11612,120 @@
       </w:rPr>
     </w:lvl>
   </w:abstractNum>
-  <w:abstractNum w:abstractNumId="16">
+  <w:abstractNum w:abstractNumId="18">
+    <w:nsid w:val="38CF1E30"/>
+    <w:multiLevelType w:val="hybridMultilevel"/>
+    <w:tmpl w:val="44468BC8"/>
+    <w:lvl w:ilvl="0" w:tplc="40090001">
+      <w:start w:val="1"/>
+      <w:numFmt w:val="bullet"/>
+      <w:lvlText w:val=""/>
+      <w:lvlJc w:val="left"/>
+      <w:pPr>
+        <w:ind w:left="720" w:hanging="360"/>
+      </w:pPr>
+      <w:rPr>
+        <w:rFonts w:ascii="Symbol" w:hAnsi="Symbol" w:hint="default"/>
+      </w:rPr>
+    </w:lvl>
+    <w:lvl w:ilvl="1" w:tplc="40090003" w:tentative="1">
+      <w:start w:val="1"/>
+      <w:numFmt w:val="bullet"/>
+      <w:lvlText w:val="o"/>
+      <w:lvlJc w:val="left"/>
+      <w:pPr>
+        <w:ind w:left="1440" w:hanging="360"/>
+      </w:pPr>
+      <w:rPr>
+        <w:rFonts w:ascii="Courier New" w:hAnsi="Courier New" w:cs="Courier New" w:hint="default"/>
+      </w:rPr>
+    </w:lvl>
+    <w:lvl w:ilvl="2" w:tplc="40090005" w:tentative="1">
+      <w:start w:val="1"/>
+      <w:numFmt w:val="bullet"/>
+      <w:lvlText w:val=""/>
+      <w:lvlJc w:val="left"/>
+      <w:pPr>
+        <w:ind w:left="2160" w:hanging="360"/>
+      </w:pPr>
+      <w:rPr>
+        <w:rFonts w:ascii="Wingdings" w:hAnsi="Wingdings" w:hint="default"/>
+      </w:rPr>
+    </w:lvl>
+    <w:lvl w:ilvl="3" w:tplc="40090001" w:tentative="1">
+      <w:start w:val="1"/>
+      <w:numFmt w:val="bullet"/>
+      <w:lvlText w:val=""/>
+      <w:lvlJc w:val="left"/>
+      <w:pPr>
+        <w:ind w:left="2880" w:hanging="360"/>
+      </w:pPr>
+      <w:rPr>
+        <w:rFonts w:ascii="Symbol" w:hAnsi="Symbol" w:hint="default"/>
+      </w:rPr>
+    </w:lvl>
+    <w:lvl w:ilvl="4" w:tplc="40090003" w:tentative="1">
+      <w:start w:val="1"/>
+      <w:numFmt w:val="bullet"/>
+      <w:lvlText w:val="o"/>
+      <w:lvlJc w:val="left"/>
+      <w:pPr>
+        <w:ind w:left="3600" w:hanging="360"/>
+      </w:pPr>
+      <w:rPr>
+        <w:rFonts w:ascii="Courier New" w:hAnsi="Courier New" w:cs="Courier New" w:hint="default"/>
+      </w:rPr>
+    </w:lvl>
+    <w:lvl w:ilvl="5" w:tplc="40090005" w:tentative="1">
+      <w:start w:val="1"/>
+      <w:numFmt w:val="bullet"/>
+      <w:lvlText w:val=""/>
+      <w:lvlJc w:val="left"/>
+      <w:pPr>
+        <w:ind w:left="4320" w:hanging="360"/>
+      </w:pPr>
+      <w:rPr>
+        <w:rFonts w:ascii="Wingdings" w:hAnsi="Wingdings" w:hint="default"/>
+      </w:rPr>
+    </w:lvl>
+    <w:lvl w:ilvl="6" w:tplc="40090001" w:tentative="1">
+      <w:start w:val="1"/>
+      <w:numFmt w:val="bullet"/>
+      <w:lvlText w:val=""/>
+      <w:lvlJc w:val="left"/>
+      <w:pPr>
+        <w:ind w:left="5040" w:hanging="360"/>
+      </w:pPr>
+      <w:rPr>
+        <w:rFonts w:ascii="Symbol" w:hAnsi="Symbol" w:hint="default"/>
+      </w:rPr>
+    </w:lvl>
+    <w:lvl w:ilvl="7" w:tplc="40090003" w:tentative="1">
+      <w:start w:val="1"/>
+      <w:numFmt w:val="bullet"/>
+      <w:lvlText w:val="o"/>
+      <w:lvlJc w:val="left"/>
+      <w:pPr>
+        <w:ind w:left="5760" w:hanging="360"/>
+      </w:pPr>
+      <w:rPr>
+        <w:rFonts w:ascii="Courier New" w:hAnsi="Courier New" w:cs="Courier New" w:hint="default"/>
+      </w:rPr>
+    </w:lvl>
+    <w:lvl w:ilvl="8" w:tplc="40090005" w:tentative="1">
+      <w:start w:val="1"/>
+      <w:numFmt w:val="bullet"/>
+      <w:lvlText w:val=""/>
+      <w:lvlJc w:val="left"/>
+      <w:pPr>
+        <w:ind w:left="6480" w:hanging="360"/>
+      </w:pPr>
+      <w:rPr>
+        <w:rFonts w:ascii="Wingdings" w:hAnsi="Wingdings" w:hint="default"/>
+      </w:rPr>
+    </w:lvl>
+  </w:abstractNum>
+  <w:abstractNum w:abstractNumId="19">
     <w:nsid w:val="42626C21"/>
     <w:multiLevelType w:val="hybridMultilevel"/>
     <w:tmpl w:val="5FB28EDA"/>
@@ -10027,7 +11838,7 @@
       </w:rPr>
     </w:lvl>
   </w:abstractNum>
-  <w:abstractNum w:abstractNumId="17">
+  <w:abstractNum w:abstractNumId="20">
     <w:nsid w:val="43AA0F2A"/>
     <w:multiLevelType w:val="multilevel"/>
     <w:tmpl w:val="BDA8594C"/>
@@ -10176,7 +11987,7 @@
       </w:rPr>
     </w:lvl>
   </w:abstractNum>
-  <w:abstractNum w:abstractNumId="18">
+  <w:abstractNum w:abstractNumId="21">
     <w:nsid w:val="462E049F"/>
     <w:multiLevelType w:val="hybridMultilevel"/>
     <w:tmpl w:val="E5103330"/>
@@ -10289,7 +12100,7 @@
       </w:rPr>
     </w:lvl>
   </w:abstractNum>
-  <w:abstractNum w:abstractNumId="19">
+  <w:abstractNum w:abstractNumId="22">
     <w:nsid w:val="47AB3B6A"/>
     <w:multiLevelType w:val="hybridMultilevel"/>
     <w:tmpl w:val="F6CEEEF0"/>
@@ -10402,7 +12213,7 @@
       </w:rPr>
     </w:lvl>
   </w:abstractNum>
-  <w:abstractNum w:abstractNumId="20">
+  <w:abstractNum w:abstractNumId="23">
     <w:nsid w:val="47AD7EE1"/>
     <w:multiLevelType w:val="hybridMultilevel"/>
     <w:tmpl w:val="0B760894"/>
@@ -10515,7 +12326,7 @@
       </w:rPr>
     </w:lvl>
   </w:abstractNum>
-  <w:abstractNum w:abstractNumId="21">
+  <w:abstractNum w:abstractNumId="24">
     <w:nsid w:val="4D5B5881"/>
     <w:multiLevelType w:val="hybridMultilevel"/>
     <w:tmpl w:val="48508106"/>
@@ -10628,7 +12439,7 @@
       </w:rPr>
     </w:lvl>
   </w:abstractNum>
-  <w:abstractNum w:abstractNumId="22">
+  <w:abstractNum w:abstractNumId="25">
     <w:nsid w:val="4E7F1FE8"/>
     <w:multiLevelType w:val="hybridMultilevel"/>
     <w:tmpl w:val="9C0A97F2"/>
@@ -10741,7 +12552,7 @@
       </w:rPr>
     </w:lvl>
   </w:abstractNum>
-  <w:abstractNum w:abstractNumId="23">
+  <w:abstractNum w:abstractNumId="26">
     <w:nsid w:val="57202E70"/>
     <w:multiLevelType w:val="hybridMultilevel"/>
     <w:tmpl w:val="2188A62A"/>
@@ -10830,7 +12641,7 @@
       </w:pPr>
     </w:lvl>
   </w:abstractNum>
-  <w:abstractNum w:abstractNumId="24">
+  <w:abstractNum w:abstractNumId="27">
     <w:nsid w:val="593748E1"/>
     <w:multiLevelType w:val="hybridMultilevel"/>
     <w:tmpl w:val="95568D8E"/>
@@ -10943,7 +12754,156 @@
       </w:rPr>
     </w:lvl>
   </w:abstractNum>
-  <w:abstractNum w:abstractNumId="25">
+  <w:abstractNum w:abstractNumId="28">
+    <w:nsid w:val="5F870230"/>
+    <w:multiLevelType w:val="multilevel"/>
+    <w:tmpl w:val="4328E5A2"/>
+    <w:lvl w:ilvl="0">
+      <w:start w:val="1"/>
+      <w:numFmt w:val="bullet"/>
+      <w:lvlText w:val=""/>
+      <w:lvlJc w:val="left"/>
+      <w:pPr>
+        <w:tabs>
+          <w:tab w:val="num" w:pos="720"/>
+        </w:tabs>
+        <w:ind w:left="720" w:hanging="360"/>
+      </w:pPr>
+      <w:rPr>
+        <w:rFonts w:ascii="Symbol" w:hAnsi="Symbol" w:hint="default"/>
+        <w:sz w:val="20"/>
+      </w:rPr>
+    </w:lvl>
+    <w:lvl w:ilvl="1" w:tentative="1">
+      <w:start w:val="1"/>
+      <w:numFmt w:val="bullet"/>
+      <w:lvlText w:val="o"/>
+      <w:lvlJc w:val="left"/>
+      <w:pPr>
+        <w:tabs>
+          <w:tab w:val="num" w:pos="1440"/>
+        </w:tabs>
+        <w:ind w:left="1440" w:hanging="360"/>
+      </w:pPr>
+      <w:rPr>
+        <w:rFonts w:ascii="Courier New" w:hAnsi="Courier New" w:hint="default"/>
+        <w:sz w:val="20"/>
+      </w:rPr>
+    </w:lvl>
+    <w:lvl w:ilvl="2" w:tentative="1">
+      <w:start w:val="1"/>
+      <w:numFmt w:val="bullet"/>
+      <w:lvlText w:val=""/>
+      <w:lvlJc w:val="left"/>
+      <w:pPr>
+        <w:tabs>
+          <w:tab w:val="num" w:pos="2160"/>
+        </w:tabs>
+        <w:ind w:left="2160" w:hanging="360"/>
+      </w:pPr>
+      <w:rPr>
+        <w:rFonts w:ascii="Wingdings" w:hAnsi="Wingdings" w:hint="default"/>
+        <w:sz w:val="20"/>
+      </w:rPr>
+    </w:lvl>
+    <w:lvl w:ilvl="3" w:tentative="1">
+      <w:start w:val="1"/>
+      <w:numFmt w:val="bullet"/>
+      <w:lvlText w:val=""/>
+      <w:lvlJc w:val="left"/>
+      <w:pPr>
+        <w:tabs>
+          <w:tab w:val="num" w:pos="2880"/>
+        </w:tabs>
+        <w:ind w:left="2880" w:hanging="360"/>
+      </w:pPr>
+      <w:rPr>
+        <w:rFonts w:ascii="Wingdings" w:hAnsi="Wingdings" w:hint="default"/>
+        <w:sz w:val="20"/>
+      </w:rPr>
+    </w:lvl>
+    <w:lvl w:ilvl="4" w:tentative="1">
+      <w:start w:val="1"/>
+      <w:numFmt w:val="bullet"/>
+      <w:lvlText w:val=""/>
+      <w:lvlJc w:val="left"/>
+      <w:pPr>
+        <w:tabs>
+          <w:tab w:val="num" w:pos="3600"/>
+        </w:tabs>
+        <w:ind w:left="3600" w:hanging="360"/>
+      </w:pPr>
+      <w:rPr>
+        <w:rFonts w:ascii="Wingdings" w:hAnsi="Wingdings" w:hint="default"/>
+        <w:sz w:val="20"/>
+      </w:rPr>
+    </w:lvl>
+    <w:lvl w:ilvl="5" w:tentative="1">
+      <w:start w:val="1"/>
+      <w:numFmt w:val="bullet"/>
+      <w:lvlText w:val=""/>
+      <w:lvlJc w:val="left"/>
+      <w:pPr>
+        <w:tabs>
+          <w:tab w:val="num" w:pos="4320"/>
+        </w:tabs>
+        <w:ind w:left="4320" w:hanging="360"/>
+      </w:pPr>
+      <w:rPr>
+        <w:rFonts w:ascii="Wingdings" w:hAnsi="Wingdings" w:hint="default"/>
+        <w:sz w:val="20"/>
+      </w:rPr>
+    </w:lvl>
+    <w:lvl w:ilvl="6" w:tentative="1">
+      <w:start w:val="1"/>
+      <w:numFmt w:val="bullet"/>
+      <w:lvlText w:val=""/>
+      <w:lvlJc w:val="left"/>
+      <w:pPr>
+        <w:tabs>
+          <w:tab w:val="num" w:pos="5040"/>
+        </w:tabs>
+        <w:ind w:left="5040" w:hanging="360"/>
+      </w:pPr>
+      <w:rPr>
+        <w:rFonts w:ascii="Wingdings" w:hAnsi="Wingdings" w:hint="default"/>
+        <w:sz w:val="20"/>
+      </w:rPr>
+    </w:lvl>
+    <w:lvl w:ilvl="7" w:tentative="1">
+      <w:start w:val="1"/>
+      <w:numFmt w:val="bullet"/>
+      <w:lvlText w:val=""/>
+      <w:lvlJc w:val="left"/>
+      <w:pPr>
+        <w:tabs>
+          <w:tab w:val="num" w:pos="5760"/>
+        </w:tabs>
+        <w:ind w:left="5760" w:hanging="360"/>
+      </w:pPr>
+      <w:rPr>
+        <w:rFonts w:ascii="Wingdings" w:hAnsi="Wingdings" w:hint="default"/>
+        <w:sz w:val="20"/>
+      </w:rPr>
+    </w:lvl>
+    <w:lvl w:ilvl="8" w:tentative="1">
+      <w:start w:val="1"/>
+      <w:numFmt w:val="bullet"/>
+      <w:lvlText w:val=""/>
+      <w:lvlJc w:val="left"/>
+      <w:pPr>
+        <w:tabs>
+          <w:tab w:val="num" w:pos="6480"/>
+        </w:tabs>
+        <w:ind w:left="6480" w:hanging="360"/>
+      </w:pPr>
+      <w:rPr>
+        <w:rFonts w:ascii="Wingdings" w:hAnsi="Wingdings" w:hint="default"/>
+        <w:sz w:val="20"/>
+      </w:rPr>
+    </w:lvl>
+  </w:abstractNum>
+  <w:abstractNum w:abstractNumId="29">
     <w:nsid w:val="656B7856"/>
     <w:multiLevelType w:val="hybridMultilevel"/>
     <w:tmpl w:val="BB10F704"/>
@@ -11056,7 +13016,7 @@
       </w:rPr>
     </w:lvl>
   </w:abstractNum>
-  <w:abstractNum w:abstractNumId="26">
+  <w:abstractNum w:abstractNumId="30">
     <w:nsid w:val="69BA5AD7"/>
     <w:multiLevelType w:val="hybridMultilevel"/>
     <w:tmpl w:val="48264A2C"/>
@@ -11145,7 +13105,7 @@
       </w:pPr>
     </w:lvl>
   </w:abstractNum>
-  <w:abstractNum w:abstractNumId="27">
+  <w:abstractNum w:abstractNumId="31">
     <w:nsid w:val="6AFC010F"/>
     <w:multiLevelType w:val="hybridMultilevel"/>
     <w:tmpl w:val="BEF0AB2A"/>
@@ -11258,7 +13218,7 @@
       </w:rPr>
     </w:lvl>
   </w:abstractNum>
-  <w:abstractNum w:abstractNumId="28">
+  <w:abstractNum w:abstractNumId="32">
     <w:nsid w:val="6B3817FA"/>
     <w:multiLevelType w:val="hybridMultilevel"/>
     <w:tmpl w:val="2188A62A"/>
@@ -11347,7 +13307,156 @@
       </w:pPr>
     </w:lvl>
   </w:abstractNum>
-  <w:abstractNum w:abstractNumId="29">
+  <w:abstractNum w:abstractNumId="33">
+    <w:nsid w:val="6E7729ED"/>
+    <w:multiLevelType w:val="multilevel"/>
+    <w:tmpl w:val="4094E02C"/>
+    <w:lvl w:ilvl="0">
+      <w:start w:val="1"/>
+      <w:numFmt w:val="bullet"/>
+      <w:lvlText w:val=""/>
+      <w:lvlJc w:val="left"/>
+      <w:pPr>
+        <w:tabs>
+          <w:tab w:val="num" w:pos="720"/>
+        </w:tabs>
+        <w:ind w:left="720" w:hanging="360"/>
+      </w:pPr>
+      <w:rPr>
+        <w:rFonts w:ascii="Symbol" w:hAnsi="Symbol" w:hint="default"/>
+        <w:sz w:val="20"/>
+      </w:rPr>
+    </w:lvl>
+    <w:lvl w:ilvl="1" w:tentative="1">
+      <w:start w:val="1"/>
+      <w:numFmt w:val="bullet"/>
+      <w:lvlText w:val="o"/>
+      <w:lvlJc w:val="left"/>
+      <w:pPr>
+        <w:tabs>
+          <w:tab w:val="num" w:pos="1440"/>
+        </w:tabs>
+        <w:ind w:left="1440" w:hanging="360"/>
+      </w:pPr>
+      <w:rPr>
+        <w:rFonts w:ascii="Courier New" w:hAnsi="Courier New" w:hint="default"/>
+        <w:sz w:val="20"/>
+      </w:rPr>
+    </w:lvl>
+    <w:lvl w:ilvl="2" w:tentative="1">
+      <w:start w:val="1"/>
+      <w:numFmt w:val="bullet"/>
+      <w:lvlText w:val=""/>
+      <w:lvlJc w:val="left"/>
+      <w:pPr>
+        <w:tabs>
+          <w:tab w:val="num" w:pos="2160"/>
+        </w:tabs>
+        <w:ind w:left="2160" w:hanging="360"/>
+      </w:pPr>
+      <w:rPr>
+        <w:rFonts w:ascii="Wingdings" w:hAnsi="Wingdings" w:hint="default"/>
+        <w:sz w:val="20"/>
+      </w:rPr>
+    </w:lvl>
+    <w:lvl w:ilvl="3" w:tentative="1">
+      <w:start w:val="1"/>
+      <w:numFmt w:val="bullet"/>
+      <w:lvlText w:val=""/>
+      <w:lvlJc w:val="left"/>
+      <w:pPr>
+        <w:tabs>
+          <w:tab w:val="num" w:pos="2880"/>
+        </w:tabs>
+        <w:ind w:left="2880" w:hanging="360"/>
+      </w:pPr>
+      <w:rPr>
+        <w:rFonts w:ascii="Wingdings" w:hAnsi="Wingdings" w:hint="default"/>
+        <w:sz w:val="20"/>
+      </w:rPr>
+    </w:lvl>
+    <w:lvl w:ilvl="4" w:tentative="1">
+      <w:start w:val="1"/>
+      <w:numFmt w:val="bullet"/>
+      <w:lvlText w:val=""/>
+      <w:lvlJc w:val="left"/>
+      <w:pPr>
+        <w:tabs>
+          <w:tab w:val="num" w:pos="3600"/>
+        </w:tabs>
+        <w:ind w:left="3600" w:hanging="360"/>
+      </w:pPr>
+      <w:rPr>
+        <w:rFonts w:ascii="Wingdings" w:hAnsi="Wingdings" w:hint="default"/>
+        <w:sz w:val="20"/>
+      </w:rPr>
+    </w:lvl>
+    <w:lvl w:ilvl="5" w:tentative="1">
+      <w:start w:val="1"/>
+      <w:numFmt w:val="bullet"/>
+      <w:lvlText w:val=""/>
+      <w:lvlJc w:val="left"/>
+      <w:pPr>
+        <w:tabs>
+          <w:tab w:val="num" w:pos="4320"/>
+        </w:tabs>
+        <w:ind w:left="4320" w:hanging="360"/>
+      </w:pPr>
+      <w:rPr>
+        <w:rFonts w:ascii="Wingdings" w:hAnsi="Wingdings" w:hint="default"/>
+        <w:sz w:val="20"/>
+      </w:rPr>
+    </w:lvl>
+    <w:lvl w:ilvl="6" w:tentative="1">
+      <w:start w:val="1"/>
+      <w:numFmt w:val="bullet"/>
+      <w:lvlText w:val=""/>
+      <w:lvlJc w:val="left"/>
+      <w:pPr>
+        <w:tabs>
+          <w:tab w:val="num" w:pos="5040"/>
+        </w:tabs>
+        <w:ind w:left="5040" w:hanging="360"/>
+      </w:pPr>
+      <w:rPr>
+        <w:rFonts w:ascii="Wingdings" w:hAnsi="Wingdings" w:hint="default"/>
+        <w:sz w:val="20"/>
+      </w:rPr>
+    </w:lvl>
+    <w:lvl w:ilvl="7" w:tentative="1">
+      <w:start w:val="1"/>
+      <w:numFmt w:val="bullet"/>
+      <w:lvlText w:val=""/>
+      <w:lvlJc w:val="left"/>
+      <w:pPr>
+        <w:tabs>
+          <w:tab w:val="num" w:pos="5760"/>
+        </w:tabs>
+        <w:ind w:left="5760" w:hanging="360"/>
+      </w:pPr>
+      <w:rPr>
+        <w:rFonts w:ascii="Wingdings" w:hAnsi="Wingdings" w:hint="default"/>
+        <w:sz w:val="20"/>
+      </w:rPr>
+    </w:lvl>
+    <w:lvl w:ilvl="8" w:tentative="1">
+      <w:start w:val="1"/>
+      <w:numFmt w:val="bullet"/>
+      <w:lvlText w:val=""/>
+      <w:lvlJc w:val="left"/>
+      <w:pPr>
+        <w:tabs>
+          <w:tab w:val="num" w:pos="6480"/>
+        </w:tabs>
+        <w:ind w:left="6480" w:hanging="360"/>
+      </w:pPr>
+      <w:rPr>
+        <w:rFonts w:ascii="Wingdings" w:hAnsi="Wingdings" w:hint="default"/>
+        <w:sz w:val="20"/>
+      </w:rPr>
+    </w:lvl>
+  </w:abstractNum>
+  <w:abstractNum w:abstractNumId="34">
     <w:nsid w:val="70B77958"/>
     <w:multiLevelType w:val="hybridMultilevel"/>
     <w:tmpl w:val="E692F0E4"/>
@@ -11460,7 +13569,7 @@
       </w:rPr>
     </w:lvl>
   </w:abstractNum>
-  <w:abstractNum w:abstractNumId="30">
+  <w:abstractNum w:abstractNumId="35">
     <w:nsid w:val="74B6421B"/>
     <w:multiLevelType w:val="hybridMultilevel"/>
     <w:tmpl w:val="4162CF00"/>
@@ -11549,7 +13658,7 @@
       </w:pPr>
     </w:lvl>
   </w:abstractNum>
-  <w:abstractNum w:abstractNumId="31">
+  <w:abstractNum w:abstractNumId="36">
     <w:nsid w:val="786B6EDC"/>
     <w:multiLevelType w:val="hybridMultilevel"/>
     <w:tmpl w:val="23FA846C"/>
@@ -11663,100 +13772,115 @@
     </w:lvl>
   </w:abstractNum>
   <w:num w:numId="1">
-    <w:abstractNumId w:val="9"/>
+    <w:abstractNumId w:val="11"/>
   </w:num>
   <w:num w:numId="2">
-    <w:abstractNumId w:val="17"/>
+    <w:abstractNumId w:val="20"/>
   </w:num>
   <w:num w:numId="3">
-    <w:abstractNumId w:val="26"/>
+    <w:abstractNumId w:val="30"/>
   </w:num>
   <w:num w:numId="4">
-    <w:abstractNumId w:val="31"/>
+    <w:abstractNumId w:val="36"/>
   </w:num>
   <w:num w:numId="5">
-    <w:abstractNumId w:val="6"/>
+    <w:abstractNumId w:val="8"/>
   </w:num>
   <w:num w:numId="6">
-    <w:abstractNumId w:val="12"/>
+    <w:abstractNumId w:val="14"/>
   </w:num>
   <w:num w:numId="7">
-    <w:abstractNumId w:val="29"/>
+    <w:abstractNumId w:val="34"/>
   </w:num>
   <w:num w:numId="8">
-    <w:abstractNumId w:val="8"/>
+    <w:abstractNumId w:val="10"/>
   </w:num>
   <w:num w:numId="9">
     <w:abstractNumId w:val="3"/>
   </w:num>
   <w:num w:numId="10">
-    <w:abstractNumId w:val="14"/>
+    <w:abstractNumId w:val="16"/>
   </w:num>
   <w:num w:numId="11">
-    <w:abstractNumId w:val="15"/>
+    <w:abstractNumId w:val="17"/>
   </w:num>
   <w:num w:numId="12">
-    <w:abstractNumId w:val="27"/>
+    <w:abstractNumId w:val="31"/>
   </w:num>
   <w:num w:numId="13">
-    <w:abstractNumId w:val="22"/>
+    <w:abstractNumId w:val="25"/>
   </w:num>
   <w:num w:numId="14">
     <w:abstractNumId w:val="2"/>
   </w:num>
   <w:num w:numId="15">
-    <w:abstractNumId w:val="7"/>
+    <w:abstractNumId w:val="9"/>
   </w:num>
   <w:num w:numId="16">
-    <w:abstractNumId w:val="16"/>
+    <w:abstractNumId w:val="19"/>
   </w:num>
   <w:num w:numId="17">
-    <w:abstractNumId w:val="20"/>
+    <w:abstractNumId w:val="23"/>
   </w:num>
   <w:num w:numId="18">
-    <w:abstractNumId w:val="10"/>
+    <w:abstractNumId w:val="12"/>
   </w:num>
   <w:num w:numId="19">
-    <w:abstractNumId w:val="21"/>
+    <w:abstractNumId w:val="24"/>
   </w:num>
   <w:num w:numId="20">
-    <w:abstractNumId w:val="25"/>
+    <w:abstractNumId w:val="29"/>
   </w:num>
   <w:num w:numId="21">
-    <w:abstractNumId w:val="11"/>
+    <w:abstractNumId w:val="13"/>
   </w:num>
   <w:num w:numId="22">
-    <w:abstractNumId w:val="28"/>
+    <w:abstractNumId w:val="32"/>
   </w:num>
   <w:num w:numId="23">
-    <w:abstractNumId w:val="23"/>
+    <w:abstractNumId w:val="26"/>
   </w:num>
   <w:num w:numId="24">
-    <w:abstractNumId w:val="18"/>
+    <w:abstractNumId w:val="21"/>
   </w:num>
   <w:num w:numId="25">
     <w:abstractNumId w:val="5"/>
   </w:num>
   <w:num w:numId="26">
-    <w:abstractNumId w:val="30"/>
+    <w:abstractNumId w:val="35"/>
   </w:num>
   <w:num w:numId="27">
-    <w:abstractNumId w:val="13"/>
+    <w:abstractNumId w:val="15"/>
   </w:num>
   <w:num w:numId="28">
     <w:abstractNumId w:val="1"/>
   </w:num>
   <w:num w:numId="29">
-    <w:abstractNumId w:val="24"/>
+    <w:abstractNumId w:val="27"/>
   </w:num>
   <w:num w:numId="30">
-    <w:abstractNumId w:val="19"/>
+    <w:abstractNumId w:val="22"/>
   </w:num>
   <w:num w:numId="31">
     <w:abstractNumId w:val="0"/>
   </w:num>
   <w:num w:numId="32">
     <w:abstractNumId w:val="4"/>
+  </w:num>
+  <w:num w:numId="33">
+    <w:abstractNumId w:val="6"/>
+  </w:num>
+  <w:num w:numId="34">
+    <w:abstractNumId w:val="18"/>
+  </w:num>
+  <w:num w:numId="35">
+    <w:abstractNumId w:val="7"/>
+  </w:num>
+  <w:num w:numId="36">
+    <w:abstractNumId w:val="33"/>
+  </w:num>
+  <w:num w:numId="37">
+    <w:abstractNumId w:val="28"/>
   </w:num>
 </w:numbering>
 </file>
@@ -12301,7 +14425,6 @@
     <w:name w:val="Normal (Web)"/>
     <w:basedOn w:val="Normal"/>
     <w:uiPriority w:val="99"/>
-    <w:semiHidden/>
     <w:unhideWhenUsed/>
     <w:rsid w:val="00AB49D4"/>
     <w:pPr>
@@ -12857,7 +14980,6 @@
     <w:name w:val="Normal (Web)"/>
     <w:basedOn w:val="Normal"/>
     <w:uiPriority w:val="99"/>
-    <w:semiHidden/>
     <w:unhideWhenUsed/>
     <w:rsid w:val="00AB49D4"/>
     <w:pPr>
@@ -13163,7 +15285,7 @@
 </file>
 
 <file path=customXml/itemProps1.xml><?xml version="1.0" encoding="utf-8"?>
-<ds:datastoreItem xmlns:ds="http://schemas.openxmlformats.org/officeDocument/2006/customXml" ds:itemID="{55C190BB-64FF-4E58-AA21-C87EAC94B826}">
+<ds:datastoreItem xmlns:ds="http://schemas.openxmlformats.org/officeDocument/2006/customXml" ds:itemID="{EAF00233-0057-4786-8FF5-C86A1CDD2D1A}">
   <ds:schemaRefs>
     <ds:schemaRef ds:uri="http://schemas.openxmlformats.org/officeDocument/2006/bibliography"/>
   </ds:schemaRefs>

</xml_diff>